<commit_message>
Updated the Report docx.
</commit_message>
<xml_diff>
--- a/Project Report.docx
+++ b/Project Report.docx
@@ -137,7 +137,6 @@
         <w:jc w:val="center"/>
         <w:rPr>
           <w:rFonts w:ascii="Times New Roman" w:cs="Times New Roman" w:eastAsia="Times New Roman" w:hAnsi="Times New Roman"/>
-          <w:color w:val="ff0000"/>
           <w:sz w:val="50"/>
           <w:szCs w:val="50"/>
         </w:rPr>
@@ -145,7 +144,6 @@
       <w:r>
         <w:rPr>
           <w:rFonts w:ascii="Times New Roman" w:cs="Times New Roman" w:eastAsia="Times New Roman" w:hAnsi="Times New Roman"/>
-          <w:color w:val="ff0000"/>
           <w:sz w:val="50"/>
           <w:szCs w:val="50"/>
           <w:rtl w:val="0"/>
@@ -157,7 +155,6 @@
           <w:rFonts w:ascii="Times New Roman" w:cs="Times New Roman" w:eastAsia="Times New Roman" w:hAnsi="Times New Roman"/>
           <w:i w:val="1"/>
           <w:iCs w:val="1"/>
-          <w:color w:val="ff0000"/>
           <w:sz w:val="50"/>
           <w:szCs w:val="50"/>
           <w:rtl w:val="0"/>
@@ -271,10 +268,8 @@
           <w:iCs w:val="0"/>
           <w:smallCaps w:val="0"/>
           <w:strike w:val="0"/>
-          <w:color w:val="ff0000"/>
           <w:sz w:val="32"/>
           <w:szCs w:val="32"/>
-          <w:u w:val="none"/>
           <w:shd w:fill="auto" w:val="clear"/>
           <w:vertAlign w:val="baseline"/>
         </w:rPr>
@@ -288,7 +283,6 @@
           <w:iCs w:val="0"/>
           <w:smallCaps w:val="0"/>
           <w:strike w:val="0"/>
-          <w:color w:val="ff0000"/>
           <w:sz w:val="32"/>
           <w:szCs w:val="32"/>
           <w:u w:val="none"/>
@@ -328,10 +322,8 @@
           <w:iCs w:val="0"/>
           <w:smallCaps w:val="0"/>
           <w:strike w:val="0"/>
-          <w:color w:val="ff0000"/>
           <w:sz w:val="32"/>
           <w:szCs w:val="32"/>
-          <w:u w:val="none"/>
           <w:shd w:fill="auto" w:val="clear"/>
           <w:vertAlign w:val="baseline"/>
         </w:rPr>
@@ -345,7 +337,6 @@
           <w:iCs w:val="0"/>
           <w:smallCaps w:val="0"/>
           <w:strike w:val="0"/>
-          <w:color w:val="ff0000"/>
           <w:sz w:val="32"/>
           <w:szCs w:val="32"/>
           <w:u w:val="none"/>
@@ -385,10 +376,8 @@
           <w:iCs w:val="0"/>
           <w:smallCaps w:val="0"/>
           <w:strike w:val="0"/>
-          <w:color w:val="ff0000"/>
           <w:sz w:val="32"/>
           <w:szCs w:val="32"/>
-          <w:u w:val="none"/>
           <w:shd w:fill="auto" w:val="clear"/>
           <w:vertAlign w:val="baseline"/>
         </w:rPr>
@@ -402,7 +391,6 @@
           <w:iCs w:val="0"/>
           <w:smallCaps w:val="0"/>
           <w:strike w:val="0"/>
-          <w:color w:val="ff0000"/>
           <w:sz w:val="32"/>
           <w:szCs w:val="32"/>
           <w:u w:val="none"/>
@@ -813,8 +801,12 @@
             </w:pPr>
             <w:r>
               <w:rPr>
+                <w:rFonts w:ascii="Times New Roman" w:cs="Times New Roman" w:eastAsia="Times New Roman" w:hAnsi="Times New Roman"/>
+                <w:sz w:val="26"/>
+                <w:szCs w:val="26"/>
                 <w:rtl w:val="0"/>
               </w:rPr>
+              <w:t xml:space="preserve">17-October 26</w:t>
             </w:r>
           </w:p>
         </w:tc>
@@ -831,8 +823,12 @@
             </w:pPr>
             <w:r>
               <w:rPr>
+                <w:rFonts w:ascii="Times New Roman" w:cs="Times New Roman" w:eastAsia="Times New Roman" w:hAnsi="Times New Roman"/>
+                <w:sz w:val="26"/>
+                <w:szCs w:val="26"/>
                 <w:rtl w:val="0"/>
               </w:rPr>
+              <w:t xml:space="preserve">V1.1</w:t>
             </w:r>
           </w:p>
         </w:tc>
@@ -849,8 +845,12 @@
             </w:pPr>
             <w:r>
               <w:rPr>
+                <w:rFonts w:ascii="Times New Roman" w:cs="Times New Roman" w:eastAsia="Times New Roman" w:hAnsi="Times New Roman"/>
+                <w:sz w:val="26"/>
+                <w:szCs w:val="26"/>
                 <w:rtl w:val="0"/>
               </w:rPr>
+              <w:t xml:space="preserve">Keaton</w:t>
             </w:r>
           </w:p>
         </w:tc>
@@ -867,8 +867,12 @@
             </w:pPr>
             <w:r>
               <w:rPr>
+                <w:rFonts w:ascii="Times New Roman" w:cs="Times New Roman" w:eastAsia="Times New Roman" w:hAnsi="Times New Roman"/>
+                <w:sz w:val="26"/>
+                <w:szCs w:val="26"/>
                 <w:rtl w:val="0"/>
               </w:rPr>
+              <w:t xml:space="preserve">Updated red texts, added GitHub repo and added some references.</w:t>
             </w:r>
           </w:p>
         </w:tc>
@@ -1019,8 +1023,12 @@
       </w:r>
       <w:r>
         <w:rPr>
-          <w:rtl w:val="0"/>
-        </w:rPr>
+          <w:rFonts w:ascii="Times New Roman" w:cs="Times New Roman" w:eastAsia="Times New Roman" w:hAnsi="Times New Roman"/>
+          <w:sz w:val="50"/>
+          <w:szCs w:val="50"/>
+          <w:rtl w:val="0"/>
+        </w:rPr>
+        <w:t xml:space="preserve"> </w:t>
       </w:r>
     </w:p>
     <w:p>
@@ -1798,847 +1806,66 @@
     </w:p>
     <w:p>
       <w:pPr>
-        <w:keepNext w:val="0"/>
-        <w:keepLines w:val="0"/>
-        <w:pageBreakBefore w:val="0"/>
-        <w:widowControl w:val="1"/>
-        <w:pBdr>
-          <w:top w:space="0" w:sz="0" w:val="nil"/>
-          <w:left w:space="0" w:sz="0" w:val="nil"/>
-          <w:bottom w:space="0" w:sz="0" w:val="nil"/>
-          <w:right w:space="0" w:sz="0" w:val="nil"/>
-          <w:between w:space="0" w:sz="0" w:val="nil"/>
-        </w:pBdr>
-        <w:shd w:fill="auto" w:val="clear"/>
-        <w:spacing w:after="0" w:before="0" w:line="240" w:lineRule="auto"/>
-        <w:ind w:left="0" w:right="0" w:firstLine="540"/>
-        <w:jc w:val="left"/>
-        <w:rPr>
-          <w:rFonts w:ascii="Times New Roman" w:cs="Times New Roman" w:eastAsia="Times New Roman" w:hAnsi="Times New Roman"/>
-          <w:b w:val="0"/>
-          <w:bCs w:val="0"/>
-          <w:i w:val="0"/>
-          <w:iCs w:val="0"/>
-          <w:smallCaps w:val="0"/>
-          <w:strike w:val="0"/>
-          <w:color w:val="ff0000"/>
-          <w:sz w:val="26"/>
-          <w:szCs w:val="26"/>
-          <w:u w:val="none"/>
-          <w:shd w:fill="auto" w:val="clear"/>
-          <w:vertAlign w:val="baseline"/>
-        </w:rPr>
-      </w:pPr>
-      <w:r>
-        <w:rPr>
-          <w:rtl w:val="0"/>
-        </w:rPr>
-      </w:r>
-    </w:p>
-    <w:p>
-      <w:pPr>
-        <w:keepNext w:val="0"/>
-        <w:keepLines w:val="0"/>
-        <w:pageBreakBefore w:val="0"/>
-        <w:widowControl w:val="1"/>
-        <w:pBdr>
-          <w:top w:space="0" w:sz="0" w:val="nil"/>
-          <w:left w:space="0" w:sz="0" w:val="nil"/>
-          <w:bottom w:space="0" w:sz="0" w:val="nil"/>
-          <w:right w:space="0" w:sz="0" w:val="nil"/>
-          <w:between w:space="0" w:sz="0" w:val="nil"/>
-        </w:pBdr>
-        <w:shd w:fill="auto" w:val="clear"/>
-        <w:spacing w:after="0" w:before="0" w:line="240" w:lineRule="auto"/>
-        <w:ind w:left="0" w:right="0" w:firstLine="540"/>
-        <w:jc w:val="left"/>
-        <w:rPr>
-          <w:rFonts w:ascii="Times New Roman" w:cs="Times New Roman" w:eastAsia="Times New Roman" w:hAnsi="Times New Roman"/>
-          <w:b w:val="0"/>
-          <w:bCs w:val="0"/>
-          <w:i w:val="1"/>
-          <w:iCs w:val="1"/>
-          <w:smallCaps w:val="0"/>
-          <w:strike w:val="0"/>
-          <w:color w:val="ff0000"/>
-          <w:sz w:val="26"/>
-          <w:szCs w:val="26"/>
-          <w:u w:val="none"/>
-          <w:shd w:fill="auto" w:val="clear"/>
-          <w:vertAlign w:val="baseline"/>
-        </w:rPr>
-      </w:pPr>
-      <w:r>
-        <w:rPr>
-          <w:rFonts w:ascii="Times New Roman" w:cs="Times New Roman" w:eastAsia="Times New Roman" w:hAnsi="Times New Roman"/>
-          <w:b w:val="0"/>
-          <w:bCs w:val="0"/>
-          <w:i w:val="1"/>
-          <w:iCs w:val="1"/>
-          <w:smallCaps w:val="0"/>
-          <w:strike w:val="0"/>
-          <w:color w:val="ff0000"/>
-          <w:sz w:val="26"/>
-          <w:szCs w:val="26"/>
-          <w:u w:val="none"/>
-          <w:shd w:fill="auto" w:val="clear"/>
-          <w:vertAlign w:val="baseline"/>
-          <w:rtl w:val="0"/>
-        </w:rPr>
-        <w:t xml:space="preserve">[In this section, please insert a description of the business requirements of the project you are working on. You can play the rold of the customer who order this management software and write down the details of the requirements.</w:t>
-      </w:r>
-    </w:p>
-    <w:p>
-      <w:pPr>
-        <w:keepNext w:val="0"/>
-        <w:keepLines w:val="0"/>
-        <w:pageBreakBefore w:val="0"/>
-        <w:widowControl w:val="1"/>
-        <w:pBdr>
-          <w:top w:space="0" w:sz="0" w:val="nil"/>
-          <w:left w:space="0" w:sz="0" w:val="nil"/>
-          <w:bottom w:space="0" w:sz="0" w:val="nil"/>
-          <w:right w:space="0" w:sz="0" w:val="nil"/>
-          <w:between w:space="0" w:sz="0" w:val="nil"/>
-        </w:pBdr>
-        <w:shd w:fill="auto" w:val="clear"/>
-        <w:spacing w:after="0" w:before="0" w:line="240" w:lineRule="auto"/>
-        <w:ind w:left="0" w:right="0" w:firstLine="540"/>
-        <w:jc w:val="left"/>
-        <w:rPr>
-          <w:rFonts w:ascii="Times New Roman" w:cs="Times New Roman" w:eastAsia="Times New Roman" w:hAnsi="Times New Roman"/>
-          <w:b w:val="0"/>
-          <w:bCs w:val="0"/>
-          <w:i w:val="1"/>
-          <w:iCs w:val="1"/>
-          <w:smallCaps w:val="0"/>
-          <w:strike w:val="0"/>
-          <w:color w:val="ff0000"/>
-          <w:sz w:val="26"/>
-          <w:szCs w:val="26"/>
-          <w:u w:val="none"/>
-          <w:shd w:fill="auto" w:val="clear"/>
-          <w:vertAlign w:val="baseline"/>
-        </w:rPr>
-      </w:pPr>
-      <w:r>
-        <w:rPr>
-          <w:rtl w:val="0"/>
-        </w:rPr>
-      </w:r>
-    </w:p>
-    <w:p>
-      <w:pPr>
-        <w:keepNext w:val="0"/>
-        <w:keepLines w:val="0"/>
-        <w:pageBreakBefore w:val="0"/>
-        <w:widowControl w:val="1"/>
-        <w:pBdr>
-          <w:top w:space="0" w:sz="0" w:val="nil"/>
-          <w:left w:space="0" w:sz="0" w:val="nil"/>
-          <w:bottom w:space="0" w:sz="0" w:val="nil"/>
-          <w:right w:space="0" w:sz="0" w:val="nil"/>
-          <w:between w:space="0" w:sz="0" w:val="nil"/>
-        </w:pBdr>
-        <w:shd w:fill="auto" w:val="clear"/>
-        <w:spacing w:after="0" w:before="0" w:line="240" w:lineRule="auto"/>
-        <w:ind w:left="0" w:right="0" w:firstLine="540"/>
-        <w:jc w:val="left"/>
-        <w:rPr>
-          <w:rFonts w:ascii="Times New Roman" w:cs="Times New Roman" w:eastAsia="Times New Roman" w:hAnsi="Times New Roman"/>
-          <w:b w:val="0"/>
-          <w:bCs w:val="0"/>
-          <w:i w:val="1"/>
-          <w:iCs w:val="1"/>
-          <w:smallCaps w:val="0"/>
-          <w:strike w:val="0"/>
-          <w:color w:val="ff0000"/>
-          <w:sz w:val="26"/>
-          <w:szCs w:val="26"/>
-          <w:u w:val="none"/>
-          <w:shd w:fill="auto" w:val="clear"/>
-          <w:vertAlign w:val="baseline"/>
-        </w:rPr>
-      </w:pPr>
-      <w:r>
-        <w:rPr>
-          <w:rFonts w:ascii="Times New Roman" w:cs="Times New Roman" w:eastAsia="Times New Roman" w:hAnsi="Times New Roman"/>
-          <w:b w:val="0"/>
-          <w:bCs w:val="0"/>
-          <w:i w:val="1"/>
-          <w:iCs w:val="1"/>
-          <w:smallCaps w:val="0"/>
-          <w:strike w:val="0"/>
-          <w:color w:val="ff0000"/>
-          <w:sz w:val="26"/>
-          <w:szCs w:val="26"/>
-          <w:u w:val="none"/>
-          <w:shd w:fill="auto" w:val="clear"/>
-          <w:vertAlign w:val="baseline"/>
-          <w:rtl w:val="0"/>
-        </w:rPr>
-        <w:t xml:space="preserve">For example: In this project, we investigate the business functions of the hotel management system, and provide a desktop application supporting users….</w:t>
-      </w:r>
-    </w:p>
-    <w:p>
-      <w:pPr>
-        <w:keepNext w:val="0"/>
-        <w:keepLines w:val="0"/>
-        <w:pageBreakBefore w:val="0"/>
-        <w:widowControl w:val="1"/>
-        <w:pBdr>
-          <w:top w:space="0" w:sz="0" w:val="nil"/>
-          <w:left w:space="0" w:sz="0" w:val="nil"/>
-          <w:bottom w:space="0" w:sz="0" w:val="nil"/>
-          <w:right w:space="0" w:sz="0" w:val="nil"/>
-          <w:between w:space="0" w:sz="0" w:val="nil"/>
-        </w:pBdr>
-        <w:shd w:fill="auto" w:val="clear"/>
-        <w:spacing w:after="0" w:before="0" w:line="240" w:lineRule="auto"/>
-        <w:ind w:left="0" w:right="0" w:firstLine="540"/>
-        <w:jc w:val="left"/>
-        <w:rPr>
-          <w:rFonts w:ascii="Times New Roman" w:cs="Times New Roman" w:eastAsia="Times New Roman" w:hAnsi="Times New Roman"/>
-          <w:b w:val="0"/>
-          <w:bCs w:val="0"/>
-          <w:i w:val="1"/>
-          <w:iCs w:val="1"/>
-          <w:smallCaps w:val="0"/>
-          <w:strike w:val="0"/>
-          <w:color w:val="ff0000"/>
-          <w:sz w:val="26"/>
-          <w:szCs w:val="26"/>
-          <w:u w:val="none"/>
-          <w:shd w:fill="auto" w:val="clear"/>
-          <w:vertAlign w:val="baseline"/>
-        </w:rPr>
-      </w:pPr>
-      <w:r>
-        <w:rPr>
-          <w:rtl w:val="0"/>
-        </w:rPr>
-      </w:r>
-    </w:p>
-    <w:p>
-      <w:pPr>
-        <w:keepNext w:val="0"/>
-        <w:keepLines w:val="0"/>
-        <w:pageBreakBefore w:val="0"/>
-        <w:widowControl w:val="1"/>
-        <w:pBdr>
-          <w:top w:space="0" w:sz="0" w:val="nil"/>
-          <w:left w:space="0" w:sz="0" w:val="nil"/>
-          <w:bottom w:space="0" w:sz="0" w:val="nil"/>
-          <w:right w:space="0" w:sz="0" w:val="nil"/>
-          <w:between w:space="0" w:sz="0" w:val="nil"/>
-        </w:pBdr>
-        <w:shd w:fill="auto" w:val="clear"/>
-        <w:spacing w:after="0" w:before="0" w:line="240" w:lineRule="auto"/>
-        <w:ind w:left="0" w:right="0" w:firstLine="540"/>
-        <w:jc w:val="left"/>
-        <w:rPr>
-          <w:rFonts w:ascii="Times New Roman" w:cs="Times New Roman" w:eastAsia="Times New Roman" w:hAnsi="Times New Roman"/>
-          <w:b w:val="0"/>
-          <w:bCs w:val="0"/>
-          <w:i w:val="1"/>
-          <w:iCs w:val="1"/>
-          <w:smallCaps w:val="0"/>
-          <w:strike w:val="0"/>
-          <w:color w:val="ff0000"/>
-          <w:sz w:val="26"/>
-          <w:szCs w:val="26"/>
-          <w:u w:val="none"/>
-          <w:shd w:fill="auto" w:val="clear"/>
-          <w:vertAlign w:val="baseline"/>
-        </w:rPr>
-      </w:pPr>
-      <w:r>
-        <w:rPr>
-          <w:rFonts w:ascii="Times New Roman" w:cs="Times New Roman" w:eastAsia="Times New Roman" w:hAnsi="Times New Roman"/>
-          <w:b w:val="0"/>
-          <w:bCs w:val="0"/>
-          <w:i w:val="1"/>
-          <w:iCs w:val="1"/>
-          <w:smallCaps w:val="0"/>
-          <w:strike w:val="0"/>
-          <w:color w:val="ff0000"/>
-          <w:sz w:val="26"/>
-          <w:szCs w:val="26"/>
-          <w:u w:val="none"/>
-          <w:shd w:fill="auto" w:val="clear"/>
-          <w:vertAlign w:val="baseline"/>
-          <w:rtl w:val="0"/>
-        </w:rPr>
-        <w:t xml:space="preserve">This project provides the basic functions for the stakeholders/users as follows:</w:t>
-      </w:r>
-    </w:p>
-    <w:p>
-      <w:pPr>
-        <w:keepNext w:val="0"/>
-        <w:keepLines w:val="0"/>
-        <w:pageBreakBefore w:val="0"/>
-        <w:widowControl w:val="1"/>
+        <w:spacing w:after="120" w:line="240" w:lineRule="auto"/>
+        <w:rPr>
+          <w:rFonts w:ascii="Times New Roman" w:cs="Times New Roman" w:eastAsia="Times New Roman" w:hAnsi="Times New Roman"/>
+          <w:sz w:val="26"/>
+          <w:szCs w:val="26"/>
+        </w:rPr>
+      </w:pPr>
+      <w:r>
+        <w:rPr>
+          <w:rFonts w:ascii="Times New Roman" w:cs="Times New Roman" w:eastAsia="Times New Roman" w:hAnsi="Times New Roman"/>
+          <w:sz w:val="26"/>
+          <w:szCs w:val="26"/>
+          <w:rtl w:val="0"/>
+        </w:rPr>
+        <w:t xml:space="preserve">In this project, we will deliver a Fabric mod for Minecraft 1.21.11 (Java 21) that adds a new dimension called The Abyss.</w:t>
+      </w:r>
+    </w:p>
+    <w:p>
+      <w:pPr>
+        <w:spacing w:after="120" w:line="240" w:lineRule="auto"/>
+        <w:rPr>
+          <w:rFonts w:ascii="Times New Roman" w:cs="Times New Roman" w:eastAsia="Times New Roman" w:hAnsi="Times New Roman"/>
+          <w:sz w:val="26"/>
+          <w:szCs w:val="26"/>
+        </w:rPr>
+      </w:pPr>
+      <w:r>
+        <w:rPr>
+          <w:rFonts w:ascii="Times New Roman" w:cs="Times New Roman" w:eastAsia="Times New Roman" w:hAnsi="Times New Roman"/>
+          <w:sz w:val="26"/>
+          <w:szCs w:val="26"/>
+          <w:rtl w:val="0"/>
+        </w:rPr>
+        <w:t xml:space="preserve">We want players to reach The Abyss through the existing game, explore a dark and dangerous world, and be rewarded with new content that does not exist in vanilla/normal Minecraft. The mod runs inside the game as a Java application, so players keep their normal Minecraft interface and controls.</w:t>
+      </w:r>
+    </w:p>
+    <w:p>
+      <w:pPr>
+        <w:spacing w:after="120" w:line="240" w:lineRule="auto"/>
+        <w:rPr>
+          <w:rFonts w:ascii="Times New Roman" w:cs="Times New Roman" w:eastAsia="Times New Roman" w:hAnsi="Times New Roman"/>
+          <w:sz w:val="26"/>
+          <w:szCs w:val="26"/>
+        </w:rPr>
+      </w:pPr>
+      <w:r>
+        <w:rPr>
+          <w:rFonts w:ascii="Times New Roman" w:cs="Times New Roman" w:eastAsia="Times New Roman" w:hAnsi="Times New Roman"/>
+          <w:sz w:val="26"/>
+          <w:szCs w:val="26"/>
+          <w:rtl w:val="0"/>
+        </w:rPr>
+        <w:t xml:space="preserve">This project provides the basic functions for the players as follows:</w:t>
+      </w:r>
+    </w:p>
+    <w:p>
+      <w:pPr>
         <w:numPr>
           <w:ilvl w:val="0"/>
-          <w:numId w:val="12"/>
-        </w:numPr>
-        <w:pBdr>
-          <w:top w:space="0" w:sz="0" w:val="nil"/>
-          <w:left w:space="0" w:sz="0" w:val="nil"/>
-          <w:bottom w:space="0" w:sz="0" w:val="nil"/>
-          <w:right w:space="0" w:sz="0" w:val="nil"/>
-          <w:between w:space="0" w:sz="0" w:val="nil"/>
-        </w:pBdr>
-        <w:shd w:fill="auto" w:val="clear"/>
-        <w:spacing w:after="0" w:before="0" w:line="240" w:lineRule="auto"/>
-        <w:ind w:left="900" w:right="0" w:hanging="360"/>
-        <w:jc w:val="left"/>
-        <w:rPr>
-          <w:b w:val="0"/>
-          <w:bCs w:val="0"/>
-          <w:i w:val="1"/>
-          <w:iCs w:val="1"/>
-          <w:smallCaps w:val="0"/>
-          <w:strike w:val="0"/>
-          <w:color w:val="ff0000"/>
-          <w:sz w:val="26"/>
-          <w:szCs w:val="26"/>
-          <w:u w:val="none"/>
-          <w:shd w:fill="auto" w:val="clear"/>
-          <w:vertAlign w:val="baseline"/>
-        </w:rPr>
-      </w:pPr>
-      <w:r>
-        <w:rPr>
-          <w:rFonts w:ascii="Times New Roman" w:cs="Times New Roman" w:eastAsia="Times New Roman" w:hAnsi="Times New Roman"/>
-          <w:b w:val="0"/>
-          <w:bCs w:val="0"/>
-          <w:i w:val="1"/>
-          <w:iCs w:val="1"/>
-          <w:smallCaps w:val="0"/>
-          <w:strike w:val="0"/>
-          <w:color w:val="ff0000"/>
-          <w:sz w:val="26"/>
-          <w:szCs w:val="26"/>
-          <w:u w:val="none"/>
-          <w:shd w:fill="auto" w:val="clear"/>
-          <w:vertAlign w:val="baseline"/>
-          <w:rtl w:val="0"/>
-        </w:rPr>
-        <w:t xml:space="preserve">Input the customer information.</w:t>
-      </w:r>
-    </w:p>
-    <w:p>
-      <w:pPr>
-        <w:keepNext w:val="0"/>
-        <w:keepLines w:val="0"/>
-        <w:pageBreakBefore w:val="0"/>
-        <w:widowControl w:val="1"/>
-        <w:numPr>
-          <w:ilvl w:val="0"/>
-          <w:numId w:val="12"/>
-        </w:numPr>
-        <w:pBdr>
-          <w:top w:space="0" w:sz="0" w:val="nil"/>
-          <w:left w:space="0" w:sz="0" w:val="nil"/>
-          <w:bottom w:space="0" w:sz="0" w:val="nil"/>
-          <w:right w:space="0" w:sz="0" w:val="nil"/>
-          <w:between w:space="0" w:sz="0" w:val="nil"/>
-        </w:pBdr>
-        <w:shd w:fill="auto" w:val="clear"/>
-        <w:spacing w:after="0" w:before="0" w:line="240" w:lineRule="auto"/>
-        <w:ind w:left="900" w:right="0" w:hanging="360"/>
-        <w:jc w:val="left"/>
-        <w:rPr>
-          <w:b w:val="0"/>
-          <w:bCs w:val="0"/>
-          <w:i w:val="1"/>
-          <w:iCs w:val="1"/>
-          <w:smallCaps w:val="0"/>
-          <w:strike w:val="0"/>
-          <w:color w:val="ff0000"/>
-          <w:sz w:val="26"/>
-          <w:szCs w:val="26"/>
-          <w:u w:val="none"/>
-          <w:shd w:fill="auto" w:val="clear"/>
-          <w:vertAlign w:val="baseline"/>
-        </w:rPr>
-      </w:pPr>
-      <w:r>
-        <w:rPr>
-          <w:rFonts w:ascii="Times New Roman" w:cs="Times New Roman" w:eastAsia="Times New Roman" w:hAnsi="Times New Roman"/>
-          <w:b w:val="0"/>
-          <w:bCs w:val="0"/>
-          <w:i w:val="1"/>
-          <w:iCs w:val="1"/>
-          <w:smallCaps w:val="0"/>
-          <w:strike w:val="0"/>
-          <w:color w:val="ff0000"/>
-          <w:sz w:val="26"/>
-          <w:szCs w:val="26"/>
-          <w:u w:val="none"/>
-          <w:shd w:fill="auto" w:val="clear"/>
-          <w:vertAlign w:val="baseline"/>
-          <w:rtl w:val="0"/>
-        </w:rPr>
-        <w:t xml:space="preserve">Input the booking.</w:t>
-      </w:r>
-    </w:p>
-    <w:p>
-      <w:pPr>
-        <w:keepNext w:val="0"/>
-        <w:keepLines w:val="0"/>
-        <w:pageBreakBefore w:val="0"/>
-        <w:widowControl w:val="1"/>
-        <w:numPr>
-          <w:ilvl w:val="0"/>
-          <w:numId w:val="12"/>
-        </w:numPr>
-        <w:pBdr>
-          <w:top w:space="0" w:sz="0" w:val="nil"/>
-          <w:left w:space="0" w:sz="0" w:val="nil"/>
-          <w:bottom w:space="0" w:sz="0" w:val="nil"/>
-          <w:right w:space="0" w:sz="0" w:val="nil"/>
-          <w:between w:space="0" w:sz="0" w:val="nil"/>
-        </w:pBdr>
-        <w:shd w:fill="auto" w:val="clear"/>
-        <w:spacing w:after="0" w:before="0" w:line="240" w:lineRule="auto"/>
-        <w:ind w:left="900" w:right="0" w:hanging="360"/>
-        <w:jc w:val="left"/>
-        <w:rPr>
-          <w:b w:val="0"/>
-          <w:bCs w:val="0"/>
-          <w:i w:val="1"/>
-          <w:iCs w:val="1"/>
-          <w:smallCaps w:val="0"/>
-          <w:strike w:val="0"/>
-          <w:color w:val="ff0000"/>
-          <w:sz w:val="26"/>
-          <w:szCs w:val="26"/>
-          <w:u w:val="none"/>
-          <w:shd w:fill="auto" w:val="clear"/>
-          <w:vertAlign w:val="baseline"/>
-        </w:rPr>
-      </w:pPr>
-      <w:r>
-        <w:rPr>
-          <w:rFonts w:ascii="Times New Roman" w:cs="Times New Roman" w:eastAsia="Times New Roman" w:hAnsi="Times New Roman"/>
-          <w:b w:val="0"/>
-          <w:bCs w:val="0"/>
-          <w:i w:val="1"/>
-          <w:iCs w:val="1"/>
-          <w:smallCaps w:val="0"/>
-          <w:strike w:val="0"/>
-          <w:color w:val="ff0000"/>
-          <w:sz w:val="26"/>
-          <w:szCs w:val="26"/>
-          <w:u w:val="none"/>
-          <w:shd w:fill="auto" w:val="clear"/>
-          <w:vertAlign w:val="baseline"/>
-          <w:rtl w:val="0"/>
-        </w:rPr>
-        <w:t xml:space="preserve">Search customers</w:t>
-      </w:r>
-    </w:p>
-    <w:p>
-      <w:pPr>
-        <w:keepNext w:val="0"/>
-        <w:keepLines w:val="0"/>
-        <w:pageBreakBefore w:val="0"/>
-        <w:widowControl w:val="1"/>
-        <w:numPr>
-          <w:ilvl w:val="0"/>
-          <w:numId w:val="12"/>
-        </w:numPr>
-        <w:pBdr>
-          <w:top w:space="0" w:sz="0" w:val="nil"/>
-          <w:left w:space="0" w:sz="0" w:val="nil"/>
-          <w:bottom w:space="0" w:sz="0" w:val="nil"/>
-          <w:right w:space="0" w:sz="0" w:val="nil"/>
-          <w:between w:space="0" w:sz="0" w:val="nil"/>
-        </w:pBdr>
-        <w:shd w:fill="auto" w:val="clear"/>
-        <w:spacing w:after="0" w:before="0" w:line="240" w:lineRule="auto"/>
-        <w:ind w:left="900" w:right="0" w:hanging="360"/>
-        <w:jc w:val="left"/>
-        <w:rPr>
-          <w:b w:val="0"/>
-          <w:bCs w:val="0"/>
-          <w:i w:val="1"/>
-          <w:iCs w:val="1"/>
-          <w:smallCaps w:val="0"/>
-          <w:strike w:val="0"/>
-          <w:color w:val="ff0000"/>
-          <w:sz w:val="26"/>
-          <w:szCs w:val="26"/>
-          <w:u w:val="none"/>
-          <w:shd w:fill="auto" w:val="clear"/>
-          <w:vertAlign w:val="baseline"/>
-        </w:rPr>
-      </w:pPr>
-      <w:r>
-        <w:rPr>
-          <w:rFonts w:ascii="Times New Roman" w:cs="Times New Roman" w:eastAsia="Times New Roman" w:hAnsi="Times New Roman"/>
-          <w:b w:val="0"/>
-          <w:bCs w:val="0"/>
-          <w:i w:val="1"/>
-          <w:iCs w:val="1"/>
-          <w:smallCaps w:val="0"/>
-          <w:strike w:val="0"/>
-          <w:color w:val="ff0000"/>
-          <w:sz w:val="26"/>
-          <w:szCs w:val="26"/>
-          <w:u w:val="none"/>
-          <w:shd w:fill="auto" w:val="clear"/>
-          <w:vertAlign w:val="baseline"/>
-          <w:rtl w:val="0"/>
-        </w:rPr>
-        <w:t xml:space="preserve">Display the booking details.</w:t>
-      </w:r>
-    </w:p>
-    <w:p>
-      <w:pPr>
-        <w:keepNext w:val="0"/>
-        <w:keepLines w:val="0"/>
-        <w:pageBreakBefore w:val="0"/>
-        <w:widowControl w:val="1"/>
-        <w:numPr>
-          <w:ilvl w:val="0"/>
-          <w:numId w:val="12"/>
-        </w:numPr>
-        <w:pBdr>
-          <w:top w:space="0" w:sz="0" w:val="nil"/>
-          <w:left w:space="0" w:sz="0" w:val="nil"/>
-          <w:bottom w:space="0" w:sz="0" w:val="nil"/>
-          <w:right w:space="0" w:sz="0" w:val="nil"/>
-          <w:between w:space="0" w:sz="0" w:val="nil"/>
-        </w:pBdr>
-        <w:shd w:fill="auto" w:val="clear"/>
-        <w:spacing w:after="0" w:before="0" w:line="240" w:lineRule="auto"/>
-        <w:ind w:left="900" w:right="0" w:hanging="360"/>
-        <w:jc w:val="left"/>
-        <w:rPr>
-          <w:b w:val="0"/>
-          <w:bCs w:val="0"/>
-          <w:i w:val="1"/>
-          <w:iCs w:val="1"/>
-          <w:smallCaps w:val="0"/>
-          <w:strike w:val="0"/>
-          <w:color w:val="ff0000"/>
-          <w:sz w:val="26"/>
-          <w:szCs w:val="26"/>
-          <w:u w:val="none"/>
-          <w:shd w:fill="auto" w:val="clear"/>
-          <w:vertAlign w:val="baseline"/>
-        </w:rPr>
-      </w:pPr>
-      <w:r>
-        <w:rPr>
-          <w:rFonts w:ascii="Times New Roman" w:cs="Times New Roman" w:eastAsia="Times New Roman" w:hAnsi="Times New Roman"/>
-          <w:b w:val="0"/>
-          <w:bCs w:val="0"/>
-          <w:i w:val="1"/>
-          <w:iCs w:val="1"/>
-          <w:smallCaps w:val="0"/>
-          <w:strike w:val="0"/>
-          <w:color w:val="ff0000"/>
-          <w:sz w:val="26"/>
-          <w:szCs w:val="26"/>
-          <w:u w:val="none"/>
-          <w:shd w:fill="auto" w:val="clear"/>
-          <w:vertAlign w:val="baseline"/>
-          <w:rtl w:val="0"/>
-        </w:rPr>
-        <w:t xml:space="preserve">…</w:t>
-      </w:r>
-    </w:p>
-    <w:p>
-      <w:pPr>
-        <w:keepNext w:val="0"/>
-        <w:keepLines w:val="0"/>
-        <w:pageBreakBefore w:val="0"/>
-        <w:widowControl w:val="1"/>
-        <w:pBdr>
-          <w:top w:space="0" w:sz="0" w:val="nil"/>
-          <w:left w:space="0" w:sz="0" w:val="nil"/>
-          <w:bottom w:space="0" w:sz="0" w:val="nil"/>
-          <w:right w:space="0" w:sz="0" w:val="nil"/>
-          <w:between w:space="0" w:sz="0" w:val="nil"/>
-        </w:pBdr>
-        <w:shd w:fill="auto" w:val="clear"/>
-        <w:spacing w:after="0" w:before="0" w:line="240" w:lineRule="auto"/>
-        <w:ind w:left="900" w:right="0" w:firstLine="0"/>
-        <w:jc w:val="left"/>
-        <w:rPr>
-          <w:rFonts w:ascii="Times New Roman" w:cs="Times New Roman" w:eastAsia="Times New Roman" w:hAnsi="Times New Roman"/>
-          <w:b w:val="0"/>
-          <w:bCs w:val="0"/>
-          <w:i w:val="1"/>
-          <w:iCs w:val="1"/>
-          <w:smallCaps w:val="0"/>
-          <w:strike w:val="0"/>
-          <w:color w:val="ff0000"/>
-          <w:sz w:val="26"/>
-          <w:szCs w:val="26"/>
-          <w:u w:val="none"/>
-          <w:shd w:fill="auto" w:val="clear"/>
-          <w:vertAlign w:val="baseline"/>
-        </w:rPr>
-      </w:pPr>
-      <w:r>
-        <w:rPr>
-          <w:rtl w:val="0"/>
-        </w:rPr>
-      </w:r>
-    </w:p>
-    <w:p>
-      <w:pPr>
-        <w:keepNext w:val="0"/>
-        <w:keepLines w:val="0"/>
-        <w:pageBreakBefore w:val="0"/>
-        <w:widowControl w:val="1"/>
-        <w:pBdr>
-          <w:top w:space="0" w:sz="0" w:val="nil"/>
-          <w:left w:space="0" w:sz="0" w:val="nil"/>
-          <w:bottom w:space="0" w:sz="0" w:val="nil"/>
-          <w:right w:space="0" w:sz="0" w:val="nil"/>
-          <w:between w:space="0" w:sz="0" w:val="nil"/>
-        </w:pBdr>
-        <w:shd w:fill="auto" w:val="clear"/>
-        <w:spacing w:after="0" w:before="0" w:line="240" w:lineRule="auto"/>
-        <w:ind w:left="900" w:right="0" w:firstLine="0"/>
-        <w:jc w:val="left"/>
-        <w:rPr>
-          <w:rFonts w:ascii="Times New Roman" w:cs="Times New Roman" w:eastAsia="Times New Roman" w:hAnsi="Times New Roman"/>
-          <w:b w:val="0"/>
-          <w:bCs w:val="0"/>
-          <w:i w:val="1"/>
-          <w:iCs w:val="1"/>
-          <w:smallCaps w:val="0"/>
-          <w:strike w:val="0"/>
-          <w:color w:val="ff0000"/>
-          <w:sz w:val="26"/>
-          <w:szCs w:val="26"/>
-          <w:u w:val="none"/>
-          <w:shd w:fill="auto" w:val="clear"/>
-          <w:vertAlign w:val="baseline"/>
-        </w:rPr>
-      </w:pPr>
-      <w:r>
-        <w:rPr>
-          <w:rFonts w:ascii="Times New Roman" w:cs="Times New Roman" w:eastAsia="Times New Roman" w:hAnsi="Times New Roman"/>
-          <w:b w:val="0"/>
-          <w:bCs w:val="0"/>
-          <w:i w:val="1"/>
-          <w:iCs w:val="1"/>
-          <w:smallCaps w:val="0"/>
-          <w:strike w:val="0"/>
-          <w:color w:val="ff0000"/>
-          <w:sz w:val="26"/>
-          <w:szCs w:val="26"/>
-          <w:u w:val="none"/>
-          <w:shd w:fill="auto" w:val="clear"/>
-          <w:vertAlign w:val="baseline"/>
-          <w:rtl w:val="0"/>
-        </w:rPr>
-        <w:t xml:space="preserve">1 user role table</w:t>
-      </w:r>
-    </w:p>
-    <w:p>
-      <w:pPr>
-        <w:keepNext w:val="0"/>
-        <w:keepLines w:val="0"/>
-        <w:pageBreakBefore w:val="0"/>
-        <w:widowControl w:val="1"/>
-        <w:pBdr>
-          <w:top w:space="0" w:sz="0" w:val="nil"/>
-          <w:left w:space="0" w:sz="0" w:val="nil"/>
-          <w:bottom w:space="0" w:sz="0" w:val="nil"/>
-          <w:right w:space="0" w:sz="0" w:val="nil"/>
-          <w:between w:space="0" w:sz="0" w:val="nil"/>
-        </w:pBdr>
-        <w:shd w:fill="auto" w:val="clear"/>
-        <w:spacing w:after="0" w:before="0" w:line="240" w:lineRule="auto"/>
-        <w:ind w:left="900" w:right="0" w:firstLine="0"/>
-        <w:jc w:val="left"/>
-        <w:rPr>
-          <w:rFonts w:ascii="Times New Roman" w:cs="Times New Roman" w:eastAsia="Times New Roman" w:hAnsi="Times New Roman"/>
-          <w:b w:val="0"/>
-          <w:bCs w:val="0"/>
-          <w:i w:val="1"/>
-          <w:iCs w:val="1"/>
-          <w:smallCaps w:val="0"/>
-          <w:strike w:val="0"/>
-          <w:color w:val="ff0000"/>
-          <w:sz w:val="26"/>
-          <w:szCs w:val="26"/>
-          <w:u w:val="none"/>
-          <w:shd w:fill="auto" w:val="clear"/>
-          <w:vertAlign w:val="baseline"/>
-        </w:rPr>
-      </w:pPr>
-      <w:r>
-        <w:rPr>
-          <w:rFonts w:ascii="Times New Roman" w:cs="Times New Roman" w:eastAsia="Times New Roman" w:hAnsi="Times New Roman"/>
-          <w:b w:val="0"/>
-          <w:bCs w:val="0"/>
-          <w:i w:val="1"/>
-          <w:iCs w:val="1"/>
-          <w:smallCaps w:val="0"/>
-          <w:strike w:val="0"/>
-          <w:color w:val="ff0000"/>
-          <w:sz w:val="26"/>
-          <w:szCs w:val="26"/>
-          <w:u w:val="none"/>
-          <w:shd w:fill="auto" w:val="clear"/>
-          <w:vertAlign w:val="baseline"/>
-          <w:rtl w:val="0"/>
-        </w:rPr>
-        <w:t xml:space="preserve">1 usecase diagram</w:t>
-      </w:r>
-    </w:p>
-    <w:p>
-      <w:pPr>
-        <w:keepNext w:val="0"/>
-        <w:keepLines w:val="0"/>
-        <w:pageBreakBefore w:val="0"/>
-        <w:widowControl w:val="1"/>
-        <w:pBdr>
-          <w:top w:space="0" w:sz="0" w:val="nil"/>
-          <w:left w:space="0" w:sz="0" w:val="nil"/>
-          <w:bottom w:space="0" w:sz="0" w:val="nil"/>
-          <w:right w:space="0" w:sz="0" w:val="nil"/>
-          <w:between w:space="0" w:sz="0" w:val="nil"/>
-        </w:pBdr>
-        <w:shd w:fill="auto" w:val="clear"/>
-        <w:spacing w:after="120" w:before="0" w:line="240" w:lineRule="auto"/>
-        <w:ind w:left="900" w:right="0" w:firstLine="0"/>
-        <w:jc w:val="left"/>
-        <w:rPr>
-          <w:rFonts w:ascii="Times New Roman" w:cs="Times New Roman" w:eastAsia="Times New Roman" w:hAnsi="Times New Roman"/>
-          <w:b w:val="0"/>
-          <w:bCs w:val="0"/>
-          <w:i w:val="1"/>
-          <w:iCs w:val="1"/>
-          <w:smallCaps w:val="0"/>
-          <w:strike w:val="0"/>
-          <w:color w:val="ff0000"/>
-          <w:sz w:val="26"/>
-          <w:szCs w:val="26"/>
-          <w:u w:val="none"/>
-          <w:shd w:fill="auto" w:val="clear"/>
-          <w:vertAlign w:val="baseline"/>
-        </w:rPr>
-      </w:pPr>
-      <w:r>
-        <w:rPr>
-          <w:rtl w:val="0"/>
-        </w:rPr>
-      </w:r>
-    </w:p>
-    <w:p>
-      <w:pPr>
-        <w:spacing w:after="120" w:line="240" w:lineRule="auto"/>
-        <w:rPr>
-          <w:rFonts w:ascii="Times New Roman" w:cs="Times New Roman" w:eastAsia="Times New Roman" w:hAnsi="Times New Roman"/>
-          <w:i w:val="1"/>
-          <w:iCs w:val="1"/>
-          <w:color w:val="ff0000"/>
-          <w:sz w:val="26"/>
-          <w:szCs w:val="26"/>
-        </w:rPr>
-      </w:pPr>
-      <w:r>
-        <w:rPr>
-          <w:rFonts w:ascii="Times New Roman" w:cs="Times New Roman" w:eastAsia="Times New Roman" w:hAnsi="Times New Roman"/>
-          <w:i w:val="1"/>
-          <w:iCs w:val="1"/>
-          <w:color w:val="ff0000"/>
-          <w:sz w:val="26"/>
-          <w:szCs w:val="26"/>
-          <w:rtl w:val="0"/>
-        </w:rPr>
-        <w:t xml:space="preserve">In this project, we use Java OOP for designing classes and applying the OOP such as encapsulation, inheritance, … [You can update this section during the regular request and submission, and make it complete for the final submissions ]</w:t>
-      </w:r>
-    </w:p>
-    <w:p>
-      <w:pPr>
-        <w:spacing w:after="120" w:line="240" w:lineRule="auto"/>
-        <w:rPr>
-          <w:rFonts w:ascii="Times New Roman" w:cs="Times New Roman" w:eastAsia="Times New Roman" w:hAnsi="Times New Roman"/>
-          <w:color w:val="ff0000"/>
-          <w:sz w:val="26"/>
-          <w:szCs w:val="26"/>
-        </w:rPr>
-      </w:pPr>
-      <w:r>
-        <w:rPr>
-          <w:rtl w:val="0"/>
-        </w:rPr>
-      </w:r>
-    </w:p>
-    <w:p>
-      <w:pPr>
-        <w:spacing w:after="120" w:line="240" w:lineRule="auto"/>
-        <w:rPr>
-          <w:rFonts w:ascii="Times New Roman" w:cs="Times New Roman" w:eastAsia="Times New Roman" w:hAnsi="Times New Roman"/>
-          <w:sz w:val="26"/>
-          <w:szCs w:val="26"/>
-        </w:rPr>
-      </w:pPr>
-      <w:r>
-        <w:rPr>
-          <w:rFonts w:ascii="Times New Roman" w:cs="Times New Roman" w:eastAsia="Times New Roman" w:hAnsi="Times New Roman"/>
-          <w:sz w:val="26"/>
-          <w:szCs w:val="26"/>
-          <w:rtl w:val="0"/>
-        </w:rPr>
-        <w:t xml:space="preserve">In this project, we will deliver a Fabric mod for Minecraft 1.21.11 (Java 21) that adds a new dimension called The Abyss.</w:t>
-      </w:r>
-    </w:p>
-    <w:p>
-      <w:pPr>
-        <w:spacing w:after="120" w:line="240" w:lineRule="auto"/>
-        <w:rPr>
-          <w:rFonts w:ascii="Times New Roman" w:cs="Times New Roman" w:eastAsia="Times New Roman" w:hAnsi="Times New Roman"/>
-          <w:sz w:val="26"/>
-          <w:szCs w:val="26"/>
-        </w:rPr>
-      </w:pPr>
-      <w:r>
-        <w:rPr>
-          <w:rFonts w:ascii="Times New Roman" w:cs="Times New Roman" w:eastAsia="Times New Roman" w:hAnsi="Times New Roman"/>
-          <w:sz w:val="26"/>
-          <w:szCs w:val="26"/>
-          <w:rtl w:val="0"/>
-        </w:rPr>
-        <w:t xml:space="preserve">We want players to reach The Abyss through the existing game, explore a dark and dangerous world, and be rewarded with new content that does not exist in vanilla/normal Minecraft. The mod runs inside the game as a Java application, so players keep their normal Minecraft interface and controls.</w:t>
-      </w:r>
-    </w:p>
-    <w:p>
-      <w:pPr>
-        <w:spacing w:after="120" w:line="240" w:lineRule="auto"/>
-        <w:rPr>
-          <w:rFonts w:ascii="Times New Roman" w:cs="Times New Roman" w:eastAsia="Times New Roman" w:hAnsi="Times New Roman"/>
-          <w:sz w:val="26"/>
-          <w:szCs w:val="26"/>
-        </w:rPr>
-      </w:pPr>
-      <w:r>
-        <w:rPr>
-          <w:rFonts w:ascii="Times New Roman" w:cs="Times New Roman" w:eastAsia="Times New Roman" w:hAnsi="Times New Roman"/>
-          <w:sz w:val="26"/>
-          <w:szCs w:val="26"/>
-          <w:rtl w:val="0"/>
-        </w:rPr>
-        <w:t xml:space="preserve">This project provides the basic functions for the players as follows:</w:t>
-      </w:r>
-    </w:p>
-    <w:p>
-      <w:pPr>
-        <w:numPr>
-          <w:ilvl w:val="0"/>
-          <w:numId w:val="16"/>
+          <w:numId w:val="15"/>
         </w:numPr>
         <w:spacing w:after="0" w:afterAutospacing="0" w:line="240" w:lineRule="auto"/>
         <w:ind w:left="720" w:hanging="360"/>
@@ -2663,7 +1890,7 @@
       <w:pPr>
         <w:numPr>
           <w:ilvl w:val="0"/>
-          <w:numId w:val="16"/>
+          <w:numId w:val="15"/>
         </w:numPr>
         <w:spacing w:after="0" w:afterAutospacing="0" w:line="240" w:lineRule="auto"/>
         <w:ind w:left="720" w:hanging="360"/>
@@ -2688,7 +1915,7 @@
       <w:pPr>
         <w:numPr>
           <w:ilvl w:val="0"/>
-          <w:numId w:val="16"/>
+          <w:numId w:val="15"/>
         </w:numPr>
         <w:spacing w:after="0" w:afterAutospacing="0" w:line="240" w:lineRule="auto"/>
         <w:ind w:left="720" w:hanging="360"/>
@@ -2713,7 +1940,7 @@
       <w:pPr>
         <w:numPr>
           <w:ilvl w:val="0"/>
-          <w:numId w:val="16"/>
+          <w:numId w:val="15"/>
         </w:numPr>
         <w:spacing w:after="120" w:line="240" w:lineRule="auto"/>
         <w:ind w:left="720" w:hanging="360"/>
@@ -2790,7 +2017,7 @@
     <w:sdt>
       <w:sdtPr>
         <w:lock w:val="contentLocked"/>
-        <w:id w:val="95658241"/>
+        <w:id w:val="695136199"/>
         <w:tag w:val="goog_rdk_0"/>
       </w:sdtPr>
       <w:sdtContent>
@@ -3612,7 +2839,7 @@
         <w:widowControl w:val="1"/>
         <w:numPr>
           <w:ilvl w:val="0"/>
-          <w:numId w:val="15"/>
+          <w:numId w:val="14"/>
         </w:numPr>
         <w:pBdr>
           <w:top w:space="0" w:sz="0" w:val="nil"/>
@@ -3664,10 +2891,6 @@
         <w:keepLines w:val="0"/>
         <w:pageBreakBefore w:val="0"/>
         <w:widowControl w:val="1"/>
-        <w:numPr>
-          <w:ilvl w:val="0"/>
-          <w:numId w:val="13"/>
-        </w:numPr>
         <w:pBdr>
           <w:top w:space="0" w:sz="0" w:val="nil"/>
           <w:left w:space="0" w:sz="0" w:val="nil"/>
@@ -3677,97 +2900,20 @@
         </w:pBdr>
         <w:shd w:fill="auto" w:val="clear"/>
         <w:spacing w:after="0" w:before="0" w:line="240" w:lineRule="auto"/>
-        <w:ind w:left="1260" w:right="0" w:hanging="360"/>
+        <w:ind w:right="0"/>
         <w:jc w:val="both"/>
         <w:rPr>
-          <w:b w:val="0"/>
-          <w:bCs w:val="0"/>
+          <w:rFonts w:ascii="Times New Roman" w:cs="Times New Roman" w:eastAsia="Times New Roman" w:hAnsi="Times New Roman"/>
           <w:i w:val="1"/>
           <w:iCs w:val="1"/>
-          <w:smallCaps w:val="0"/>
-          <w:strike w:val="0"/>
-          <w:color w:val="ff0000"/>
-          <w:sz w:val="26"/>
-          <w:szCs w:val="26"/>
-          <w:u w:val="none"/>
-          <w:shd w:fill="auto" w:val="clear"/>
-          <w:vertAlign w:val="baseline"/>
-        </w:rPr>
-      </w:pPr>
-      <w:r>
-        <w:rPr>
-          <w:rFonts w:ascii="Times New Roman" w:cs="Times New Roman" w:eastAsia="Times New Roman" w:hAnsi="Times New Roman"/>
-          <w:b w:val="0"/>
-          <w:bCs w:val="0"/>
-          <w:i w:val="1"/>
-          <w:iCs w:val="1"/>
-          <w:smallCaps w:val="0"/>
-          <w:strike w:val="0"/>
-          <w:color w:val="ff0000"/>
-          <w:sz w:val="26"/>
-          <w:szCs w:val="26"/>
-          <w:u w:val="none"/>
-          <w:shd w:fill="auto" w:val="clear"/>
-          <w:vertAlign w:val="baseline"/>
-          <w:rtl w:val="0"/>
-        </w:rPr>
-        <w:t xml:space="preserve">In this section, students analyse and list objects (name, behavior, state)</w:t>
-      </w:r>
-    </w:p>
-    <w:p>
-      <w:pPr>
-        <w:keepNext w:val="0"/>
-        <w:keepLines w:val="0"/>
-        <w:pageBreakBefore w:val="0"/>
-        <w:widowControl w:val="1"/>
-        <w:numPr>
-          <w:ilvl w:val="0"/>
-          <w:numId w:val="13"/>
-        </w:numPr>
-        <w:pBdr>
-          <w:top w:space="0" w:sz="0" w:val="nil"/>
-          <w:left w:space="0" w:sz="0" w:val="nil"/>
-          <w:bottom w:space="0" w:sz="0" w:val="nil"/>
-          <w:right w:space="0" w:sz="0" w:val="nil"/>
-          <w:between w:space="0" w:sz="0" w:val="nil"/>
-        </w:pBdr>
-        <w:shd w:fill="auto" w:val="clear"/>
-        <w:spacing w:after="120" w:before="0" w:line="240" w:lineRule="auto"/>
-        <w:ind w:left="1260" w:right="0" w:hanging="360"/>
-        <w:jc w:val="both"/>
-        <w:rPr>
-          <w:b w:val="0"/>
-          <w:bCs w:val="0"/>
-          <w:i w:val="1"/>
-          <w:iCs w:val="1"/>
-          <w:smallCaps w:val="0"/>
-          <w:strike w:val="0"/>
-          <w:color w:val="ff0000"/>
-          <w:sz w:val="26"/>
-          <w:szCs w:val="26"/>
-          <w:u w:val="none"/>
-          <w:shd w:fill="auto" w:val="clear"/>
-          <w:vertAlign w:val="baseline"/>
-        </w:rPr>
-      </w:pPr>
-      <w:r>
-        <w:rPr>
-          <w:rFonts w:ascii="Times New Roman" w:cs="Times New Roman" w:eastAsia="Times New Roman" w:hAnsi="Times New Roman"/>
-          <w:b w:val="0"/>
-          <w:bCs w:val="0"/>
-          <w:i w:val="1"/>
-          <w:iCs w:val="1"/>
-          <w:smallCaps w:val="0"/>
-          <w:strike w:val="0"/>
-          <w:color w:val="ff0000"/>
-          <w:sz w:val="26"/>
-          <w:szCs w:val="26"/>
-          <w:u w:val="none"/>
-          <w:shd w:fill="auto" w:val="clear"/>
-          <w:vertAlign w:val="baseline"/>
-          <w:rtl w:val="0"/>
-        </w:rPr>
-        <w:t xml:space="preserve">Group objects having common states and behaviors</w:t>
+          <w:sz w:val="26"/>
+          <w:szCs w:val="26"/>
+        </w:rPr>
+      </w:pPr>
+      <w:r>
+        <w:rPr>
+          <w:rtl w:val="0"/>
+        </w:rPr>
       </w:r>
     </w:p>
     <w:tbl>
@@ -5293,7 +4439,7 @@
         <w:widowControl w:val="1"/>
         <w:numPr>
           <w:ilvl w:val="0"/>
-          <w:numId w:val="15"/>
+          <w:numId w:val="14"/>
         </w:numPr>
         <w:pBdr>
           <w:top w:space="0" w:sz="0" w:val="nil"/>
@@ -5338,117 +4484,131 @@
         </w:rPr>
         <w:t xml:space="preserve">Classes</w:t>
       </w:r>
-    </w:p>
-    <w:p>
-      <w:pPr>
-        <w:keepNext w:val="0"/>
-        <w:keepLines w:val="0"/>
-        <w:pageBreakBefore w:val="0"/>
-        <w:widowControl w:val="1"/>
+      <w:r>
+        <w:rPr>
+          <w:rtl w:val="0"/>
+        </w:rPr>
+      </w:r>
+    </w:p>
+    <w:p>
+      <w:pPr>
+        <w:spacing w:after="0" w:line="240" w:lineRule="auto"/>
+        <w:ind w:left="720" w:firstLine="720"/>
+        <w:jc w:val="both"/>
+        <w:rPr>
+          <w:rFonts w:ascii="Times New Roman" w:cs="Times New Roman" w:eastAsia="Times New Roman" w:hAnsi="Times New Roman"/>
+          <w:sz w:val="26"/>
+          <w:szCs w:val="26"/>
+        </w:rPr>
+      </w:pPr>
+      <w:r>
+        <w:rPr>
+          <w:rFonts w:ascii="Times New Roman" w:cs="Times New Roman" w:eastAsia="Times New Roman" w:hAnsi="Times New Roman"/>
+          <w:sz w:val="26"/>
+          <w:szCs w:val="26"/>
+          <w:rtl w:val="0"/>
+        </w:rPr>
+        <w:t xml:space="preserve">OOP principles applied in these classes:</w:t>
+      </w:r>
+    </w:p>
+    <w:p>
+      <w:pPr>
         <w:numPr>
           <w:ilvl w:val="0"/>
-          <w:numId w:val="13"/>
+          <w:numId w:val="1"/>
         </w:numPr>
-        <w:pBdr>
-          <w:top w:space="0" w:sz="0" w:val="nil"/>
-          <w:left w:space="0" w:sz="0" w:val="nil"/>
-          <w:bottom w:space="0" w:sz="0" w:val="nil"/>
-          <w:right w:space="0" w:sz="0" w:val="nil"/>
-          <w:between w:space="0" w:sz="0" w:val="nil"/>
-        </w:pBdr>
-        <w:shd w:fill="auto" w:val="clear"/>
-        <w:spacing w:after="0" w:before="0" w:line="240" w:lineRule="auto"/>
-        <w:ind w:left="1350" w:right="0" w:hanging="360"/>
+        <w:spacing w:after="0" w:line="240" w:lineRule="auto"/>
+        <w:ind w:left="1440" w:hanging="360"/>
         <w:jc w:val="both"/>
         <w:rPr>
-          <w:b w:val="0"/>
-          <w:bCs w:val="0"/>
-          <w:i w:val="1"/>
-          <w:iCs w:val="1"/>
-          <w:smallCaps w:val="0"/>
-          <w:strike w:val="0"/>
-          <w:color w:val="ff0000"/>
-          <w:sz w:val="26"/>
-          <w:szCs w:val="26"/>
-          <w:u w:val="none"/>
-          <w:shd w:fill="auto" w:val="clear"/>
-          <w:vertAlign w:val="baseline"/>
-        </w:rPr>
-      </w:pPr>
-      <w:r>
-        <w:rPr>
-          <w:rFonts w:ascii="Times New Roman" w:cs="Times New Roman" w:eastAsia="Times New Roman" w:hAnsi="Times New Roman"/>
-          <w:b w:val="0"/>
-          <w:bCs w:val="0"/>
-          <w:i w:val="1"/>
-          <w:iCs w:val="1"/>
-          <w:smallCaps w:val="0"/>
-          <w:strike w:val="0"/>
-          <w:color w:val="ff0000"/>
-          <w:sz w:val="26"/>
-          <w:szCs w:val="26"/>
-          <w:u w:val="none"/>
-          <w:shd w:fill="auto" w:val="clear"/>
-          <w:vertAlign w:val="baseline"/>
-          <w:rtl w:val="0"/>
-        </w:rPr>
-        <w:t xml:space="preserve">Create classes (name, attributes, functions) for each group. List the classes accordingly.</w:t>
-      </w:r>
-    </w:p>
-    <w:p>
-      <w:pPr>
-        <w:keepNext w:val="0"/>
-        <w:keepLines w:val="0"/>
-        <w:pageBreakBefore w:val="0"/>
-        <w:widowControl w:val="1"/>
+          <w:rFonts w:ascii="Times New Roman" w:cs="Times New Roman" w:eastAsia="Times New Roman" w:hAnsi="Times New Roman"/>
+          <w:sz w:val="26"/>
+          <w:szCs w:val="26"/>
+        </w:rPr>
+      </w:pPr>
+      <w:r>
+        <w:rPr>
+          <w:rFonts w:ascii="Times New Roman" w:cs="Times New Roman" w:eastAsia="Times New Roman" w:hAnsi="Times New Roman"/>
+          <w:sz w:val="26"/>
+          <w:szCs w:val="26"/>
+          <w:rtl w:val="0"/>
+        </w:rPr>
+        <w:t xml:space="preserve">Encapsulation: attributes are private and are read or changed only through getters and methods such as takeDamage.</w:t>
+      </w:r>
+    </w:p>
+    <w:p>
+      <w:pPr>
         <w:numPr>
           <w:ilvl w:val="0"/>
-          <w:numId w:val="13"/>
+          <w:numId w:val="1"/>
         </w:numPr>
-        <w:pBdr>
-          <w:top w:space="0" w:sz="0" w:val="nil"/>
-          <w:left w:space="0" w:sz="0" w:val="nil"/>
-          <w:bottom w:space="0" w:sz="0" w:val="nil"/>
-          <w:right w:space="0" w:sz="0" w:val="nil"/>
-          <w:between w:space="0" w:sz="0" w:val="nil"/>
-        </w:pBdr>
-        <w:shd w:fill="auto" w:val="clear"/>
-        <w:spacing w:after="0" w:before="0" w:line="240" w:lineRule="auto"/>
-        <w:ind w:left="1350" w:right="0" w:hanging="360"/>
+        <w:spacing w:after="0" w:line="240" w:lineRule="auto"/>
+        <w:ind w:left="1440" w:hanging="360"/>
         <w:jc w:val="both"/>
         <w:rPr>
-          <w:b w:val="0"/>
-          <w:bCs w:val="0"/>
-          <w:i w:val="1"/>
-          <w:iCs w:val="1"/>
-          <w:smallCaps w:val="0"/>
-          <w:strike w:val="0"/>
-          <w:color w:val="ff0000"/>
-          <w:sz w:val="26"/>
-          <w:szCs w:val="26"/>
-          <w:u w:val="none"/>
-          <w:shd w:fill="auto" w:val="clear"/>
-          <w:vertAlign w:val="baseline"/>
-        </w:rPr>
-      </w:pPr>
-      <w:r>
-        <w:rPr>
-          <w:rFonts w:ascii="Times New Roman" w:cs="Times New Roman" w:eastAsia="Times New Roman" w:hAnsi="Times New Roman"/>
-          <w:b w:val="0"/>
-          <w:bCs w:val="0"/>
-          <w:i w:val="1"/>
-          <w:iCs w:val="1"/>
-          <w:smallCaps w:val="0"/>
-          <w:strike w:val="0"/>
-          <w:color w:val="ff0000"/>
-          <w:sz w:val="26"/>
-          <w:szCs w:val="26"/>
-          <w:u w:val="none"/>
-          <w:shd w:fill="auto" w:val="clear"/>
-          <w:vertAlign w:val="baseline"/>
-          <w:rtl w:val="0"/>
-        </w:rPr>
-        <w:t xml:space="preserve">You can use the table containing objects and their class.</w:t>
+          <w:rFonts w:ascii="Times New Roman" w:cs="Times New Roman" w:eastAsia="Times New Roman" w:hAnsi="Times New Roman"/>
+          <w:sz w:val="26"/>
+          <w:szCs w:val="26"/>
+        </w:rPr>
+      </w:pPr>
+      <w:r>
+        <w:rPr>
+          <w:rFonts w:ascii="Times New Roman" w:cs="Times New Roman" w:eastAsia="Times New Roman" w:hAnsi="Times New Roman"/>
+          <w:sz w:val="26"/>
+          <w:szCs w:val="26"/>
+          <w:rtl w:val="0"/>
+        </w:rPr>
+        <w:t xml:space="preserve">Inheritance: AbyssBlock, AbyssZombie and NightVisionGoggles extend Minecraft's Block, Zombie and Item classes.</w:t>
+      </w:r>
+    </w:p>
+    <w:p>
+      <w:pPr>
+        <w:numPr>
+          <w:ilvl w:val="0"/>
+          <w:numId w:val="1"/>
+        </w:numPr>
+        <w:spacing w:after="0" w:line="240" w:lineRule="auto"/>
+        <w:ind w:left="1440" w:hanging="360"/>
+        <w:jc w:val="both"/>
+        <w:rPr>
+          <w:rFonts w:ascii="Times New Roman" w:cs="Times New Roman" w:eastAsia="Times New Roman" w:hAnsi="Times New Roman"/>
+          <w:sz w:val="26"/>
+          <w:szCs w:val="26"/>
+        </w:rPr>
+      </w:pPr>
+      <w:r>
+        <w:rPr>
+          <w:rFonts w:ascii="Times New Roman" w:cs="Times New Roman" w:eastAsia="Times New Roman" w:hAnsi="Times New Roman"/>
+          <w:sz w:val="26"/>
+          <w:szCs w:val="26"/>
+          <w:rtl w:val="0"/>
+        </w:rPr>
+        <w:t xml:space="preserve">Polymorphism: each class overrides inherited methods, for example onBreak, attack and the goggles' effect logic, so the game treats them like vanilla objects.</w:t>
+      </w:r>
+    </w:p>
+    <w:p>
+      <w:pPr>
+        <w:numPr>
+          <w:ilvl w:val="0"/>
+          <w:numId w:val="1"/>
+        </w:numPr>
+        <w:spacing w:after="0" w:line="240" w:lineRule="auto"/>
+        <w:ind w:left="1440" w:hanging="360"/>
+        <w:jc w:val="both"/>
+        <w:rPr>
+          <w:rFonts w:ascii="Times New Roman" w:cs="Times New Roman" w:eastAsia="Times New Roman" w:hAnsi="Times New Roman"/>
+          <w:sz w:val="26"/>
+          <w:szCs w:val="26"/>
+        </w:rPr>
+      </w:pPr>
+      <w:r>
+        <w:rPr>
+          <w:rFonts w:ascii="Times New Roman" w:cs="Times New Roman" w:eastAsia="Times New Roman" w:hAnsi="Times New Roman"/>
+          <w:sz w:val="26"/>
+          <w:szCs w:val="26"/>
+          <w:rtl w:val="0"/>
+        </w:rPr>
+        <w:t xml:space="preserve">Abstraction: other code uses methods such as equip or attack without knowing how the effects or damage are calculated.</w:t>
       </w:r>
     </w:p>
     <w:p>
@@ -5470,181 +4630,6 @@
         <w:jc w:val="both"/>
         <w:rPr>
           <w:rFonts w:ascii="Times New Roman" w:cs="Times New Roman" w:eastAsia="Times New Roman" w:hAnsi="Times New Roman"/>
-          <w:i w:val="1"/>
-          <w:iCs w:val="1"/>
-          <w:color w:val="ff0000"/>
-          <w:sz w:val="26"/>
-          <w:szCs w:val="26"/>
-        </w:rPr>
-      </w:pPr>
-      <w:r>
-        <w:rPr>
-          <w:rtl w:val="0"/>
-        </w:rPr>
-      </w:r>
-    </w:p>
-    <w:p>
-      <w:pPr>
-        <w:spacing w:after="0" w:line="240" w:lineRule="auto"/>
-        <w:ind w:left="720" w:firstLine="720"/>
-        <w:jc w:val="both"/>
-        <w:rPr>
-          <w:rFonts w:ascii="Times New Roman" w:cs="Times New Roman" w:eastAsia="Times New Roman" w:hAnsi="Times New Roman"/>
-          <w:i w:val="1"/>
-          <w:iCs w:val="1"/>
-          <w:sz w:val="26"/>
-          <w:szCs w:val="26"/>
-        </w:rPr>
-      </w:pPr>
-      <w:r>
-        <w:rPr>
-          <w:rFonts w:ascii="Times New Roman" w:cs="Times New Roman" w:eastAsia="Times New Roman" w:hAnsi="Times New Roman"/>
-          <w:i w:val="1"/>
-          <w:iCs w:val="1"/>
-          <w:sz w:val="26"/>
-          <w:szCs w:val="26"/>
-          <w:rtl w:val="0"/>
-        </w:rPr>
-        <w:t xml:space="preserve">OOP principles applied in these classes:</w:t>
-      </w:r>
-    </w:p>
-    <w:p>
-      <w:pPr>
-        <w:numPr>
-          <w:ilvl w:val="0"/>
-          <w:numId w:val="1"/>
-        </w:numPr>
-        <w:spacing w:after="0" w:line="240" w:lineRule="auto"/>
-        <w:ind w:left="1440" w:hanging="360"/>
-        <w:jc w:val="both"/>
-        <w:rPr>
-          <w:rFonts w:ascii="Times New Roman" w:cs="Times New Roman" w:eastAsia="Times New Roman" w:hAnsi="Times New Roman"/>
-          <w:i w:val="1"/>
-          <w:iCs w:val="1"/>
-          <w:sz w:val="26"/>
-          <w:szCs w:val="26"/>
-        </w:rPr>
-      </w:pPr>
-      <w:r>
-        <w:rPr>
-          <w:rFonts w:ascii="Times New Roman" w:cs="Times New Roman" w:eastAsia="Times New Roman" w:hAnsi="Times New Roman"/>
-          <w:i w:val="1"/>
-          <w:iCs w:val="1"/>
-          <w:sz w:val="26"/>
-          <w:szCs w:val="26"/>
-          <w:rtl w:val="0"/>
-        </w:rPr>
-        <w:t xml:space="preserve">Encapsulation: attributes are private and are read or changed only through getters and methods such as takeDamage.</w:t>
-      </w:r>
-    </w:p>
-    <w:p>
-      <w:pPr>
-        <w:numPr>
-          <w:ilvl w:val="0"/>
-          <w:numId w:val="1"/>
-        </w:numPr>
-        <w:spacing w:after="0" w:line="240" w:lineRule="auto"/>
-        <w:ind w:left="1440" w:hanging="360"/>
-        <w:jc w:val="both"/>
-        <w:rPr>
-          <w:rFonts w:ascii="Times New Roman" w:cs="Times New Roman" w:eastAsia="Times New Roman" w:hAnsi="Times New Roman"/>
-          <w:i w:val="1"/>
-          <w:iCs w:val="1"/>
-          <w:sz w:val="26"/>
-          <w:szCs w:val="26"/>
-        </w:rPr>
-      </w:pPr>
-      <w:r>
-        <w:rPr>
-          <w:rFonts w:ascii="Times New Roman" w:cs="Times New Roman" w:eastAsia="Times New Roman" w:hAnsi="Times New Roman"/>
-          <w:i w:val="1"/>
-          <w:iCs w:val="1"/>
-          <w:sz w:val="26"/>
-          <w:szCs w:val="26"/>
-          <w:rtl w:val="0"/>
-        </w:rPr>
-        <w:t xml:space="preserve">Inheritance: AbyssBlock, AbyssZombie and NightVisionGoggles extend Minecraft's Block, Zombie and Item classes.</w:t>
-      </w:r>
-    </w:p>
-    <w:p>
-      <w:pPr>
-        <w:numPr>
-          <w:ilvl w:val="0"/>
-          <w:numId w:val="1"/>
-        </w:numPr>
-        <w:spacing w:after="0" w:line="240" w:lineRule="auto"/>
-        <w:ind w:left="1440" w:hanging="360"/>
-        <w:jc w:val="both"/>
-        <w:rPr>
-          <w:rFonts w:ascii="Times New Roman" w:cs="Times New Roman" w:eastAsia="Times New Roman" w:hAnsi="Times New Roman"/>
-          <w:i w:val="1"/>
-          <w:iCs w:val="1"/>
-          <w:sz w:val="26"/>
-          <w:szCs w:val="26"/>
-        </w:rPr>
-      </w:pPr>
-      <w:r>
-        <w:rPr>
-          <w:rFonts w:ascii="Times New Roman" w:cs="Times New Roman" w:eastAsia="Times New Roman" w:hAnsi="Times New Roman"/>
-          <w:i w:val="1"/>
-          <w:iCs w:val="1"/>
-          <w:sz w:val="26"/>
-          <w:szCs w:val="26"/>
-          <w:rtl w:val="0"/>
-        </w:rPr>
-        <w:t xml:space="preserve">Polymorphism: each class overrides inherited methods, for example onBreak, attack and the goggles' effect logic, so the game treats them like vanilla objects.</w:t>
-      </w:r>
-    </w:p>
-    <w:p>
-      <w:pPr>
-        <w:numPr>
-          <w:ilvl w:val="0"/>
-          <w:numId w:val="1"/>
-        </w:numPr>
-        <w:spacing w:after="0" w:line="240" w:lineRule="auto"/>
-        <w:ind w:left="1440" w:hanging="360"/>
-        <w:jc w:val="both"/>
-        <w:rPr>
-          <w:rFonts w:ascii="Times New Roman" w:cs="Times New Roman" w:eastAsia="Times New Roman" w:hAnsi="Times New Roman"/>
-          <w:i w:val="1"/>
-          <w:iCs w:val="1"/>
-          <w:sz w:val="26"/>
-          <w:szCs w:val="26"/>
-        </w:rPr>
-      </w:pPr>
-      <w:r>
-        <w:rPr>
-          <w:rFonts w:ascii="Times New Roman" w:cs="Times New Roman" w:eastAsia="Times New Roman" w:hAnsi="Times New Roman"/>
-          <w:i w:val="1"/>
-          <w:iCs w:val="1"/>
-          <w:sz w:val="26"/>
-          <w:szCs w:val="26"/>
-          <w:rtl w:val="0"/>
-        </w:rPr>
-        <w:t xml:space="preserve">Abstraction: other code uses methods such as equip or attack without knowing how the effects or damage are calculated.</w:t>
-      </w:r>
-    </w:p>
-    <w:p>
-      <w:pPr>
-        <w:keepNext w:val="0"/>
-        <w:keepLines w:val="0"/>
-        <w:pageBreakBefore w:val="0"/>
-        <w:widowControl w:val="1"/>
-        <w:pBdr>
-          <w:top w:space="0" w:sz="0" w:val="nil"/>
-          <w:left w:space="0" w:sz="0" w:val="nil"/>
-          <w:bottom w:space="0" w:sz="0" w:val="nil"/>
-          <w:right w:space="0" w:sz="0" w:val="nil"/>
-          <w:between w:space="0" w:sz="0" w:val="nil"/>
-        </w:pBdr>
-        <w:shd w:fill="auto" w:val="clear"/>
-        <w:spacing w:after="0" w:before="0" w:line="240" w:lineRule="auto"/>
-        <w:ind w:right="0"/>
-        <w:jc w:val="both"/>
-        <w:rPr>
-          <w:rFonts w:ascii="Times New Roman" w:cs="Times New Roman" w:eastAsia="Times New Roman" w:hAnsi="Times New Roman"/>
-          <w:i w:val="1"/>
-          <w:iCs w:val="1"/>
           <w:color w:val="ff0000"/>
           <w:sz w:val="26"/>
           <w:szCs w:val="26"/>
@@ -5664,7 +4649,7 @@
         <w:widowControl w:val="1"/>
         <w:numPr>
           <w:ilvl w:val="0"/>
-          <w:numId w:val="13"/>
+          <w:numId w:val="12"/>
         </w:numPr>
         <w:pBdr>
           <w:top w:space="0" w:sz="0" w:val="nil"/>
@@ -5680,14 +4665,11 @@
         <w:rPr>
           <w:b w:val="0"/>
           <w:bCs w:val="0"/>
-          <w:i w:val="1"/>
-          <w:iCs w:val="1"/>
-          <w:smallCaps w:val="0"/>
-          <w:strike w:val="0"/>
-          <w:color w:val="000000"/>
-          <w:sz w:val="26"/>
-          <w:szCs w:val="26"/>
-          <w:u w:val="none"/>
+          <w:smallCaps w:val="0"/>
+          <w:strike w:val="0"/>
+          <w:color w:val="000000"/>
+          <w:sz w:val="26"/>
+          <w:szCs w:val="26"/>
           <w:shd w:fill="auto" w:val="clear"/>
           <w:vertAlign w:val="baseline"/>
         </w:rPr>
@@ -5697,8 +4679,6 @@
           <w:rFonts w:ascii="Times New Roman" w:cs="Times New Roman" w:eastAsia="Times New Roman" w:hAnsi="Times New Roman"/>
           <w:b w:val="0"/>
           <w:bCs w:val="0"/>
-          <w:i w:val="1"/>
-          <w:iCs w:val="1"/>
           <w:smallCaps w:val="0"/>
           <w:strike w:val="0"/>
           <w:color w:val="000000"/>
@@ -5720,7 +4700,7 @@
         <w:widowControl w:val="1"/>
         <w:numPr>
           <w:ilvl w:val="0"/>
-          <w:numId w:val="13"/>
+          <w:numId w:val="12"/>
         </w:numPr>
         <w:pBdr>
           <w:top w:space="0" w:sz="0" w:val="nil"/>
@@ -5736,14 +4716,11 @@
         <w:rPr>
           <w:b w:val="0"/>
           <w:bCs w:val="0"/>
-          <w:i w:val="1"/>
-          <w:iCs w:val="1"/>
-          <w:smallCaps w:val="0"/>
-          <w:strike w:val="0"/>
-          <w:color w:val="000000"/>
-          <w:sz w:val="26"/>
-          <w:szCs w:val="26"/>
-          <w:u w:val="none"/>
+          <w:smallCaps w:val="0"/>
+          <w:strike w:val="0"/>
+          <w:color w:val="000000"/>
+          <w:sz w:val="26"/>
+          <w:szCs w:val="26"/>
           <w:shd w:fill="auto" w:val="clear"/>
           <w:vertAlign w:val="baseline"/>
         </w:rPr>
@@ -5753,8 +4730,6 @@
           <w:rFonts w:ascii="Times New Roman" w:cs="Times New Roman" w:eastAsia="Times New Roman" w:hAnsi="Times New Roman"/>
           <w:b w:val="0"/>
           <w:bCs w:val="0"/>
-          <w:i w:val="1"/>
-          <w:iCs w:val="1"/>
           <w:smallCaps w:val="0"/>
           <w:strike w:val="0"/>
           <w:color w:val="000000"/>
@@ -5968,7 +4943,7 @@
         <w:widowControl w:val="1"/>
         <w:numPr>
           <w:ilvl w:val="0"/>
-          <w:numId w:val="13"/>
+          <w:numId w:val="12"/>
         </w:numPr>
         <w:pBdr>
           <w:top w:space="0" w:sz="0" w:val="nil"/>
@@ -6194,7 +5169,7 @@
         <w:widowControl w:val="1"/>
         <w:numPr>
           <w:ilvl w:val="0"/>
-          <w:numId w:val="13"/>
+          <w:numId w:val="12"/>
         </w:numPr>
         <w:pBdr>
           <w:top w:space="0" w:sz="0" w:val="nil"/>
@@ -6596,7 +5571,7 @@
               <w:widowControl w:val="1"/>
               <w:numPr>
                 <w:ilvl w:val="0"/>
-                <w:numId w:val="13"/>
+                <w:numId w:val="12"/>
               </w:numPr>
               <w:pBdr>
                 <w:top w:space="0" w:sz="0" w:val="nil"/>
@@ -6760,7 +5735,7 @@
               <w:widowControl w:val="1"/>
               <w:numPr>
                 <w:ilvl w:val="0"/>
-                <w:numId w:val="13"/>
+                <w:numId w:val="12"/>
               </w:numPr>
               <w:pBdr>
                 <w:top w:space="0" w:sz="0" w:val="nil"/>
@@ -6873,7 +5848,7 @@
               <w:widowControl w:val="1"/>
               <w:numPr>
                 <w:ilvl w:val="0"/>
-                <w:numId w:val="13"/>
+                <w:numId w:val="12"/>
               </w:numPr>
               <w:pBdr>
                 <w:top w:space="0" w:sz="0" w:val="nil"/>
@@ -7211,7 +6186,7 @@
         <w:widowControl w:val="1"/>
         <w:numPr>
           <w:ilvl w:val="0"/>
-          <w:numId w:val="13"/>
+          <w:numId w:val="12"/>
         </w:numPr>
         <w:pBdr>
           <w:top w:space="0" w:sz="0" w:val="nil"/>
@@ -7345,7 +6320,7 @@
         <w:widowControl w:val="1"/>
         <w:numPr>
           <w:ilvl w:val="0"/>
-          <w:numId w:val="13"/>
+          <w:numId w:val="12"/>
         </w:numPr>
         <w:pBdr>
           <w:top w:space="0" w:sz="0" w:val="nil"/>
@@ -8777,7 +7752,7 @@
         <w:widowControl w:val="1"/>
         <w:numPr>
           <w:ilvl w:val="0"/>
-          <w:numId w:val="13"/>
+          <w:numId w:val="12"/>
         </w:numPr>
         <w:pBdr>
           <w:top w:space="0" w:sz="0" w:val="nil"/>
@@ -8833,7 +7808,7 @@
         <w:widowControl w:val="1"/>
         <w:numPr>
           <w:ilvl w:val="0"/>
-          <w:numId w:val="13"/>
+          <w:numId w:val="12"/>
         </w:numPr>
         <w:pBdr>
           <w:top w:space="0" w:sz="0" w:val="nil"/>
@@ -8889,7 +7864,7 @@
         <w:widowControl w:val="1"/>
         <w:numPr>
           <w:ilvl w:val="0"/>
-          <w:numId w:val="13"/>
+          <w:numId w:val="12"/>
         </w:numPr>
         <w:pBdr>
           <w:top w:space="0" w:sz="0" w:val="nil"/>
@@ -9133,7 +8108,7 @@
         <w:widowControl w:val="1"/>
         <w:numPr>
           <w:ilvl w:val="0"/>
-          <w:numId w:val="13"/>
+          <w:numId w:val="12"/>
         </w:numPr>
         <w:pBdr>
           <w:top w:space="0" w:sz="0" w:val="nil"/>
@@ -9189,7 +8164,7 @@
         <w:widowControl w:val="1"/>
         <w:numPr>
           <w:ilvl w:val="0"/>
-          <w:numId w:val="13"/>
+          <w:numId w:val="12"/>
         </w:numPr>
         <w:pBdr>
           <w:top w:space="0" w:sz="0" w:val="nil"/>
@@ -9341,7 +8316,7 @@
         <w:widowControl w:val="1"/>
         <w:numPr>
           <w:ilvl w:val="0"/>
-          <w:numId w:val="13"/>
+          <w:numId w:val="12"/>
         </w:numPr>
         <w:pBdr>
           <w:top w:space="0" w:sz="0" w:val="nil"/>
@@ -9397,7 +8372,7 @@
         <w:widowControl w:val="1"/>
         <w:numPr>
           <w:ilvl w:val="0"/>
-          <w:numId w:val="13"/>
+          <w:numId w:val="12"/>
         </w:numPr>
         <w:pBdr>
           <w:top w:space="0" w:sz="0" w:val="nil"/>
@@ -9549,7 +8524,7 @@
         <w:widowControl w:val="1"/>
         <w:numPr>
           <w:ilvl w:val="0"/>
-          <w:numId w:val="13"/>
+          <w:numId w:val="12"/>
         </w:numPr>
         <w:pBdr>
           <w:top w:space="0" w:sz="0" w:val="nil"/>
@@ -12813,7 +11788,7 @@
         <w:widowControl w:val="1"/>
         <w:numPr>
           <w:ilvl w:val="0"/>
-          <w:numId w:val="13"/>
+          <w:numId w:val="12"/>
         </w:numPr>
         <w:pBdr>
           <w:top w:space="0" w:sz="0" w:val="nil"/>
@@ -12869,7 +11844,7 @@
         <w:widowControl w:val="1"/>
         <w:numPr>
           <w:ilvl w:val="1"/>
-          <w:numId w:val="13"/>
+          <w:numId w:val="12"/>
         </w:numPr>
         <w:pBdr>
           <w:top w:space="0" w:sz="0" w:val="nil"/>
@@ -12925,7 +11900,7 @@
         <w:widowControl w:val="1"/>
         <w:numPr>
           <w:ilvl w:val="1"/>
-          <w:numId w:val="13"/>
+          <w:numId w:val="12"/>
         </w:numPr>
         <w:pBdr>
           <w:top w:space="0" w:sz="0" w:val="nil"/>
@@ -12981,7 +11956,7 @@
         <w:widowControl w:val="1"/>
         <w:numPr>
           <w:ilvl w:val="1"/>
-          <w:numId w:val="13"/>
+          <w:numId w:val="12"/>
         </w:numPr>
         <w:pBdr>
           <w:top w:space="0" w:sz="0" w:val="nil"/>
@@ -13037,7 +12012,7 @@
         <w:widowControl w:val="1"/>
         <w:numPr>
           <w:ilvl w:val="0"/>
-          <w:numId w:val="13"/>
+          <w:numId w:val="12"/>
         </w:numPr>
         <w:pBdr>
           <w:top w:space="0" w:sz="0" w:val="nil"/>
@@ -13093,7 +12068,7 @@
         <w:widowControl w:val="1"/>
         <w:numPr>
           <w:ilvl w:val="0"/>
-          <w:numId w:val="13"/>
+          <w:numId w:val="12"/>
         </w:numPr>
         <w:pBdr>
           <w:top w:space="0" w:sz="0" w:val="nil"/>
@@ -13206,7 +12181,7 @@
         <w:widowControl w:val="1"/>
         <w:numPr>
           <w:ilvl w:val="0"/>
-          <w:numId w:val="13"/>
+          <w:numId w:val="12"/>
         </w:numPr>
         <w:pBdr>
           <w:top w:space="0" w:sz="0" w:val="nil"/>
@@ -13281,7 +12256,7 @@
         <w:widowControl w:val="1"/>
         <w:numPr>
           <w:ilvl w:val="0"/>
-          <w:numId w:val="13"/>
+          <w:numId w:val="12"/>
         </w:numPr>
         <w:pBdr>
           <w:top w:space="0" w:sz="0" w:val="nil"/>
@@ -13337,7 +12312,7 @@
         <w:widowControl w:val="1"/>
         <w:numPr>
           <w:ilvl w:val="0"/>
-          <w:numId w:val="13"/>
+          <w:numId w:val="12"/>
         </w:numPr>
         <w:pBdr>
           <w:top w:space="0" w:sz="0" w:val="nil"/>
@@ -13417,7 +12392,7 @@
         <w:widowControl w:val="1"/>
         <w:numPr>
           <w:ilvl w:val="0"/>
-          <w:numId w:val="13"/>
+          <w:numId w:val="12"/>
         </w:numPr>
         <w:pBdr>
           <w:top w:space="0" w:sz="0" w:val="nil"/>
@@ -13549,7 +12524,7 @@
         <w:widowControl w:val="1"/>
         <w:numPr>
           <w:ilvl w:val="0"/>
-          <w:numId w:val="13"/>
+          <w:numId w:val="12"/>
         </w:numPr>
         <w:pBdr>
           <w:top w:space="0" w:sz="0" w:val="nil"/>
@@ -13803,7 +12778,7 @@
         <w:widowControl w:val="1"/>
         <w:numPr>
           <w:ilvl w:val="0"/>
-          <w:numId w:val="13"/>
+          <w:numId w:val="12"/>
         </w:numPr>
         <w:pBdr>
           <w:top w:space="0" w:sz="0" w:val="nil"/>
@@ -13859,7 +12834,7 @@
         <w:widowControl w:val="1"/>
         <w:numPr>
           <w:ilvl w:val="1"/>
-          <w:numId w:val="13"/>
+          <w:numId w:val="12"/>
         </w:numPr>
         <w:pBdr>
           <w:top w:space="0" w:sz="0" w:val="nil"/>
@@ -13915,7 +12890,7 @@
         <w:widowControl w:val="1"/>
         <w:numPr>
           <w:ilvl w:val="1"/>
-          <w:numId w:val="13"/>
+          <w:numId w:val="12"/>
         </w:numPr>
         <w:pBdr>
           <w:top w:space="0" w:sz="0" w:val="nil"/>
@@ -13971,7 +12946,7 @@
         <w:widowControl w:val="1"/>
         <w:numPr>
           <w:ilvl w:val="0"/>
-          <w:numId w:val="13"/>
+          <w:numId w:val="12"/>
         </w:numPr>
         <w:pBdr>
           <w:top w:space="0" w:sz="0" w:val="nil"/>
@@ -14123,7 +13098,7 @@
         <w:widowControl w:val="1"/>
         <w:numPr>
           <w:ilvl w:val="0"/>
-          <w:numId w:val="13"/>
+          <w:numId w:val="12"/>
         </w:numPr>
         <w:pBdr>
           <w:top w:space="0" w:sz="0" w:val="nil"/>
@@ -14179,7 +13154,7 @@
         <w:widowControl w:val="1"/>
         <w:numPr>
           <w:ilvl w:val="0"/>
-          <w:numId w:val="13"/>
+          <w:numId w:val="12"/>
         </w:numPr>
         <w:pBdr>
           <w:top w:space="0" w:sz="0" w:val="nil"/>
@@ -14235,7 +13210,7 @@
         <w:widowControl w:val="1"/>
         <w:numPr>
           <w:ilvl w:val="0"/>
-          <w:numId w:val="13"/>
+          <w:numId w:val="12"/>
         </w:numPr>
         <w:pBdr>
           <w:top w:space="0" w:sz="0" w:val="nil"/>
@@ -14296,7 +13271,7 @@
         <w:widowControl w:val="1"/>
         <w:numPr>
           <w:ilvl w:val="0"/>
-          <w:numId w:val="13"/>
+          <w:numId w:val="12"/>
         </w:numPr>
         <w:pBdr>
           <w:top w:space="0" w:sz="0" w:val="nil"/>
@@ -17040,7 +16015,7 @@
         <w:widowControl w:val="1"/>
         <w:numPr>
           <w:ilvl w:val="0"/>
-          <w:numId w:val="14"/>
+          <w:numId w:val="13"/>
         </w:numPr>
         <w:pBdr>
           <w:top w:space="0" w:sz="0" w:val="nil"/>
@@ -17072,248 +16047,29 @@
       <w:r>
         <w:rPr>
           <w:rFonts w:ascii="Times New Roman" w:cs="Times New Roman" w:eastAsia="Times New Roman" w:hAnsi="Times New Roman"/>
-          <w:b w:val="0"/>
-          <w:bCs w:val="0"/>
-          <w:i w:val="0"/>
-          <w:iCs w:val="0"/>
-          <w:smallCaps w:val="0"/>
-          <w:strike w:val="0"/>
-          <w:color w:val="000000"/>
           <w:sz w:val="30"/>
           <w:szCs w:val="30"/>
-          <w:u w:val="none"/>
-          <w:shd w:fill="auto" w:val="clear"/>
-          <w:vertAlign w:val="baseline"/>
-          <w:rtl w:val="0"/>
-        </w:rPr>
-        <w:t xml:space="preserve">Tutorial Page, Oracle, 2024, https://...</w:t>
-      </w:r>
-    </w:p>
-    <w:p>
-      <w:pPr>
-        <w:keepNext w:val="0"/>
-        <w:keepLines w:val="0"/>
-        <w:pageBreakBefore w:val="0"/>
-        <w:widowControl w:val="1"/>
-        <w:numPr>
-          <w:ilvl w:val="0"/>
-          <w:numId w:val="14"/>
-        </w:numPr>
-        <w:pBdr>
-          <w:top w:space="0" w:sz="0" w:val="nil"/>
-          <w:left w:space="0" w:sz="0" w:val="nil"/>
-          <w:bottom w:space="0" w:sz="0" w:val="nil"/>
-          <w:right w:space="0" w:sz="0" w:val="nil"/>
-          <w:between w:space="0" w:sz="0" w:val="nil"/>
-        </w:pBdr>
-        <w:shd w:fill="auto" w:val="clear"/>
-        <w:spacing w:after="0" w:before="0" w:line="240" w:lineRule="auto"/>
-        <w:ind w:left="720" w:right="0" w:hanging="360"/>
-        <w:jc w:val="both"/>
-        <w:rPr>
-          <w:rFonts w:ascii="Times New Roman" w:cs="Times New Roman" w:eastAsia="Times New Roman" w:hAnsi="Times New Roman"/>
-          <w:b w:val="0"/>
-          <w:bCs w:val="0"/>
-          <w:i w:val="0"/>
-          <w:iCs w:val="0"/>
-          <w:smallCaps w:val="0"/>
-          <w:strike w:val="0"/>
-          <w:color w:val="000000"/>
-          <w:sz w:val="30"/>
-          <w:szCs w:val="30"/>
-          <w:u w:val="none"/>
-          <w:shd w:fill="auto" w:val="clear"/>
-          <w:vertAlign w:val="baseline"/>
-        </w:rPr>
-      </w:pPr>
-      <w:r>
-        <w:rPr>
-          <w:rFonts w:ascii="Times New Roman" w:cs="Times New Roman" w:eastAsia="Times New Roman" w:hAnsi="Times New Roman"/>
-          <w:b w:val="0"/>
-          <w:bCs w:val="0"/>
-          <w:i w:val="0"/>
-          <w:iCs w:val="0"/>
-          <w:smallCaps w:val="0"/>
-          <w:strike w:val="0"/>
-          <w:color w:val="000000"/>
-          <w:sz w:val="30"/>
-          <w:szCs w:val="30"/>
-          <w:u w:val="none"/>
-          <w:shd w:fill="auto" w:val="clear"/>
-          <w:vertAlign w:val="baseline"/>
-          <w:rtl w:val="0"/>
-        </w:rPr>
-        <w:t xml:space="preserve">…</w:t>
-      </w:r>
-    </w:p>
-    <w:p>
-      <w:pPr>
-        <w:keepNext w:val="0"/>
-        <w:keepLines w:val="0"/>
-        <w:pageBreakBefore w:val="0"/>
-        <w:widowControl w:val="1"/>
-        <w:pBdr>
-          <w:top w:space="0" w:sz="0" w:val="nil"/>
-          <w:left w:space="0" w:sz="0" w:val="nil"/>
-          <w:bottom w:space="0" w:sz="0" w:val="nil"/>
-          <w:right w:space="0" w:sz="0" w:val="nil"/>
-          <w:between w:space="0" w:sz="0" w:val="nil"/>
-        </w:pBdr>
-        <w:shd w:fill="auto" w:val="clear"/>
-        <w:spacing w:after="0" w:before="0" w:line="240" w:lineRule="auto"/>
-        <w:ind w:left="720" w:right="0" w:firstLine="0"/>
-        <w:jc w:val="both"/>
-        <w:rPr>
-          <w:rFonts w:ascii="Times New Roman" w:cs="Times New Roman" w:eastAsia="Times New Roman" w:hAnsi="Times New Roman"/>
-          <w:b w:val="0"/>
-          <w:bCs w:val="0"/>
-          <w:i w:val="0"/>
-          <w:iCs w:val="0"/>
-          <w:smallCaps w:val="0"/>
-          <w:strike w:val="0"/>
-          <w:color w:val="000000"/>
-          <w:sz w:val="30"/>
-          <w:szCs w:val="30"/>
-          <w:u w:val="none"/>
-          <w:shd w:fill="auto" w:val="clear"/>
-          <w:vertAlign w:val="baseline"/>
-        </w:rPr>
-      </w:pPr>
-      <w:r>
-        <w:rPr>
-          <w:rtl w:val="0"/>
-        </w:rPr>
-      </w:r>
-    </w:p>
-    <w:p>
-      <w:pPr>
-        <w:keepNext w:val="0"/>
-        <w:keepLines w:val="0"/>
-        <w:pageBreakBefore w:val="0"/>
-        <w:widowControl w:val="1"/>
-        <w:pBdr>
-          <w:top w:space="0" w:sz="0" w:val="nil"/>
-          <w:left w:space="0" w:sz="0" w:val="nil"/>
-          <w:bottom w:space="0" w:sz="0" w:val="nil"/>
-          <w:right w:space="0" w:sz="0" w:val="nil"/>
-          <w:between w:space="0" w:sz="0" w:val="nil"/>
-        </w:pBdr>
-        <w:shd w:fill="auto" w:val="clear"/>
-        <w:spacing w:after="0" w:before="0" w:line="240" w:lineRule="auto"/>
-        <w:ind w:left="720" w:right="0" w:firstLine="0"/>
-        <w:jc w:val="both"/>
-        <w:rPr>
-          <w:rFonts w:ascii="Times New Roman" w:cs="Times New Roman" w:eastAsia="Times New Roman" w:hAnsi="Times New Roman"/>
-          <w:b w:val="0"/>
-          <w:bCs w:val="0"/>
-          <w:i w:val="0"/>
-          <w:iCs w:val="0"/>
-          <w:smallCaps w:val="0"/>
-          <w:strike w:val="0"/>
-          <w:color w:val="000000"/>
-          <w:sz w:val="30"/>
-          <w:szCs w:val="30"/>
-          <w:u w:val="none"/>
-          <w:shd w:fill="auto" w:val="clear"/>
-          <w:vertAlign w:val="baseline"/>
-        </w:rPr>
-      </w:pPr>
-      <w:r>
-        <w:rPr>
-          <w:rtl w:val="0"/>
-        </w:rPr>
-      </w:r>
-    </w:p>
-    <w:p>
-      <w:pPr>
-        <w:keepNext w:val="0"/>
-        <w:keepLines w:val="0"/>
-        <w:pageBreakBefore w:val="0"/>
-        <w:widowControl w:val="1"/>
-        <w:pBdr>
-          <w:top w:space="0" w:sz="0" w:val="nil"/>
-          <w:left w:space="0" w:sz="0" w:val="nil"/>
-          <w:bottom w:space="0" w:sz="0" w:val="nil"/>
-          <w:right w:space="0" w:sz="0" w:val="nil"/>
-          <w:between w:space="0" w:sz="0" w:val="nil"/>
-        </w:pBdr>
-        <w:shd w:fill="auto" w:val="clear"/>
-        <w:spacing w:after="120" w:before="0" w:line="240" w:lineRule="auto"/>
-        <w:ind w:left="720" w:right="0" w:firstLine="0"/>
-        <w:jc w:val="both"/>
-        <w:rPr>
-          <w:rFonts w:ascii="Times New Roman" w:cs="Times New Roman" w:eastAsia="Times New Roman" w:hAnsi="Times New Roman"/>
-          <w:b w:val="0"/>
-          <w:bCs w:val="0"/>
-          <w:i w:val="1"/>
-          <w:iCs w:val="1"/>
-          <w:smallCaps w:val="0"/>
-          <w:strike w:val="0"/>
-          <w:color w:val="000000"/>
-          <w:sz w:val="30"/>
-          <w:szCs w:val="30"/>
-          <w:u w:val="none"/>
-          <w:shd w:fill="auto" w:val="clear"/>
-          <w:vertAlign w:val="baseline"/>
-        </w:rPr>
-      </w:pPr>
-      <w:r>
-        <w:rPr>
-          <w:rFonts w:ascii="Times New Roman" w:cs="Times New Roman" w:eastAsia="Times New Roman" w:hAnsi="Times New Roman"/>
-          <w:b w:val="0"/>
-          <w:bCs w:val="0"/>
-          <w:i w:val="1"/>
-          <w:iCs w:val="1"/>
-          <w:smallCaps w:val="0"/>
-          <w:strike w:val="0"/>
-          <w:color w:val="000000"/>
-          <w:sz w:val="30"/>
-          <w:szCs w:val="30"/>
-          <w:u w:val="none"/>
-          <w:shd w:fill="auto" w:val="clear"/>
-          <w:vertAlign w:val="baseline"/>
-          <w:rtl w:val="0"/>
-        </w:rPr>
-        <w:t xml:space="preserve">[Students, please put here whatever sources you referred or used in here]</w:t>
-      </w:r>
-    </w:p>
-    <w:p>
-      <w:pPr>
-        <w:rPr>
-          <w:rFonts w:ascii="Times New Roman" w:cs="Times New Roman" w:eastAsia="Times New Roman" w:hAnsi="Times New Roman"/>
-          <w:i w:val="1"/>
-          <w:iCs w:val="1"/>
-          <w:sz w:val="30"/>
-          <w:szCs w:val="30"/>
-        </w:rPr>
-      </w:pPr>
-      <w:r>
-        <w:br w:type="page"/>
-      </w:r>
-      <w:r>
-        <w:rPr>
-          <w:rtl w:val="0"/>
-        </w:rPr>
-      </w:r>
-    </w:p>
-    <w:p>
-      <w:pPr>
-        <w:spacing w:after="120" w:line="240" w:lineRule="auto"/>
-        <w:jc w:val="both"/>
-        <w:rPr>
-          <w:rFonts w:ascii="Times New Roman" w:cs="Times New Roman" w:eastAsia="Times New Roman" w:hAnsi="Times New Roman"/>
-          <w:sz w:val="30"/>
-          <w:szCs w:val="30"/>
-        </w:rPr>
-      </w:pPr>
-      <w:r>
-        <w:rPr>
-          <w:rFonts w:ascii="Times New Roman" w:cs="Times New Roman" w:eastAsia="Times New Roman" w:hAnsi="Times New Roman"/>
-          <w:sz w:val="30"/>
-          <w:szCs w:val="30"/>
-          <w:rtl w:val="0"/>
-        </w:rPr>
-        <w:t xml:space="preserve">APPENDIX A: CLASS DESCRIPTION</w:t>
+          <w:rtl w:val="0"/>
+        </w:rPr>
+        <w:t xml:space="preserve">Programming with Mosh. (2019, July 15). Java full course for beginners. </w:t>
+      </w:r>
+      <w:hyperlink r:id="rId8">
+        <w:r>
+          <w:rPr>
+            <w:rFonts w:ascii="Times New Roman" w:cs="Times New Roman" w:eastAsia="Times New Roman" w:hAnsi="Times New Roman"/>
+            <w:color w:val="0000ee"/>
+            <w:sz w:val="30"/>
+            <w:szCs w:val="30"/>
+            <w:u w:val="single"/>
+            <w:rtl w:val="0"/>
+          </w:rPr>
+          <w:t xml:space="preserve">Java Full Course for Beginners</w:t>
+        </w:r>
+      </w:hyperlink>
+      <w:r>
+        <w:rPr>
+          <w:rtl w:val="0"/>
+        </w:rPr>
       </w:r>
     </w:p>
     <w:p>
@@ -17335,9 +16091,10 @@
         </w:pBdr>
         <w:shd w:fill="auto" w:val="clear"/>
         <w:spacing w:after="0" w:before="0" w:line="240" w:lineRule="auto"/>
-        <w:ind w:left="1440" w:right="0" w:hanging="360"/>
+        <w:ind w:left="720" w:right="0" w:hanging="360"/>
         <w:jc w:val="both"/>
         <w:rPr>
+          <w:rFonts w:ascii="Times New Roman" w:cs="Times New Roman" w:eastAsia="Times New Roman" w:hAnsi="Times New Roman"/>
           <w:b w:val="0"/>
           <w:bCs w:val="0"/>
           <w:i w:val="0"/>
@@ -17355,21 +16112,34 @@
       <w:r>
         <w:rPr>
           <w:rFonts w:ascii="Times New Roman" w:cs="Times New Roman" w:eastAsia="Times New Roman" w:hAnsi="Times New Roman"/>
-          <w:b w:val="0"/>
-          <w:bCs w:val="0"/>
-          <w:i w:val="0"/>
-          <w:iCs w:val="0"/>
-          <w:smallCaps w:val="0"/>
-          <w:strike w:val="0"/>
-          <w:color w:val="000000"/>
           <w:sz w:val="30"/>
           <w:szCs w:val="30"/>
-          <w:u w:val="none"/>
-          <w:shd w:fill="auto" w:val="clear"/>
-          <w:vertAlign w:val="baseline"/>
-          <w:rtl w:val="0"/>
-        </w:rPr>
-        <w:t xml:space="preserve">Class 1 : Grade…. (Source: Src/Grade.java)</w:t>
+          <w:rtl w:val="0"/>
+        </w:rPr>
+        <w:t xml:space="preserve">New Java introduction for minecraft modding (2023). (n.d.).</w:t>
+        <w:br w:type="textWrapping"/>
+      </w:r>
+      <w:hyperlink r:id="rId9">
+        <w:r>
+          <w:rPr>
+            <w:rFonts w:ascii="Times New Roman" w:cs="Times New Roman" w:eastAsia="Times New Roman" w:hAnsi="Times New Roman"/>
+            <w:color w:val="1155cc"/>
+            <w:sz w:val="30"/>
+            <w:szCs w:val="30"/>
+            <w:u w:val="single"/>
+            <w:rtl w:val="0"/>
+          </w:rPr>
+          <w:t xml:space="preserve">New Java Introduction for Minecraft Modding (2023) - YouTube</w:t>
+        </w:r>
+      </w:hyperlink>
+      <w:r>
+        <w:rPr>
+          <w:rFonts w:ascii="Times New Roman" w:cs="Times New Roman" w:eastAsia="Times New Roman" w:hAnsi="Times New Roman"/>
+          <w:sz w:val="30"/>
+          <w:szCs w:val="30"/>
+          <w:rtl w:val="0"/>
+        </w:rPr>
+        <w:t xml:space="preserve"> </w:t>
       </w:r>
     </w:p>
     <w:p>
@@ -17390,10 +16160,374 @@
           <w:between w:space="0" w:sz="0" w:val="nil"/>
         </w:pBdr>
         <w:shd w:fill="auto" w:val="clear"/>
-        <w:spacing w:after="120" w:before="0" w:line="240" w:lineRule="auto"/>
-        <w:ind w:left="1440" w:right="0" w:hanging="360"/>
+        <w:spacing w:after="0" w:before="0" w:line="240" w:lineRule="auto"/>
+        <w:ind w:left="720" w:right="0" w:hanging="360"/>
         <w:jc w:val="both"/>
         <w:rPr>
+          <w:rFonts w:ascii="Times New Roman" w:cs="Times New Roman" w:eastAsia="Times New Roman" w:hAnsi="Times New Roman"/>
+          <w:sz w:val="30"/>
+          <w:szCs w:val="30"/>
+          <w:u w:val="none"/>
+        </w:rPr>
+      </w:pPr>
+      <w:r>
+        <w:rPr>
+          <w:rFonts w:ascii="Times New Roman" w:cs="Times New Roman" w:eastAsia="Times New Roman" w:hAnsi="Times New Roman"/>
+          <w:sz w:val="30"/>
+          <w:szCs w:val="30"/>
+          <w:rtl w:val="0"/>
+        </w:rPr>
+        <w:t xml:space="preserve">ChaosMC. (2026, March 8). How to make minecraft mods in 2026! </w:t>
+      </w:r>
+      <w:hyperlink r:id="rId10">
+        <w:r>
+          <w:rPr>
+            <w:rFonts w:ascii="Times New Roman" w:cs="Times New Roman" w:eastAsia="Times New Roman" w:hAnsi="Times New Roman"/>
+            <w:color w:val="0000ee"/>
+            <w:sz w:val="30"/>
+            <w:szCs w:val="30"/>
+            <w:u w:val="single"/>
+            <w:rtl w:val="0"/>
+          </w:rPr>
+          <w:t xml:space="preserve">How to make minecraft mods in 2026!</w:t>
+        </w:r>
+      </w:hyperlink>
+      <w:r>
+        <w:rPr>
+          <w:rtl w:val="0"/>
+        </w:rPr>
+      </w:r>
+    </w:p>
+    <w:p>
+      <w:pPr>
+        <w:keepNext w:val="0"/>
+        <w:keepLines w:val="0"/>
+        <w:pageBreakBefore w:val="0"/>
+        <w:widowControl w:val="1"/>
+        <w:numPr>
+          <w:ilvl w:val="0"/>
+          <w:numId w:val="13"/>
+        </w:numPr>
+        <w:pBdr>
+          <w:top w:space="0" w:sz="0" w:val="nil"/>
+          <w:left w:space="0" w:sz="0" w:val="nil"/>
+          <w:bottom w:space="0" w:sz="0" w:val="nil"/>
+          <w:right w:space="0" w:sz="0" w:val="nil"/>
+          <w:between w:space="0" w:sz="0" w:val="nil"/>
+        </w:pBdr>
+        <w:shd w:fill="auto" w:val="clear"/>
+        <w:spacing w:after="0" w:before="0" w:line="240" w:lineRule="auto"/>
+        <w:ind w:left="720" w:right="0" w:hanging="360"/>
+        <w:jc w:val="both"/>
+        <w:rPr>
+          <w:rFonts w:ascii="Times New Roman" w:cs="Times New Roman" w:eastAsia="Times New Roman" w:hAnsi="Times New Roman"/>
+          <w:sz w:val="30"/>
+          <w:szCs w:val="30"/>
+          <w:u w:val="none"/>
+        </w:rPr>
+      </w:pPr>
+      <w:r>
+        <w:rPr>
+          <w:rFonts w:ascii="Times New Roman" w:cs="Times New Roman" w:eastAsia="Times New Roman" w:hAnsi="Times New Roman"/>
+          <w:sz w:val="30"/>
+          <w:szCs w:val="30"/>
+          <w:rtl w:val="0"/>
+        </w:rPr>
+        <w:t xml:space="preserve">ChaosMC. (2026, June 24). All the Java you need for Minecraft Modding. </w:t>
+      </w:r>
+      <w:hyperlink r:id="rId11">
+        <w:r>
+          <w:rPr>
+            <w:rFonts w:ascii="Times New Roman" w:cs="Times New Roman" w:eastAsia="Times New Roman" w:hAnsi="Times New Roman"/>
+            <w:color w:val="0000ee"/>
+            <w:sz w:val="30"/>
+            <w:szCs w:val="30"/>
+            <w:u w:val="single"/>
+            <w:rtl w:val="0"/>
+          </w:rPr>
+          <w:t xml:space="preserve">All the Java you need for Minecraft Modding</w:t>
+        </w:r>
+      </w:hyperlink>
+      <w:r>
+        <w:rPr>
+          <w:rtl w:val="0"/>
+        </w:rPr>
+      </w:r>
+    </w:p>
+    <w:p>
+      <w:pPr>
+        <w:keepNext w:val="0"/>
+        <w:keepLines w:val="0"/>
+        <w:pageBreakBefore w:val="0"/>
+        <w:widowControl w:val="1"/>
+        <w:numPr>
+          <w:ilvl w:val="0"/>
+          <w:numId w:val="13"/>
+        </w:numPr>
+        <w:pBdr>
+          <w:top w:space="0" w:sz="0" w:val="nil"/>
+          <w:left w:space="0" w:sz="0" w:val="nil"/>
+          <w:bottom w:space="0" w:sz="0" w:val="nil"/>
+          <w:right w:space="0" w:sz="0" w:val="nil"/>
+          <w:between w:space="0" w:sz="0" w:val="nil"/>
+        </w:pBdr>
+        <w:shd w:fill="auto" w:val="clear"/>
+        <w:spacing w:after="0" w:before="0" w:line="240" w:lineRule="auto"/>
+        <w:ind w:left="720" w:right="0" w:hanging="360"/>
+        <w:jc w:val="both"/>
+        <w:rPr>
+          <w:rFonts w:ascii="Times New Roman" w:cs="Times New Roman" w:eastAsia="Times New Roman" w:hAnsi="Times New Roman"/>
+          <w:sz w:val="30"/>
+          <w:szCs w:val="30"/>
+          <w:u w:val="none"/>
+        </w:rPr>
+      </w:pPr>
+      <w:r>
+        <w:rPr>
+          <w:rFonts w:ascii="Times New Roman" w:cs="Times New Roman" w:eastAsia="Times New Roman" w:hAnsi="Times New Roman"/>
+          <w:sz w:val="30"/>
+          <w:szCs w:val="30"/>
+          <w:rtl w:val="0"/>
+        </w:rPr>
+        <w:t xml:space="preserve">Quackleb. (2025, May 25). 5 Minecraft Datapack Tips you NEED to know! </w:t>
+      </w:r>
+      <w:hyperlink r:id="rId12">
+        <w:r>
+          <w:rPr>
+            <w:rFonts w:ascii="Times New Roman" w:cs="Times New Roman" w:eastAsia="Times New Roman" w:hAnsi="Times New Roman"/>
+            <w:color w:val="0000ee"/>
+            <w:sz w:val="30"/>
+            <w:szCs w:val="30"/>
+            <w:u w:val="single"/>
+            <w:rtl w:val="0"/>
+          </w:rPr>
+          <w:t xml:space="preserve">5 Minecraft Datapack Tips you NEED to know!</w:t>
+        </w:r>
+      </w:hyperlink>
+      <w:r>
+        <w:rPr>
+          <w:rtl w:val="0"/>
+        </w:rPr>
+      </w:r>
+    </w:p>
+    <w:p>
+      <w:pPr>
+        <w:keepNext w:val="0"/>
+        <w:keepLines w:val="0"/>
+        <w:pageBreakBefore w:val="0"/>
+        <w:widowControl w:val="1"/>
+        <w:numPr>
+          <w:ilvl w:val="0"/>
+          <w:numId w:val="13"/>
+        </w:numPr>
+        <w:pBdr>
+          <w:top w:space="0" w:sz="0" w:val="nil"/>
+          <w:left w:space="0" w:sz="0" w:val="nil"/>
+          <w:bottom w:space="0" w:sz="0" w:val="nil"/>
+          <w:right w:space="0" w:sz="0" w:val="nil"/>
+          <w:between w:space="0" w:sz="0" w:val="nil"/>
+        </w:pBdr>
+        <w:shd w:fill="auto" w:val="clear"/>
+        <w:spacing w:after="0" w:before="0" w:line="240" w:lineRule="auto"/>
+        <w:ind w:left="720" w:right="0" w:hanging="360"/>
+        <w:jc w:val="both"/>
+        <w:rPr>
+          <w:rFonts w:ascii="Times New Roman" w:cs="Times New Roman" w:eastAsia="Times New Roman" w:hAnsi="Times New Roman"/>
+          <w:sz w:val="30"/>
+          <w:szCs w:val="30"/>
+          <w:u w:val="none"/>
+        </w:rPr>
+      </w:pPr>
+      <w:r>
+        <w:rPr>
+          <w:rFonts w:ascii="Times New Roman" w:cs="Times New Roman" w:eastAsia="Times New Roman" w:hAnsi="Times New Roman"/>
+          <w:sz w:val="30"/>
+          <w:szCs w:val="30"/>
+          <w:rtl w:val="0"/>
+        </w:rPr>
+        <w:t xml:space="preserve">Colebot. (2025, May 17). Beginner to Advanced Dimensions &amp; Terrain  Gen - Minecraft  Datapack Tutorial.</w:t>
+        <w:br w:type="textWrapping"/>
+      </w:r>
+      <w:hyperlink r:id="rId13">
+        <w:r>
+          <w:rPr>
+            <w:rFonts w:ascii="Times New Roman" w:cs="Times New Roman" w:eastAsia="Times New Roman" w:hAnsi="Times New Roman"/>
+            <w:color w:val="0000ee"/>
+            <w:sz w:val="30"/>
+            <w:szCs w:val="30"/>
+            <w:u w:val="single"/>
+            <w:rtl w:val="0"/>
+          </w:rPr>
+          <w:t xml:space="preserve">Beginner to Advanced Dimensions &amp; Terrain Gen - Minecraft Datapack Tutorial</w:t>
+        </w:r>
+      </w:hyperlink>
+      <w:r>
+        <w:rPr>
+          <w:rtl w:val="0"/>
+        </w:rPr>
+      </w:r>
+    </w:p>
+    <w:p>
+      <w:pPr>
+        <w:keepNext w:val="0"/>
+        <w:keepLines w:val="0"/>
+        <w:pageBreakBefore w:val="0"/>
+        <w:widowControl w:val="1"/>
+        <w:numPr>
+          <w:ilvl w:val="0"/>
+          <w:numId w:val="13"/>
+        </w:numPr>
+        <w:pBdr>
+          <w:top w:space="0" w:sz="0" w:val="nil"/>
+          <w:left w:space="0" w:sz="0" w:val="nil"/>
+          <w:bottom w:space="0" w:sz="0" w:val="nil"/>
+          <w:right w:space="0" w:sz="0" w:val="nil"/>
+          <w:between w:space="0" w:sz="0" w:val="nil"/>
+        </w:pBdr>
+        <w:shd w:fill="auto" w:val="clear"/>
+        <w:spacing w:after="0" w:before="0" w:line="240" w:lineRule="auto"/>
+        <w:ind w:left="720" w:right="0" w:hanging="360"/>
+        <w:jc w:val="both"/>
+        <w:rPr>
+          <w:rFonts w:ascii="Times New Roman" w:cs="Times New Roman" w:eastAsia="Times New Roman" w:hAnsi="Times New Roman"/>
+          <w:sz w:val="30"/>
+          <w:szCs w:val="30"/>
+          <w:u w:val="none"/>
+        </w:rPr>
+      </w:pPr>
+      <w:r>
+        <w:rPr>
+          <w:rFonts w:ascii="Times New Roman" w:cs="Times New Roman" w:eastAsia="Times New Roman" w:hAnsi="Times New Roman"/>
+          <w:sz w:val="30"/>
+          <w:szCs w:val="30"/>
+          <w:rtl w:val="0"/>
+        </w:rPr>
+        <w:t xml:space="preserve">Minecraft Wiki. (2026, Sep 15). Tutorial:Adding a new dimension.</w:t>
+        <w:br w:type="textWrapping"/>
+      </w:r>
+      <w:hyperlink r:id="rId14">
+        <w:r>
+          <w:rPr>
+            <w:rFonts w:ascii="Times New Roman" w:cs="Times New Roman" w:eastAsia="Times New Roman" w:hAnsi="Times New Roman"/>
+            <w:color w:val="1155cc"/>
+            <w:sz w:val="30"/>
+            <w:szCs w:val="30"/>
+            <w:u w:val="single"/>
+            <w:rtl w:val="0"/>
+          </w:rPr>
+          <w:t xml:space="preserve">Tutorial:Adding a new dimension – Minecraft Wiki</w:t>
+        </w:r>
+      </w:hyperlink>
+      <w:r>
+        <w:rPr>
+          <w:rtl w:val="0"/>
+        </w:rPr>
+      </w:r>
+    </w:p>
+    <w:p>
+      <w:pPr>
+        <w:keepNext w:val="0"/>
+        <w:keepLines w:val="0"/>
+        <w:pageBreakBefore w:val="0"/>
+        <w:widowControl w:val="1"/>
+        <w:numPr>
+          <w:ilvl w:val="0"/>
+          <w:numId w:val="13"/>
+        </w:numPr>
+        <w:pBdr>
+          <w:top w:space="0" w:sz="0" w:val="nil"/>
+          <w:left w:space="0" w:sz="0" w:val="nil"/>
+          <w:bottom w:space="0" w:sz="0" w:val="nil"/>
+          <w:right w:space="0" w:sz="0" w:val="nil"/>
+          <w:between w:space="0" w:sz="0" w:val="nil"/>
+        </w:pBdr>
+        <w:shd w:fill="auto" w:val="clear"/>
+        <w:spacing w:after="0" w:before="0" w:line="240" w:lineRule="auto"/>
+        <w:ind w:left="720" w:right="0" w:hanging="360"/>
+        <w:jc w:val="both"/>
+        <w:rPr>
+          <w:rFonts w:ascii="Times New Roman" w:cs="Times New Roman" w:eastAsia="Times New Roman" w:hAnsi="Times New Roman"/>
+          <w:sz w:val="30"/>
+          <w:szCs w:val="30"/>
+        </w:rPr>
+      </w:pPr>
+      <w:r>
+        <w:rPr>
+          <w:rFonts w:ascii="Times New Roman" w:cs="Times New Roman" w:eastAsia="Times New Roman" w:hAnsi="Times New Roman"/>
+          <w:sz w:val="30"/>
+          <w:szCs w:val="30"/>
+          <w:rtl w:val="0"/>
+        </w:rPr>
+        <w:t xml:space="preserve">Fabric Wiki. (2026, Sep 03). Fabric Modding Tutorials.</w:t>
+        <w:br w:type="textWrapping"/>
+      </w:r>
+      <w:hyperlink r:id="rId15">
+        <w:r>
+          <w:rPr>
+            <w:rFonts w:ascii="Times New Roman" w:cs="Times New Roman" w:eastAsia="Times New Roman" w:hAnsi="Times New Roman"/>
+            <w:color w:val="1155cc"/>
+            <w:sz w:val="30"/>
+            <w:szCs w:val="30"/>
+            <w:u w:val="single"/>
+            <w:rtl w:val="0"/>
+          </w:rPr>
+          <w:t xml:space="preserve">Fabric Modding Tutorials</w:t>
+        </w:r>
+      </w:hyperlink>
+      <w:r>
+        <w:rPr>
+          <w:rtl w:val="0"/>
+        </w:rPr>
+      </w:r>
+    </w:p>
+    <w:p>
+      <w:pPr>
+        <w:keepNext w:val="0"/>
+        <w:keepLines w:val="0"/>
+        <w:pageBreakBefore w:val="0"/>
+        <w:widowControl w:val="1"/>
+        <w:pBdr>
+          <w:top w:space="0" w:sz="0" w:val="nil"/>
+          <w:left w:space="0" w:sz="0" w:val="nil"/>
+          <w:bottom w:space="0" w:sz="0" w:val="nil"/>
+          <w:right w:space="0" w:sz="0" w:val="nil"/>
+          <w:between w:space="0" w:sz="0" w:val="nil"/>
+        </w:pBdr>
+        <w:shd w:fill="auto" w:val="clear"/>
+        <w:spacing w:after="0" w:before="0" w:line="240" w:lineRule="auto"/>
+        <w:ind w:left="720" w:right="0" w:firstLine="0"/>
+        <w:jc w:val="both"/>
+        <w:rPr>
+          <w:rFonts w:ascii="Times New Roman" w:cs="Times New Roman" w:eastAsia="Times New Roman" w:hAnsi="Times New Roman"/>
+          <w:sz w:val="30"/>
+          <w:szCs w:val="30"/>
+        </w:rPr>
+      </w:pPr>
+      <w:r>
+        <w:rPr>
+          <w:rtl w:val="0"/>
+        </w:rPr>
+      </w:r>
+    </w:p>
+    <w:p>
+      <w:pPr>
+        <w:keepNext w:val="0"/>
+        <w:keepLines w:val="0"/>
+        <w:pageBreakBefore w:val="0"/>
+        <w:widowControl w:val="1"/>
+        <w:pBdr>
+          <w:top w:space="0" w:sz="0" w:val="nil"/>
+          <w:left w:space="0" w:sz="0" w:val="nil"/>
+          <w:bottom w:space="0" w:sz="0" w:val="nil"/>
+          <w:right w:space="0" w:sz="0" w:val="nil"/>
+          <w:between w:space="0" w:sz="0" w:val="nil"/>
+        </w:pBdr>
+        <w:shd w:fill="auto" w:val="clear"/>
+        <w:spacing w:after="0" w:before="0" w:line="240" w:lineRule="auto"/>
+        <w:ind w:left="720" w:right="0" w:firstLine="0"/>
+        <w:jc w:val="both"/>
+        <w:rPr>
+          <w:rFonts w:ascii="Times New Roman" w:cs="Times New Roman" w:eastAsia="Times New Roman" w:hAnsi="Times New Roman"/>
           <w:b w:val="0"/>
           <w:bCs w:val="0"/>
           <w:i w:val="0"/>
@@ -17414,9 +16548,238 @@
         </w:rPr>
       </w:r>
     </w:p>
+    <w:p>
+      <w:pPr>
+        <w:keepNext w:val="0"/>
+        <w:keepLines w:val="0"/>
+        <w:pageBreakBefore w:val="0"/>
+        <w:widowControl w:val="1"/>
+        <w:pBdr>
+          <w:top w:space="0" w:sz="0" w:val="nil"/>
+          <w:left w:space="0" w:sz="0" w:val="nil"/>
+          <w:bottom w:space="0" w:sz="0" w:val="nil"/>
+          <w:right w:space="0" w:sz="0" w:val="nil"/>
+          <w:between w:space="0" w:sz="0" w:val="nil"/>
+        </w:pBdr>
+        <w:shd w:fill="auto" w:val="clear"/>
+        <w:spacing w:after="0" w:before="0" w:line="240" w:lineRule="auto"/>
+        <w:ind w:left="720" w:right="0" w:firstLine="0"/>
+        <w:jc w:val="both"/>
+        <w:rPr>
+          <w:rFonts w:ascii="Times New Roman" w:cs="Times New Roman" w:eastAsia="Times New Roman" w:hAnsi="Times New Roman"/>
+          <w:b w:val="0"/>
+          <w:bCs w:val="0"/>
+          <w:i w:val="0"/>
+          <w:iCs w:val="0"/>
+          <w:smallCaps w:val="0"/>
+          <w:strike w:val="0"/>
+          <w:color w:val="000000"/>
+          <w:sz w:val="30"/>
+          <w:szCs w:val="30"/>
+          <w:u w:val="none"/>
+          <w:shd w:fill="auto" w:val="clear"/>
+          <w:vertAlign w:val="baseline"/>
+        </w:rPr>
+      </w:pPr>
+      <w:r>
+        <w:rPr>
+          <w:rtl w:val="0"/>
+        </w:rPr>
+      </w:r>
+    </w:p>
+    <w:p>
+      <w:pPr>
+        <w:keepNext w:val="0"/>
+        <w:keepLines w:val="0"/>
+        <w:pageBreakBefore w:val="0"/>
+        <w:widowControl w:val="1"/>
+        <w:pBdr>
+          <w:top w:space="0" w:sz="0" w:val="nil"/>
+          <w:left w:space="0" w:sz="0" w:val="nil"/>
+          <w:bottom w:space="0" w:sz="0" w:val="nil"/>
+          <w:right w:space="0" w:sz="0" w:val="nil"/>
+          <w:between w:space="0" w:sz="0" w:val="nil"/>
+        </w:pBdr>
+        <w:shd w:fill="auto" w:val="clear"/>
+        <w:spacing w:after="120" w:before="0" w:line="240" w:lineRule="auto"/>
+        <w:ind w:left="720" w:right="0" w:firstLine="0"/>
+        <w:jc w:val="both"/>
+        <w:rPr>
+          <w:rFonts w:ascii="Times New Roman" w:cs="Times New Roman" w:eastAsia="Times New Roman" w:hAnsi="Times New Roman"/>
+          <w:b w:val="0"/>
+          <w:bCs w:val="0"/>
+          <w:i w:val="1"/>
+          <w:iCs w:val="1"/>
+          <w:smallCaps w:val="0"/>
+          <w:strike w:val="0"/>
+          <w:color w:val="000000"/>
+          <w:sz w:val="30"/>
+          <w:szCs w:val="30"/>
+          <w:u w:val="none"/>
+          <w:shd w:fill="auto" w:val="clear"/>
+          <w:vertAlign w:val="baseline"/>
+        </w:rPr>
+      </w:pPr>
+      <w:r>
+        <w:rPr>
+          <w:rFonts w:ascii="Times New Roman" w:cs="Times New Roman" w:eastAsia="Times New Roman" w:hAnsi="Times New Roman"/>
+          <w:b w:val="0"/>
+          <w:bCs w:val="0"/>
+          <w:i w:val="1"/>
+          <w:iCs w:val="1"/>
+          <w:smallCaps w:val="0"/>
+          <w:strike w:val="0"/>
+          <w:color w:val="000000"/>
+          <w:sz w:val="30"/>
+          <w:szCs w:val="30"/>
+          <w:u w:val="none"/>
+          <w:shd w:fill="auto" w:val="clear"/>
+          <w:vertAlign w:val="baseline"/>
+          <w:rtl w:val="0"/>
+        </w:rPr>
+        <w:t xml:space="preserve">[Students, please put here whatever sources you referred or used in here]</w:t>
+      </w:r>
+    </w:p>
+    <w:p>
+      <w:pPr>
+        <w:rPr>
+          <w:rFonts w:ascii="Times New Roman" w:cs="Times New Roman" w:eastAsia="Times New Roman" w:hAnsi="Times New Roman"/>
+          <w:i w:val="1"/>
+          <w:iCs w:val="1"/>
+          <w:sz w:val="30"/>
+          <w:szCs w:val="30"/>
+        </w:rPr>
+      </w:pPr>
+      <w:r>
+        <w:br w:type="page"/>
+      </w:r>
+      <w:r>
+        <w:rPr>
+          <w:rtl w:val="0"/>
+        </w:rPr>
+      </w:r>
+    </w:p>
+    <w:p>
+      <w:pPr>
+        <w:spacing w:after="120" w:line="240" w:lineRule="auto"/>
+        <w:jc w:val="both"/>
+        <w:rPr>
+          <w:rFonts w:ascii="Times New Roman" w:cs="Times New Roman" w:eastAsia="Times New Roman" w:hAnsi="Times New Roman"/>
+          <w:sz w:val="30"/>
+          <w:szCs w:val="30"/>
+        </w:rPr>
+      </w:pPr>
+      <w:r>
+        <w:rPr>
+          <w:rFonts w:ascii="Times New Roman" w:cs="Times New Roman" w:eastAsia="Times New Roman" w:hAnsi="Times New Roman"/>
+          <w:sz w:val="30"/>
+          <w:szCs w:val="30"/>
+          <w:rtl w:val="0"/>
+        </w:rPr>
+        <w:t xml:space="preserve">APPENDIX A: CLASS DESCRIPTION</w:t>
+      </w:r>
+    </w:p>
+    <w:p>
+      <w:pPr>
+        <w:keepNext w:val="0"/>
+        <w:keepLines w:val="0"/>
+        <w:pageBreakBefore w:val="0"/>
+        <w:widowControl w:val="1"/>
+        <w:numPr>
+          <w:ilvl w:val="0"/>
+          <w:numId w:val="12"/>
+        </w:numPr>
+        <w:pBdr>
+          <w:top w:space="0" w:sz="0" w:val="nil"/>
+          <w:left w:space="0" w:sz="0" w:val="nil"/>
+          <w:bottom w:space="0" w:sz="0" w:val="nil"/>
+          <w:right w:space="0" w:sz="0" w:val="nil"/>
+          <w:between w:space="0" w:sz="0" w:val="nil"/>
+        </w:pBdr>
+        <w:shd w:fill="auto" w:val="clear"/>
+        <w:spacing w:after="0" w:before="0" w:line="240" w:lineRule="auto"/>
+        <w:ind w:left="1440" w:right="0" w:hanging="360"/>
+        <w:jc w:val="both"/>
+        <w:rPr>
+          <w:b w:val="0"/>
+          <w:bCs w:val="0"/>
+          <w:i w:val="0"/>
+          <w:iCs w:val="0"/>
+          <w:smallCaps w:val="0"/>
+          <w:strike w:val="0"/>
+          <w:color w:val="000000"/>
+          <w:sz w:val="30"/>
+          <w:szCs w:val="30"/>
+          <w:u w:val="none"/>
+          <w:shd w:fill="auto" w:val="clear"/>
+          <w:vertAlign w:val="baseline"/>
+        </w:rPr>
+      </w:pPr>
+      <w:r>
+        <w:rPr>
+          <w:rFonts w:ascii="Times New Roman" w:cs="Times New Roman" w:eastAsia="Times New Roman" w:hAnsi="Times New Roman"/>
+          <w:b w:val="0"/>
+          <w:bCs w:val="0"/>
+          <w:i w:val="0"/>
+          <w:iCs w:val="0"/>
+          <w:smallCaps w:val="0"/>
+          <w:strike w:val="0"/>
+          <w:color w:val="000000"/>
+          <w:sz w:val="30"/>
+          <w:szCs w:val="30"/>
+          <w:u w:val="none"/>
+          <w:shd w:fill="auto" w:val="clear"/>
+          <w:vertAlign w:val="baseline"/>
+          <w:rtl w:val="0"/>
+        </w:rPr>
+        <w:t xml:space="preserve">Class 1 : Grade…. (Source: Src/Grade.java)</w:t>
+      </w:r>
+    </w:p>
+    <w:p>
+      <w:pPr>
+        <w:keepNext w:val="0"/>
+        <w:keepLines w:val="0"/>
+        <w:pageBreakBefore w:val="0"/>
+        <w:widowControl w:val="1"/>
+        <w:numPr>
+          <w:ilvl w:val="0"/>
+          <w:numId w:val="12"/>
+        </w:numPr>
+        <w:pBdr>
+          <w:top w:space="0" w:sz="0" w:val="nil"/>
+          <w:left w:space="0" w:sz="0" w:val="nil"/>
+          <w:bottom w:space="0" w:sz="0" w:val="nil"/>
+          <w:right w:space="0" w:sz="0" w:val="nil"/>
+          <w:between w:space="0" w:sz="0" w:val="nil"/>
+        </w:pBdr>
+        <w:shd w:fill="auto" w:val="clear"/>
+        <w:spacing w:after="120" w:before="0" w:line="240" w:lineRule="auto"/>
+        <w:ind w:left="1440" w:right="0" w:hanging="360"/>
+        <w:jc w:val="both"/>
+        <w:rPr>
+          <w:b w:val="0"/>
+          <w:bCs w:val="0"/>
+          <w:i w:val="0"/>
+          <w:iCs w:val="0"/>
+          <w:smallCaps w:val="0"/>
+          <w:strike w:val="0"/>
+          <w:color w:val="000000"/>
+          <w:sz w:val="30"/>
+          <w:szCs w:val="30"/>
+          <w:u w:val="none"/>
+          <w:shd w:fill="auto" w:val="clear"/>
+          <w:vertAlign w:val="baseline"/>
+        </w:rPr>
+      </w:pPr>
+      <w:r>
+        <w:rPr>
+          <w:rtl w:val="0"/>
+        </w:rPr>
+      </w:r>
+    </w:p>
     <w:sectPr>
-      <w:headerReference r:id="rId8" w:type="default"/>
-      <w:footerReference r:id="rId9" w:type="default"/>
+      <w:headerReference r:id="rId16" w:type="default"/>
+      <w:footerReference r:id="rId17" w:type="default"/>
       <w:pgSz w:h="15840" w:w="12240" w:orient="portrait"/>
       <w:pgMar w:bottom="2340" w:top="1890" w:left="1440" w:right="1440" w:header="720" w:footer="720"/>
       <w:pgNumType w:start="1"/>
@@ -17589,7 +16952,7 @@
       <w:rPr>
         <w:rtl w:val="0"/>
       </w:rPr>
-      <w:t xml:space="preserve">Keaton  </w:t>
+      <w:t xml:space="preserve">Keaton (10422101) - Huy (104240154) - Toan (18717)</w:t>
     </w:r>
     <w:r>
       <w:rPr>
@@ -17609,6 +16972,37 @@
         <w:rtl w:val="0"/>
       </w:rPr>
       <w:t xml:space="preserve">&gt;</w:t>
+      <w:br w:type="textWrapping"/>
+      <w:t xml:space="preserve">GitHub repo: </w:t>
+    </w:r>
+    <w:hyperlink r:id="rId1">
+      <w:r>
+        <w:rPr>
+          <w:color w:val="1155cc"/>
+          <w:u w:val="single"/>
+          <w:rtl w:val="0"/>
+        </w:rPr>
+        <w:t xml:space="preserve">VacTon/Abyss-Dimension-Mod: Minecraft new dimension mod for Java-OOP Project with MVC Requirements</w:t>
+      </w:r>
+    </w:hyperlink>
+    <w:r>
+      <w:rPr>
+        <w:rFonts w:ascii="Calibri" w:cs="Calibri" w:eastAsia="Calibri" w:hAnsi="Calibri"/>
+        <w:b w:val="0"/>
+        <w:bCs w:val="0"/>
+        <w:i w:val="0"/>
+        <w:iCs w:val="0"/>
+        <w:smallCaps w:val="0"/>
+        <w:strike w:val="0"/>
+        <w:color w:val="000000"/>
+        <w:sz w:val="22"/>
+        <w:szCs w:val="22"/>
+        <w:u w:val="none"/>
+        <w:shd w:fill="auto" w:val="clear"/>
+        <w:vertAlign w:val="baseline"/>
+        <w:rtl w:val="0"/>
+      </w:rPr>
+      <w:br w:type="textWrapping"/>
       <w:tab/>
     </w:r>
     <w:r>
@@ -18981,7 +18375,7 @@
       <w:lvlText w:val="-"/>
       <w:lvlJc w:val="left"/>
       <w:pPr>
-        <w:ind w:left="900" w:hanging="360"/>
+        <w:ind w:left="1440" w:hanging="360"/>
       </w:pPr>
       <w:rPr>
         <w:rFonts w:ascii="Times New Roman" w:cs="Times New Roman" w:eastAsia="Times New Roman" w:hAnsi="Times New Roman"/>
@@ -18993,7 +18387,7 @@
       <w:lvlText w:val="o"/>
       <w:lvlJc w:val="left"/>
       <w:pPr>
-        <w:ind w:left="1620" w:hanging="360"/>
+        <w:ind w:left="1980" w:hanging="360"/>
       </w:pPr>
       <w:rPr>
         <w:rFonts w:ascii="Courier New" w:cs="Courier New" w:eastAsia="Courier New" w:hAnsi="Courier New"/>
@@ -19005,7 +18399,7 @@
       <w:lvlText w:val="▪"/>
       <w:lvlJc w:val="left"/>
       <w:pPr>
-        <w:ind w:left="2340" w:hanging="360"/>
+        <w:ind w:left="2700" w:hanging="360"/>
       </w:pPr>
       <w:rPr>
         <w:rFonts w:ascii="Noto Sans Symbols" w:cs="Noto Sans Symbols" w:eastAsia="Noto Sans Symbols" w:hAnsi="Noto Sans Symbols"/>
@@ -19017,7 +18411,7 @@
       <w:lvlText w:val="●"/>
       <w:lvlJc w:val="left"/>
       <w:pPr>
-        <w:ind w:left="3060" w:hanging="360"/>
+        <w:ind w:left="3420" w:hanging="360"/>
       </w:pPr>
       <w:rPr>
         <w:rFonts w:ascii="Noto Sans Symbols" w:cs="Noto Sans Symbols" w:eastAsia="Noto Sans Symbols" w:hAnsi="Noto Sans Symbols"/>
@@ -19029,7 +18423,7 @@
       <w:lvlText w:val="o"/>
       <w:lvlJc w:val="left"/>
       <w:pPr>
-        <w:ind w:left="3780" w:hanging="360"/>
+        <w:ind w:left="4140" w:hanging="360"/>
       </w:pPr>
       <w:rPr>
         <w:rFonts w:ascii="Courier New" w:cs="Courier New" w:eastAsia="Courier New" w:hAnsi="Courier New"/>
@@ -19041,7 +18435,7 @@
       <w:lvlText w:val="▪"/>
       <w:lvlJc w:val="left"/>
       <w:pPr>
-        <w:ind w:left="4500" w:hanging="360"/>
+        <w:ind w:left="4860" w:hanging="360"/>
       </w:pPr>
       <w:rPr>
         <w:rFonts w:ascii="Noto Sans Symbols" w:cs="Noto Sans Symbols" w:eastAsia="Noto Sans Symbols" w:hAnsi="Noto Sans Symbols"/>
@@ -19053,7 +18447,7 @@
       <w:lvlText w:val="●"/>
       <w:lvlJc w:val="left"/>
       <w:pPr>
-        <w:ind w:left="5220" w:hanging="360"/>
+        <w:ind w:left="5580" w:hanging="360"/>
       </w:pPr>
       <w:rPr>
         <w:rFonts w:ascii="Noto Sans Symbols" w:cs="Noto Sans Symbols" w:eastAsia="Noto Sans Symbols" w:hAnsi="Noto Sans Symbols"/>
@@ -19065,7 +18459,7 @@
       <w:lvlText w:val="o"/>
       <w:lvlJc w:val="left"/>
       <w:pPr>
-        <w:ind w:left="5940" w:hanging="360"/>
+        <w:ind w:left="6300" w:hanging="360"/>
       </w:pPr>
       <w:rPr>
         <w:rFonts w:ascii="Courier New" w:cs="Courier New" w:eastAsia="Courier New" w:hAnsi="Courier New"/>
@@ -19077,7 +18471,7 @@
       <w:lvlText w:val="▪"/>
       <w:lvlJc w:val="left"/>
       <w:pPr>
-        <w:ind w:left="6660" w:hanging="360"/>
+        <w:ind w:left="7020" w:hanging="360"/>
       </w:pPr>
       <w:rPr>
         <w:rFonts w:ascii="Noto Sans Symbols" w:cs="Noto Sans Symbols" w:eastAsia="Noto Sans Symbols" w:hAnsi="Noto Sans Symbols"/>
@@ -19087,111 +18481,93 @@
   <w:abstractNum w:abstractNumId="13">
     <w:lvl w:ilvl="0">
       <w:start w:val="1"/>
-      <w:numFmt w:val="bullet"/>
-      <w:lvlText w:val="-"/>
+      <w:numFmt w:val="decimal"/>
+      <w:lvlText w:val="%1."/>
       <w:lvlJc w:val="left"/>
       <w:pPr>
-        <w:ind w:left="1440" w:hanging="360"/>
-      </w:pPr>
-      <w:rPr>
-        <w:rFonts w:ascii="Times New Roman" w:cs="Times New Roman" w:eastAsia="Times New Roman" w:hAnsi="Times New Roman"/>
-      </w:rPr>
+        <w:ind w:left="720" w:hanging="360"/>
+      </w:pPr>
+      <w:rPr/>
     </w:lvl>
     <w:lvl w:ilvl="1">
       <w:start w:val="1"/>
-      <w:numFmt w:val="bullet"/>
-      <w:lvlText w:val="o"/>
+      <w:numFmt w:val="lowerLetter"/>
+      <w:lvlText w:val="%2."/>
       <w:lvlJc w:val="left"/>
       <w:pPr>
-        <w:ind w:left="1980" w:hanging="360"/>
-      </w:pPr>
-      <w:rPr>
-        <w:rFonts w:ascii="Courier New" w:cs="Courier New" w:eastAsia="Courier New" w:hAnsi="Courier New"/>
-      </w:rPr>
+        <w:ind w:left="1440" w:hanging="360"/>
+      </w:pPr>
+      <w:rPr/>
     </w:lvl>
     <w:lvl w:ilvl="2">
       <w:start w:val="1"/>
-      <w:numFmt w:val="bullet"/>
-      <w:lvlText w:val="▪"/>
-      <w:lvlJc w:val="left"/>
-      <w:pPr>
-        <w:ind w:left="2700" w:hanging="360"/>
-      </w:pPr>
-      <w:rPr>
-        <w:rFonts w:ascii="Noto Sans Symbols" w:cs="Noto Sans Symbols" w:eastAsia="Noto Sans Symbols" w:hAnsi="Noto Sans Symbols"/>
-      </w:rPr>
+      <w:numFmt w:val="lowerRoman"/>
+      <w:lvlText w:val="%3."/>
+      <w:lvlJc w:val="right"/>
+      <w:pPr>
+        <w:ind w:left="2160" w:hanging="180"/>
+      </w:pPr>
+      <w:rPr/>
     </w:lvl>
     <w:lvl w:ilvl="3">
       <w:start w:val="1"/>
-      <w:numFmt w:val="bullet"/>
-      <w:lvlText w:val="●"/>
+      <w:numFmt w:val="decimal"/>
+      <w:lvlText w:val="%4."/>
       <w:lvlJc w:val="left"/>
       <w:pPr>
-        <w:ind w:left="3420" w:hanging="360"/>
-      </w:pPr>
-      <w:rPr>
-        <w:rFonts w:ascii="Noto Sans Symbols" w:cs="Noto Sans Symbols" w:eastAsia="Noto Sans Symbols" w:hAnsi="Noto Sans Symbols"/>
-      </w:rPr>
+        <w:ind w:left="2880" w:hanging="360"/>
+      </w:pPr>
+      <w:rPr/>
     </w:lvl>
     <w:lvl w:ilvl="4">
       <w:start w:val="1"/>
-      <w:numFmt w:val="bullet"/>
-      <w:lvlText w:val="o"/>
+      <w:numFmt w:val="lowerLetter"/>
+      <w:lvlText w:val="%5."/>
       <w:lvlJc w:val="left"/>
       <w:pPr>
-        <w:ind w:left="4140" w:hanging="360"/>
-      </w:pPr>
-      <w:rPr>
-        <w:rFonts w:ascii="Courier New" w:cs="Courier New" w:eastAsia="Courier New" w:hAnsi="Courier New"/>
-      </w:rPr>
+        <w:ind w:left="3600" w:hanging="360"/>
+      </w:pPr>
+      <w:rPr/>
     </w:lvl>
     <w:lvl w:ilvl="5">
       <w:start w:val="1"/>
-      <w:numFmt w:val="bullet"/>
-      <w:lvlText w:val="▪"/>
-      <w:lvlJc w:val="left"/>
-      <w:pPr>
-        <w:ind w:left="4860" w:hanging="360"/>
-      </w:pPr>
-      <w:rPr>
-        <w:rFonts w:ascii="Noto Sans Symbols" w:cs="Noto Sans Symbols" w:eastAsia="Noto Sans Symbols" w:hAnsi="Noto Sans Symbols"/>
-      </w:rPr>
+      <w:numFmt w:val="lowerRoman"/>
+      <w:lvlText w:val="%6."/>
+      <w:lvlJc w:val="right"/>
+      <w:pPr>
+        <w:ind w:left="4320" w:hanging="180"/>
+      </w:pPr>
+      <w:rPr/>
     </w:lvl>
     <w:lvl w:ilvl="6">
       <w:start w:val="1"/>
-      <w:numFmt w:val="bullet"/>
-      <w:lvlText w:val="●"/>
+      <w:numFmt w:val="decimal"/>
+      <w:lvlText w:val="%7."/>
       <w:lvlJc w:val="left"/>
       <w:pPr>
-        <w:ind w:left="5580" w:hanging="360"/>
-      </w:pPr>
-      <w:rPr>
-        <w:rFonts w:ascii="Noto Sans Symbols" w:cs="Noto Sans Symbols" w:eastAsia="Noto Sans Symbols" w:hAnsi="Noto Sans Symbols"/>
-      </w:rPr>
+        <w:ind w:left="5040" w:hanging="360"/>
+      </w:pPr>
+      <w:rPr/>
     </w:lvl>
     <w:lvl w:ilvl="7">
       <w:start w:val="1"/>
-      <w:numFmt w:val="bullet"/>
-      <w:lvlText w:val="o"/>
+      <w:numFmt w:val="lowerLetter"/>
+      <w:lvlText w:val="%8."/>
       <w:lvlJc w:val="left"/>
       <w:pPr>
-        <w:ind w:left="6300" w:hanging="360"/>
-      </w:pPr>
-      <w:rPr>
-        <w:rFonts w:ascii="Courier New" w:cs="Courier New" w:eastAsia="Courier New" w:hAnsi="Courier New"/>
-      </w:rPr>
+        <w:ind w:left="5760" w:hanging="360"/>
+      </w:pPr>
+      <w:rPr/>
     </w:lvl>
     <w:lvl w:ilvl="8">
       <w:start w:val="1"/>
-      <w:numFmt w:val="bullet"/>
-      <w:lvlText w:val="▪"/>
-      <w:lvlJc w:val="left"/>
-      <w:pPr>
-        <w:ind w:left="7020" w:hanging="360"/>
-      </w:pPr>
-      <w:rPr>
-        <w:rFonts w:ascii="Noto Sans Symbols" w:cs="Noto Sans Symbols" w:eastAsia="Noto Sans Symbols" w:hAnsi="Noto Sans Symbols"/>
-      </w:rPr>
+      <w:numFmt w:val="lowerRoman"/>
+      <w:lvlText w:val="%9."/>
+      <w:lvlJc w:val="right"/>
+      <w:pPr>
+        <w:ind w:left="6480" w:hanging="180"/>
+      </w:pPr>
+      <w:rPr/>
     </w:lvl>
   </w:abstractNum>
   <w:abstractNum w:abstractNumId="14">
@@ -19201,98 +18577,6 @@
       <w:lvlText w:val="%1."/>
       <w:lvlJc w:val="left"/>
       <w:pPr>
-        <w:ind w:left="720" w:hanging="360"/>
-      </w:pPr>
-      <w:rPr/>
-    </w:lvl>
-    <w:lvl w:ilvl="1">
-      <w:start w:val="1"/>
-      <w:numFmt w:val="lowerLetter"/>
-      <w:lvlText w:val="%2."/>
-      <w:lvlJc w:val="left"/>
-      <w:pPr>
-        <w:ind w:left="1440" w:hanging="360"/>
-      </w:pPr>
-      <w:rPr/>
-    </w:lvl>
-    <w:lvl w:ilvl="2">
-      <w:start w:val="1"/>
-      <w:numFmt w:val="lowerRoman"/>
-      <w:lvlText w:val="%3."/>
-      <w:lvlJc w:val="right"/>
-      <w:pPr>
-        <w:ind w:left="2160" w:hanging="180"/>
-      </w:pPr>
-      <w:rPr/>
-    </w:lvl>
-    <w:lvl w:ilvl="3">
-      <w:start w:val="1"/>
-      <w:numFmt w:val="decimal"/>
-      <w:lvlText w:val="%4."/>
-      <w:lvlJc w:val="left"/>
-      <w:pPr>
-        <w:ind w:left="2880" w:hanging="360"/>
-      </w:pPr>
-      <w:rPr/>
-    </w:lvl>
-    <w:lvl w:ilvl="4">
-      <w:start w:val="1"/>
-      <w:numFmt w:val="lowerLetter"/>
-      <w:lvlText w:val="%5."/>
-      <w:lvlJc w:val="left"/>
-      <w:pPr>
-        <w:ind w:left="3600" w:hanging="360"/>
-      </w:pPr>
-      <w:rPr/>
-    </w:lvl>
-    <w:lvl w:ilvl="5">
-      <w:start w:val="1"/>
-      <w:numFmt w:val="lowerRoman"/>
-      <w:lvlText w:val="%6."/>
-      <w:lvlJc w:val="right"/>
-      <w:pPr>
-        <w:ind w:left="4320" w:hanging="180"/>
-      </w:pPr>
-      <w:rPr/>
-    </w:lvl>
-    <w:lvl w:ilvl="6">
-      <w:start w:val="1"/>
-      <w:numFmt w:val="decimal"/>
-      <w:lvlText w:val="%7."/>
-      <w:lvlJc w:val="left"/>
-      <w:pPr>
-        <w:ind w:left="5040" w:hanging="360"/>
-      </w:pPr>
-      <w:rPr/>
-    </w:lvl>
-    <w:lvl w:ilvl="7">
-      <w:start w:val="1"/>
-      <w:numFmt w:val="lowerLetter"/>
-      <w:lvlText w:val="%8."/>
-      <w:lvlJc w:val="left"/>
-      <w:pPr>
-        <w:ind w:left="5760" w:hanging="360"/>
-      </w:pPr>
-      <w:rPr/>
-    </w:lvl>
-    <w:lvl w:ilvl="8">
-      <w:start w:val="1"/>
-      <w:numFmt w:val="lowerRoman"/>
-      <w:lvlText w:val="%9."/>
-      <w:lvlJc w:val="right"/>
-      <w:pPr>
-        <w:ind w:left="6480" w:hanging="180"/>
-      </w:pPr>
-      <w:rPr/>
-    </w:lvl>
-  </w:abstractNum>
-  <w:abstractNum w:abstractNumId="15">
-    <w:lvl w:ilvl="0">
-      <w:start w:val="1"/>
-      <w:numFmt w:val="decimal"/>
-      <w:lvlText w:val="%1."/>
-      <w:lvlJc w:val="left"/>
-      <w:pPr>
         <w:ind w:left="900" w:hanging="360"/>
       </w:pPr>
       <w:rPr/>
@@ -19378,7 +18662,7 @@
       <w:rPr/>
     </w:lvl>
   </w:abstractNum>
-  <w:abstractNum w:abstractNumId="16">
+  <w:abstractNum w:abstractNumId="15">
     <w:lvl w:ilvl="0">
       <w:start w:val="1"/>
       <w:numFmt w:val="bullet"/>
@@ -19532,9 +18816,6 @@
   </w:num>
   <w:num w:numId="15">
     <w:abstractNumId w:val="15"/>
-  </w:num>
-  <w:num w:numId="16">
-    <w:abstractNumId w:val="16"/>
   </w:num>
 </w:numbering>
 </file>

</xml_diff>

<commit_message>
Added explanation for Minecraft, updated use case diagram
</commit_message>
<xml_diff>
--- a/Project Report.docx
+++ b/Project Report.docx
@@ -548,17 +548,32 @@
       <w:pPr>
         <w:spacing w:after="0" w:line="240" w:lineRule="auto"/>
         <w:jc w:val="center"/>
-        <w:rPr/>
-      </w:pPr>
-      <w:r>
         <w:rPr>
           <w:rFonts w:ascii="Times New Roman" w:cs="Times New Roman" w:eastAsia="Times New Roman" w:hAnsi="Times New Roman"/>
           <w:sz w:val="50"/>
           <w:szCs w:val="50"/>
+        </w:rPr>
+      </w:pPr>
+      <w:r>
+        <w:rPr>
+          <w:rFonts w:ascii="Times New Roman" w:cs="Times New Roman" w:eastAsia="Times New Roman" w:hAnsi="Times New Roman"/>
+          <w:sz w:val="50"/>
+          <w:szCs w:val="50"/>
           <w:rtl w:val="0"/>
         </w:rPr>
         <w:t xml:space="preserve">Versions</w:t>
       </w:r>
+    </w:p>
+    <w:p>
+      <w:pPr>
+        <w:spacing w:after="0" w:line="240" w:lineRule="auto"/>
+        <w:jc w:val="center"/>
+        <w:rPr>
+          <w:rFonts w:ascii="Times New Roman" w:cs="Times New Roman" w:eastAsia="Times New Roman" w:hAnsi="Times New Roman"/>
+          <w:sz w:val="50"/>
+          <w:szCs w:val="50"/>
+        </w:rPr>
+      </w:pPr>
       <w:r>
         <w:rPr>
           <w:rtl w:val="0"/>
@@ -932,19 +947,41 @@
     </w:p>
     <w:p>
       <w:pPr>
+        <w:spacing w:after="0" w:line="240" w:lineRule="auto"/>
+        <w:jc w:val="center"/>
+        <w:rPr>
+          <w:rFonts w:ascii="Times New Roman" w:cs="Times New Roman" w:eastAsia="Times New Roman" w:hAnsi="Times New Roman"/>
+          <w:sz w:val="50"/>
+          <w:szCs w:val="50"/>
+        </w:rPr>
+      </w:pPr>
+      <w:r>
+        <w:rPr>
+          <w:rtl w:val="0"/>
+        </w:rPr>
+      </w:r>
+    </w:p>
+    <w:p>
+      <w:pPr>
         <w:tabs>
           <w:tab w:val="left" w:leader="none" w:pos="1800"/>
         </w:tabs>
         <w:rPr>
           <w:rFonts w:ascii="Times New Roman" w:cs="Times New Roman" w:eastAsia="Times New Roman" w:hAnsi="Times New Roman"/>
-          <w:sz w:val="50"/>
-          <w:szCs w:val="50"/>
-        </w:rPr>
-      </w:pPr>
-      <w:r>
-        <w:rPr>
-          <w:rtl w:val="0"/>
-        </w:rPr>
+          <w:sz w:val="26"/>
+          <w:szCs w:val="26"/>
+        </w:rPr>
+      </w:pPr>
+      <w:r>
+        <w:rPr>
+          <w:rFonts w:ascii="Times New Roman" w:cs="Times New Roman" w:eastAsia="Times New Roman" w:hAnsi="Times New Roman"/>
+          <w:sz w:val="26"/>
+          <w:szCs w:val="26"/>
+          <w:rtl w:val="0"/>
+        </w:rPr>
+        <w:t xml:space="preserve">DMS</w:t>
+        <w:tab/>
+        <w:t xml:space="preserve">Database Management System</w:t>
       </w:r>
     </w:p>
     <w:p>
@@ -965,9 +1002,9 @@
           <w:szCs w:val="26"/>
           <w:rtl w:val="0"/>
         </w:rPr>
-        <w:t xml:space="preserve">DMS</w:t>
+        <w:t xml:space="preserve">…</w:t>
         <w:tab/>
-        <w:t xml:space="preserve">Database Management System</w:t>
+        <w:t xml:space="preserve">…</w:t>
       </w:r>
     </w:p>
     <w:p>
@@ -977,29 +1014,6 @@
         </w:tabs>
         <w:rPr>
           <w:rFonts w:ascii="Times New Roman" w:cs="Times New Roman" w:eastAsia="Times New Roman" w:hAnsi="Times New Roman"/>
-          <w:sz w:val="26"/>
-          <w:szCs w:val="26"/>
-        </w:rPr>
-      </w:pPr>
-      <w:r>
-        <w:rPr>
-          <w:rFonts w:ascii="Times New Roman" w:cs="Times New Roman" w:eastAsia="Times New Roman" w:hAnsi="Times New Roman"/>
-          <w:sz w:val="26"/>
-          <w:szCs w:val="26"/>
-          <w:rtl w:val="0"/>
-        </w:rPr>
-        <w:t xml:space="preserve">…</w:t>
-        <w:tab/>
-        <w:t xml:space="preserve">…</w:t>
-      </w:r>
-    </w:p>
-    <w:p>
-      <w:pPr>
-        <w:tabs>
-          <w:tab w:val="left" w:leader="none" w:pos="1800"/>
-        </w:tabs>
-        <w:rPr>
-          <w:rFonts w:ascii="Times New Roman" w:cs="Times New Roman" w:eastAsia="Times New Roman" w:hAnsi="Times New Roman"/>
           <w:sz w:val="50"/>
           <w:szCs w:val="50"/>
         </w:rPr>
@@ -1012,6 +1026,7 @@
     </w:p>
     <w:p>
       <w:pPr>
+        <w:jc w:val="center"/>
         <w:rPr>
           <w:rFonts w:ascii="Times New Roman" w:cs="Times New Roman" w:eastAsia="Times New Roman" w:hAnsi="Times New Roman"/>
           <w:sz w:val="50"/>
@@ -1028,7 +1043,7 @@
           <w:szCs w:val="50"/>
           <w:rtl w:val="0"/>
         </w:rPr>
-        <w:t xml:space="preserve"> </w:t>
+        <w:t xml:space="preserve"> List of Figures</w:t>
       </w:r>
     </w:p>
     <w:p>
@@ -1042,12 +1057,8 @@
       </w:pPr>
       <w:r>
         <w:rPr>
-          <w:rFonts w:ascii="Times New Roman" w:cs="Times New Roman" w:eastAsia="Times New Roman" w:hAnsi="Times New Roman"/>
-          <w:sz w:val="50"/>
-          <w:szCs w:val="50"/>
-          <w:rtl w:val="0"/>
-        </w:rPr>
-        <w:t xml:space="preserve">List of Figures</w:t>
+          <w:rtl w:val="0"/>
+        </w:rPr>
       </w:r>
     </w:p>
     <w:p>
@@ -1122,6 +1133,22 @@
           <w:rtl w:val="0"/>
         </w:rPr>
         <w:t xml:space="preserve">List of Tables</w:t>
+      </w:r>
+    </w:p>
+    <w:p>
+      <w:pPr>
+        <w:spacing w:after="0" w:line="240" w:lineRule="auto"/>
+        <w:jc w:val="center"/>
+        <w:rPr>
+          <w:rFonts w:ascii="Times New Roman" w:cs="Times New Roman" w:eastAsia="Times New Roman" w:hAnsi="Times New Roman"/>
+          <w:sz w:val="50"/>
+          <w:szCs w:val="50"/>
+        </w:rPr>
+      </w:pPr>
+      <w:r>
+        <w:rPr>
+          <w:rtl w:val="0"/>
+        </w:rPr>
       </w:r>
     </w:p>
     <w:p>
@@ -1400,333 +1427,7 @@
         </w:pBdr>
         <w:shd w:fill="auto" w:val="clear"/>
         <w:spacing w:after="0" w:before="0" w:line="240" w:lineRule="auto"/>
-        <w:ind w:left="0" w:right="0" w:firstLine="540"/>
-        <w:jc w:val="both"/>
-        <w:rPr>
-          <w:rFonts w:ascii="Times New Roman" w:cs="Times New Roman" w:eastAsia="Times New Roman" w:hAnsi="Times New Roman"/>
-          <w:b w:val="0"/>
-          <w:bCs w:val="0"/>
-          <w:i w:val="1"/>
-          <w:iCs w:val="1"/>
-          <w:smallCaps w:val="0"/>
-          <w:strike w:val="0"/>
-          <w:color w:val="000000"/>
-          <w:sz w:val="26"/>
-          <w:szCs w:val="26"/>
-          <w:u w:val="none"/>
-          <w:shd w:fill="auto" w:val="clear"/>
-          <w:vertAlign w:val="baseline"/>
-        </w:rPr>
-      </w:pPr>
-      <w:r>
-        <w:rPr>
-          <w:rFonts w:ascii="Times New Roman" w:cs="Times New Roman" w:eastAsia="Times New Roman" w:hAnsi="Times New Roman"/>
-          <w:b w:val="0"/>
-          <w:bCs w:val="0"/>
-          <w:i w:val="1"/>
-          <w:iCs w:val="1"/>
-          <w:smallCaps w:val="0"/>
-          <w:strike w:val="0"/>
-          <w:color w:val="000000"/>
-          <w:sz w:val="26"/>
-          <w:szCs w:val="26"/>
-          <w:u w:val="none"/>
-          <w:shd w:fill="auto" w:val="clear"/>
-          <w:vertAlign w:val="baseline"/>
-          <w:rtl w:val="0"/>
-        </w:rPr>
-        <w:t xml:space="preserve">(Removing this italic red paragraph below after you read it)</w:t>
-      </w:r>
-    </w:p>
-    <w:p>
-      <w:pPr>
-        <w:keepNext w:val="0"/>
-        <w:keepLines w:val="0"/>
-        <w:pageBreakBefore w:val="0"/>
-        <w:widowControl w:val="1"/>
-        <w:pBdr>
-          <w:top w:space="0" w:sz="0" w:val="nil"/>
-          <w:left w:space="0" w:sz="0" w:val="nil"/>
-          <w:bottom w:space="0" w:sz="0" w:val="nil"/>
-          <w:right w:space="0" w:sz="0" w:val="nil"/>
-          <w:between w:space="0" w:sz="0" w:val="nil"/>
-        </w:pBdr>
-        <w:shd w:fill="auto" w:val="clear"/>
-        <w:spacing w:after="0" w:before="0" w:line="240" w:lineRule="auto"/>
-        <w:ind w:left="0" w:right="0" w:firstLine="540"/>
-        <w:jc w:val="both"/>
-        <w:rPr>
-          <w:rFonts w:ascii="Times New Roman" w:cs="Times New Roman" w:eastAsia="Times New Roman" w:hAnsi="Times New Roman"/>
-          <w:b w:val="0"/>
-          <w:bCs w:val="0"/>
-          <w:i w:val="1"/>
-          <w:iCs w:val="1"/>
-          <w:smallCaps w:val="0"/>
-          <w:strike w:val="0"/>
-          <w:color w:val="000000"/>
-          <w:sz w:val="26"/>
-          <w:szCs w:val="26"/>
-          <w:u w:val="none"/>
-          <w:shd w:fill="auto" w:val="clear"/>
-          <w:vertAlign w:val="baseline"/>
-        </w:rPr>
-      </w:pPr>
-      <w:r>
-        <w:rPr>
-          <w:rFonts w:ascii="Times New Roman" w:cs="Times New Roman" w:eastAsia="Times New Roman" w:hAnsi="Times New Roman"/>
-          <w:b w:val="0"/>
-          <w:bCs w:val="0"/>
-          <w:i w:val="1"/>
-          <w:iCs w:val="1"/>
-          <w:smallCaps w:val="0"/>
-          <w:strike w:val="0"/>
-          <w:color w:val="000000"/>
-          <w:sz w:val="26"/>
-          <w:szCs w:val="26"/>
-          <w:u w:val="none"/>
-          <w:shd w:fill="auto" w:val="clear"/>
-          <w:vertAlign w:val="baseline"/>
-          <w:rtl w:val="0"/>
-        </w:rPr>
-        <w:t xml:space="preserve">Student please use font </w:t>
-      </w:r>
-      <w:r>
-        <w:rPr>
-          <w:rFonts w:ascii="Times New Roman" w:cs="Times New Roman" w:eastAsia="Times New Roman" w:hAnsi="Times New Roman"/>
-          <w:b w:val="1"/>
-          <w:bCs w:val="1"/>
-          <w:i w:val="1"/>
-          <w:iCs w:val="1"/>
-          <w:smallCaps w:val="0"/>
-          <w:strike w:val="0"/>
-          <w:color w:val="000000"/>
-          <w:sz w:val="26"/>
-          <w:szCs w:val="26"/>
-          <w:u w:val="none"/>
-          <w:shd w:fill="auto" w:val="clear"/>
-          <w:vertAlign w:val="baseline"/>
-          <w:rtl w:val="0"/>
-        </w:rPr>
-        <w:t xml:space="preserve">Times New Roman</w:t>
-      </w:r>
-      <w:r>
-        <w:rPr>
-          <w:rFonts w:ascii="Times New Roman" w:cs="Times New Roman" w:eastAsia="Times New Roman" w:hAnsi="Times New Roman"/>
-          <w:b w:val="0"/>
-          <w:bCs w:val="0"/>
-          <w:i w:val="1"/>
-          <w:iCs w:val="1"/>
-          <w:smallCaps w:val="0"/>
-          <w:strike w:val="0"/>
-          <w:color w:val="000000"/>
-          <w:sz w:val="26"/>
-          <w:szCs w:val="26"/>
-          <w:u w:val="none"/>
-          <w:shd w:fill="auto" w:val="clear"/>
-          <w:vertAlign w:val="baseline"/>
-          <w:rtl w:val="0"/>
-        </w:rPr>
-        <w:t xml:space="preserve">, size </w:t>
-      </w:r>
-      <w:r>
-        <w:rPr>
-          <w:rFonts w:ascii="Times New Roman" w:cs="Times New Roman" w:eastAsia="Times New Roman" w:hAnsi="Times New Roman"/>
-          <w:b w:val="1"/>
-          <w:bCs w:val="1"/>
-          <w:i w:val="1"/>
-          <w:iCs w:val="1"/>
-          <w:smallCaps w:val="0"/>
-          <w:strike w:val="0"/>
-          <w:color w:val="000000"/>
-          <w:sz w:val="26"/>
-          <w:szCs w:val="26"/>
-          <w:u w:val="none"/>
-          <w:shd w:fill="auto" w:val="clear"/>
-          <w:vertAlign w:val="baseline"/>
-          <w:rtl w:val="0"/>
-        </w:rPr>
-        <w:t xml:space="preserve">13</w:t>
-      </w:r>
-      <w:r>
-        <w:rPr>
-          <w:rFonts w:ascii="Times New Roman" w:cs="Times New Roman" w:eastAsia="Times New Roman" w:hAnsi="Times New Roman"/>
-          <w:b w:val="0"/>
-          <w:bCs w:val="0"/>
-          <w:i w:val="1"/>
-          <w:iCs w:val="1"/>
-          <w:smallCaps w:val="0"/>
-          <w:strike w:val="0"/>
-          <w:color w:val="000000"/>
-          <w:sz w:val="26"/>
-          <w:szCs w:val="26"/>
-          <w:u w:val="none"/>
-          <w:shd w:fill="auto" w:val="clear"/>
-          <w:vertAlign w:val="baseline"/>
-          <w:rtl w:val="0"/>
-        </w:rPr>
-        <w:t xml:space="preserve">, </w:t>
-      </w:r>
-      <w:r>
-        <w:rPr>
-          <w:rFonts w:ascii="Times New Roman" w:cs="Times New Roman" w:eastAsia="Times New Roman" w:hAnsi="Times New Roman"/>
-          <w:b w:val="1"/>
-          <w:bCs w:val="1"/>
-          <w:i w:val="1"/>
-          <w:iCs w:val="1"/>
-          <w:smallCaps w:val="0"/>
-          <w:strike w:val="0"/>
-          <w:color w:val="000000"/>
-          <w:sz w:val="26"/>
-          <w:szCs w:val="26"/>
-          <w:u w:val="none"/>
-          <w:shd w:fill="auto" w:val="clear"/>
-          <w:vertAlign w:val="baseline"/>
-          <w:rtl w:val="0"/>
-        </w:rPr>
-        <w:t xml:space="preserve">Justify Text Alignment</w:t>
-      </w:r>
-      <w:r>
-        <w:rPr>
-          <w:rFonts w:ascii="Times New Roman" w:cs="Times New Roman" w:eastAsia="Times New Roman" w:hAnsi="Times New Roman"/>
-          <w:b w:val="0"/>
-          <w:bCs w:val="0"/>
-          <w:i w:val="1"/>
-          <w:iCs w:val="1"/>
-          <w:smallCaps w:val="0"/>
-          <w:strike w:val="0"/>
-          <w:color w:val="000000"/>
-          <w:sz w:val="26"/>
-          <w:szCs w:val="26"/>
-          <w:u w:val="none"/>
-          <w:shd w:fill="auto" w:val="clear"/>
-          <w:vertAlign w:val="baseline"/>
-          <w:rtl w:val="0"/>
-        </w:rPr>
-        <w:t xml:space="preserve"> for the report content.</w:t>
-      </w:r>
-    </w:p>
-    <w:p>
-      <w:pPr>
-        <w:keepNext w:val="0"/>
-        <w:keepLines w:val="0"/>
-        <w:pageBreakBefore w:val="0"/>
-        <w:widowControl w:val="1"/>
-        <w:pBdr>
-          <w:top w:space="0" w:sz="0" w:val="nil"/>
-          <w:left w:space="0" w:sz="0" w:val="nil"/>
-          <w:bottom w:space="0" w:sz="0" w:val="nil"/>
-          <w:right w:space="0" w:sz="0" w:val="nil"/>
-          <w:between w:space="0" w:sz="0" w:val="nil"/>
-        </w:pBdr>
-        <w:shd w:fill="auto" w:val="clear"/>
-        <w:spacing w:after="0" w:before="0" w:line="240" w:lineRule="auto"/>
-        <w:ind w:left="0" w:right="0" w:firstLine="540"/>
-        <w:jc w:val="both"/>
-        <w:rPr>
-          <w:rFonts w:ascii="Times New Roman" w:cs="Times New Roman" w:eastAsia="Times New Roman" w:hAnsi="Times New Roman"/>
-          <w:b w:val="0"/>
-          <w:bCs w:val="0"/>
-          <w:i w:val="1"/>
-          <w:iCs w:val="1"/>
-          <w:smallCaps w:val="0"/>
-          <w:strike w:val="0"/>
-          <w:color w:val="000000"/>
-          <w:sz w:val="26"/>
-          <w:szCs w:val="26"/>
-          <w:u w:val="none"/>
-          <w:shd w:fill="auto" w:val="clear"/>
-          <w:vertAlign w:val="baseline"/>
-        </w:rPr>
-      </w:pPr>
-      <w:r>
-        <w:rPr>
-          <w:rFonts w:ascii="Times New Roman" w:cs="Times New Roman" w:eastAsia="Times New Roman" w:hAnsi="Times New Roman"/>
-          <w:b w:val="0"/>
-          <w:bCs w:val="0"/>
-          <w:i w:val="1"/>
-          <w:iCs w:val="1"/>
-          <w:smallCaps w:val="0"/>
-          <w:strike w:val="0"/>
-          <w:color w:val="000000"/>
-          <w:sz w:val="26"/>
-          <w:szCs w:val="26"/>
-          <w:u w:val="none"/>
-          <w:shd w:fill="auto" w:val="clear"/>
-          <w:vertAlign w:val="baseline"/>
-          <w:rtl w:val="0"/>
-        </w:rPr>
-        <w:t xml:space="preserve">If you insert the code into the report, please keep its original format with font, size and colors.</w:t>
-      </w:r>
-    </w:p>
-    <w:p>
-      <w:pPr>
-        <w:keepNext w:val="0"/>
-        <w:keepLines w:val="0"/>
-        <w:pageBreakBefore w:val="0"/>
-        <w:widowControl w:val="1"/>
-        <w:pBdr>
-          <w:top w:space="0" w:sz="0" w:val="nil"/>
-          <w:left w:space="0" w:sz="0" w:val="nil"/>
-          <w:bottom w:space="0" w:sz="0" w:val="nil"/>
-          <w:right w:space="0" w:sz="0" w:val="nil"/>
-          <w:between w:space="0" w:sz="0" w:val="nil"/>
-        </w:pBdr>
-        <w:shd w:fill="auto" w:val="clear"/>
-        <w:spacing w:after="0" w:before="0" w:line="240" w:lineRule="auto"/>
-        <w:ind w:left="0" w:right="0" w:firstLine="540"/>
-        <w:jc w:val="both"/>
-        <w:rPr>
-          <w:rFonts w:ascii="Times New Roman" w:cs="Times New Roman" w:eastAsia="Times New Roman" w:hAnsi="Times New Roman"/>
-          <w:b w:val="0"/>
-          <w:bCs w:val="0"/>
-          <w:i w:val="1"/>
-          <w:iCs w:val="1"/>
-          <w:smallCaps w:val="0"/>
-          <w:strike w:val="0"/>
-          <w:color w:val="000000"/>
-          <w:sz w:val="26"/>
-          <w:szCs w:val="26"/>
-          <w:u w:val="none"/>
-          <w:shd w:fill="auto" w:val="clear"/>
-          <w:vertAlign w:val="baseline"/>
-        </w:rPr>
-      </w:pPr>
-      <w:r>
-        <w:rPr>
-          <w:rFonts w:ascii="Times New Roman" w:cs="Times New Roman" w:eastAsia="Times New Roman" w:hAnsi="Times New Roman"/>
-          <w:b w:val="0"/>
-          <w:bCs w:val="0"/>
-          <w:i w:val="1"/>
-          <w:iCs w:val="1"/>
-          <w:smallCaps w:val="0"/>
-          <w:strike w:val="0"/>
-          <w:color w:val="000000"/>
-          <w:sz w:val="26"/>
-          <w:szCs w:val="26"/>
-          <w:u w:val="none"/>
-          <w:shd w:fill="auto" w:val="clear"/>
-          <w:vertAlign w:val="baseline"/>
-          <w:rtl w:val="0"/>
-        </w:rPr>
-        <w:t xml:space="preserve">Please insert only the code useful for the report in clarification, and limit lengthening the report by pasting unnecessary code. You can insert the path of the code files, and I will search it in your attached project code to check them.</w:t>
-      </w:r>
-    </w:p>
-    <w:p>
-      <w:pPr>
-        <w:keepNext w:val="0"/>
-        <w:keepLines w:val="0"/>
-        <w:pageBreakBefore w:val="0"/>
-        <w:widowControl w:val="1"/>
-        <w:pBdr>
-          <w:top w:space="0" w:sz="0" w:val="nil"/>
-          <w:left w:space="0" w:sz="0" w:val="nil"/>
-          <w:bottom w:space="0" w:sz="0" w:val="nil"/>
-          <w:right w:space="0" w:sz="0" w:val="nil"/>
-          <w:between w:space="0" w:sz="0" w:val="nil"/>
-        </w:pBdr>
-        <w:shd w:fill="auto" w:val="clear"/>
-        <w:spacing w:after="0" w:before="0" w:line="240" w:lineRule="auto"/>
-        <w:ind w:left="540" w:right="0" w:firstLine="0"/>
+        <w:ind w:left="0" w:right="0" w:firstLine="0"/>
         <w:jc w:val="left"/>
         <w:rPr>
           <w:rFonts w:ascii="Times New Roman" w:cs="Times New Roman" w:eastAsia="Times New Roman" w:hAnsi="Times New Roman"/>
@@ -1806,26 +1507,260 @@
     </w:p>
     <w:p>
       <w:pPr>
+        <w:keepNext w:val="0"/>
+        <w:keepLines w:val="0"/>
+        <w:pageBreakBefore w:val="0"/>
+        <w:widowControl w:val="1"/>
+        <w:pBdr>
+          <w:top w:space="0" w:sz="0" w:val="nil"/>
+          <w:left w:space="0" w:sz="0" w:val="nil"/>
+          <w:bottom w:space="0" w:sz="0" w:val="nil"/>
+          <w:right w:space="0" w:sz="0" w:val="nil"/>
+          <w:between w:space="0" w:sz="0" w:val="nil"/>
+        </w:pBdr>
+        <w:shd w:fill="auto" w:val="clear"/>
+        <w:spacing w:after="0" w:before="0" w:line="240" w:lineRule="auto"/>
+        <w:ind w:right="0"/>
+        <w:jc w:val="left"/>
+        <w:rPr>
+          <w:rFonts w:ascii="Times New Roman" w:cs="Times New Roman" w:eastAsia="Times New Roman" w:hAnsi="Times New Roman"/>
+          <w:b w:val="1"/>
+          <w:bCs w:val="1"/>
+          <w:sz w:val="30"/>
+          <w:szCs w:val="30"/>
+        </w:rPr>
+      </w:pPr>
+      <w:r>
+        <w:rPr>
+          <w:rtl w:val="0"/>
+        </w:rPr>
+      </w:r>
+    </w:p>
+    <w:p>
+      <w:pPr>
+        <w:numPr>
+          <w:ilvl w:val="0"/>
+          <w:numId w:val="14"/>
+        </w:numPr>
+        <w:spacing w:after="0" w:line="240" w:lineRule="auto"/>
+        <w:ind w:left="900" w:hanging="360"/>
+        <w:jc w:val="both"/>
+        <w:rPr>
+          <w:rFonts w:ascii="Times New Roman" w:cs="Times New Roman" w:eastAsia="Times New Roman" w:hAnsi="Times New Roman"/>
+          <w:i w:val="1"/>
+          <w:iCs w:val="1"/>
+          <w:sz w:val="26"/>
+          <w:szCs w:val="26"/>
+        </w:rPr>
+      </w:pPr>
+      <w:r>
+        <w:rPr>
+          <w:rFonts w:ascii="Times New Roman" w:cs="Times New Roman" w:eastAsia="Times New Roman" w:hAnsi="Times New Roman"/>
+          <w:i w:val="1"/>
+          <w:iCs w:val="1"/>
+          <w:sz w:val="26"/>
+          <w:szCs w:val="26"/>
+          <w:rtl w:val="0"/>
+        </w:rPr>
+        <w:t xml:space="preserve">What is Minecraft?</w:t>
+      </w:r>
+      <w:r>
+        <w:rPr>
+          <w:rtl w:val="0"/>
+        </w:rPr>
+      </w:r>
+    </w:p>
+    <w:p>
+      <w:pPr>
         <w:spacing w:after="120" w:line="240" w:lineRule="auto"/>
-        <w:rPr>
-          <w:rFonts w:ascii="Times New Roman" w:cs="Times New Roman" w:eastAsia="Times New Roman" w:hAnsi="Times New Roman"/>
-          <w:sz w:val="26"/>
-          <w:szCs w:val="26"/>
-        </w:rPr>
-      </w:pPr>
-      <w:r>
-        <w:rPr>
-          <w:rFonts w:ascii="Times New Roman" w:cs="Times New Roman" w:eastAsia="Times New Roman" w:hAnsi="Times New Roman"/>
-          <w:sz w:val="26"/>
-          <w:szCs w:val="26"/>
-          <w:rtl w:val="0"/>
-        </w:rPr>
-        <w:t xml:space="preserve">In this project, we will deliver a Fabric mod for Minecraft 1.21.11 (Java 21) that adds a new dimension called The Abyss.</w:t>
+        <w:ind w:left="0" w:firstLine="0"/>
+        <w:jc w:val="both"/>
+        <w:rPr>
+          <w:rFonts w:ascii="Times New Roman" w:cs="Times New Roman" w:eastAsia="Times New Roman" w:hAnsi="Times New Roman"/>
+          <w:sz w:val="26"/>
+          <w:szCs w:val="26"/>
+        </w:rPr>
+      </w:pPr>
+      <w:r>
+        <w:rPr>
+          <w:rFonts w:ascii="Times New Roman" w:cs="Times New Roman" w:eastAsia="Times New Roman" w:hAnsi="Times New Roman"/>
+          <w:sz w:val="26"/>
+          <w:szCs w:val="26"/>
+          <w:rtl w:val="0"/>
+        </w:rPr>
+        <w:t xml:space="preserve">Minecraft is a 3D sandbox video game created by Markus “Notch” Persson and developed by Mojang Studios, a subsidiary of Microsoft. The game was first released in 2011, where players explore, build, and survive in a block‑based world. </w:t>
+      </w:r>
+      <w:r>
+        <w:rPr>
+          <w:rtl w:val="0"/>
+        </w:rPr>
       </w:r>
     </w:p>
     <w:p>
       <w:pPr>
         <w:spacing w:after="120" w:line="240" w:lineRule="auto"/>
+        <w:ind w:left="0" w:firstLine="0"/>
+        <w:jc w:val="both"/>
+        <w:rPr>
+          <w:rFonts w:ascii="Times New Roman" w:cs="Times New Roman" w:eastAsia="Times New Roman" w:hAnsi="Times New Roman"/>
+          <w:sz w:val="26"/>
+          <w:szCs w:val="26"/>
+        </w:rPr>
+      </w:pPr>
+      <w:r>
+        <w:rPr>
+          <w:rFonts w:ascii="Times New Roman" w:cs="Times New Roman" w:eastAsia="Times New Roman" w:hAnsi="Times New Roman"/>
+          <w:sz w:val="26"/>
+          <w:szCs w:val="26"/>
+          <w:rtl w:val="0"/>
+        </w:rPr>
+        <w:t xml:space="preserve">Minecraft has 3 main dimensions. The Overworld is the primary dimension where players start their game. It features a wide variety of biomes, including forests, deserts, oceans, and mountains, and contains most of the game's resources such as wood, stone, iron, diamonds, and gold. The Nether is a fiery, dangerous dimension.</w:t>
+      </w:r>
+    </w:p>
+    <w:p>
+      <w:pPr>
+        <w:spacing w:after="120" w:line="240" w:lineRule="auto"/>
+        <w:ind w:left="0" w:firstLine="0"/>
+        <w:jc w:val="both"/>
+        <w:rPr>
+          <w:rFonts w:ascii="Times New Roman" w:cs="Times New Roman" w:eastAsia="Times New Roman" w:hAnsi="Times New Roman"/>
+          <w:sz w:val="26"/>
+          <w:szCs w:val="26"/>
+        </w:rPr>
+      </w:pPr>
+      <w:r>
+        <w:rPr>
+          <w:rFonts w:ascii="Times New Roman" w:cs="Times New Roman" w:eastAsia="Times New Roman" w:hAnsi="Times New Roman"/>
+          <w:sz w:val="26"/>
+          <w:szCs w:val="26"/>
+          <w:rtl w:val="0"/>
+        </w:rPr>
+        <w:t xml:space="preserve"> It is characterized by lava oceans, netherrack terrain, basalt deltas, and soul sand valleys. Players access it through a Nether portal. The End is a space-like dimension surrounded by Void with floating islands of End Stone. It is accessed via an End portal found in strongholds. The central island hosts the Ender Dragon, the game's main boss, while outer islands contain valuable items.</w:t>
+      </w:r>
+    </w:p>
+    <w:p>
+      <w:pPr>
+        <w:spacing w:after="120" w:line="240" w:lineRule="auto"/>
+        <w:ind w:left="0" w:firstLine="0"/>
+        <w:jc w:val="both"/>
+        <w:rPr>
+          <w:rFonts w:ascii="Times New Roman" w:cs="Times New Roman" w:eastAsia="Times New Roman" w:hAnsi="Times New Roman"/>
+          <w:sz w:val="26"/>
+          <w:szCs w:val="26"/>
+        </w:rPr>
+      </w:pPr>
+      <w:r>
+        <w:rPr>
+          <w:rFonts w:ascii="Times New Roman" w:cs="Times New Roman" w:eastAsia="Times New Roman" w:hAnsi="Times New Roman"/>
+          <w:sz w:val="26"/>
+          <w:szCs w:val="26"/>
+          <w:rtl w:val="0"/>
+        </w:rPr>
+        <w:t xml:space="preserve">In Minecraft, the Void is the empty, lethal space below Y = ‑64 that instantly kills players and deletes items, acting as the game world’s final boundary. It is a non-physical, infinite empty space outside the world’s generated boundaries. It exists below the bedrock layer (Bedrock is  an indestructible block which cannot be broken  without creative mode, cheating or exploiting a bug)  in the Overworld and Nether, and under the islands in the End.</w:t>
+      </w:r>
+    </w:p>
+    <w:p>
+      <w:pPr>
+        <w:spacing w:after="120" w:line="240" w:lineRule="auto"/>
+        <w:ind w:left="0" w:firstLine="0"/>
+        <w:jc w:val="both"/>
+        <w:rPr>
+          <w:rFonts w:ascii="Times New Roman" w:cs="Times New Roman" w:eastAsia="Times New Roman" w:hAnsi="Times New Roman"/>
+          <w:sz w:val="26"/>
+          <w:szCs w:val="26"/>
+        </w:rPr>
+      </w:pPr>
+      <w:r>
+        <w:rPr>
+          <w:rFonts w:ascii="Times New Roman" w:cs="Times New Roman" w:eastAsia="Times New Roman" w:hAnsi="Times New Roman"/>
+          <w:sz w:val="26"/>
+          <w:szCs w:val="26"/>
+          <w:rtl w:val="0"/>
+        </w:rPr>
+        <w:t xml:space="preserve">A Minecraft mod is a community-created modification that changes or adds content to the base game, enhancing gameplay with new features, mechanics, or items.</w:t>
+      </w:r>
+    </w:p>
+    <w:p>
+      <w:pPr>
+        <w:spacing w:after="120" w:line="240" w:lineRule="auto"/>
+        <w:ind w:left="0" w:firstLine="0"/>
+        <w:jc w:val="both"/>
+        <w:rPr>
+          <w:rFonts w:ascii="Times New Roman" w:cs="Times New Roman" w:eastAsia="Times New Roman" w:hAnsi="Times New Roman"/>
+          <w:sz w:val="26"/>
+          <w:szCs w:val="26"/>
+        </w:rPr>
+      </w:pPr>
+      <w:r>
+        <w:rPr>
+          <w:rFonts w:ascii="Times New Roman" w:cs="Times New Roman" w:eastAsia="Times New Roman" w:hAnsi="Times New Roman"/>
+          <w:sz w:val="26"/>
+          <w:szCs w:val="26"/>
+          <w:rtl w:val="0"/>
+        </w:rPr>
+        <w:t xml:space="preserve">Minecraft Fabric is a mod development toolchain that provides a flexible platform-independent mod loader designed for Minecraft and other games and applications. Fabric Loader is the backbone of most mods developed and used on Fabric, while the Fabric API is a library of functions that Fabric mods rely on to run smoothly.</w:t>
+      </w:r>
+    </w:p>
+    <w:p>
+      <w:pPr>
+        <w:numPr>
+          <w:ilvl w:val="0"/>
+          <w:numId w:val="14"/>
+        </w:numPr>
+        <w:spacing w:after="0" w:line="240" w:lineRule="auto"/>
+        <w:ind w:left="900" w:hanging="360"/>
+        <w:jc w:val="both"/>
+        <w:rPr>
+          <w:rFonts w:ascii="Times New Roman" w:cs="Times New Roman" w:eastAsia="Times New Roman" w:hAnsi="Times New Roman"/>
+          <w:i w:val="1"/>
+          <w:iCs w:val="1"/>
+          <w:sz w:val="26"/>
+          <w:szCs w:val="26"/>
+        </w:rPr>
+      </w:pPr>
+      <w:r>
+        <w:rPr>
+          <w:rFonts w:ascii="Times New Roman" w:cs="Times New Roman" w:eastAsia="Times New Roman" w:hAnsi="Times New Roman"/>
+          <w:i w:val="1"/>
+          <w:iCs w:val="1"/>
+          <w:sz w:val="26"/>
+          <w:szCs w:val="26"/>
+          <w:rtl w:val="0"/>
+        </w:rPr>
+        <w:t xml:space="preserve">What this project is about.</w:t>
+      </w:r>
+      <w:r>
+        <w:rPr>
+          <w:rtl w:val="0"/>
+        </w:rPr>
+      </w:r>
+    </w:p>
+    <w:p>
+      <w:pPr>
+        <w:spacing w:after="120" w:line="240" w:lineRule="auto"/>
+        <w:ind w:left="0" w:firstLine="0"/>
+        <w:jc w:val="both"/>
+        <w:rPr>
+          <w:rFonts w:ascii="Times New Roman" w:cs="Times New Roman" w:eastAsia="Times New Roman" w:hAnsi="Times New Roman"/>
+          <w:sz w:val="26"/>
+          <w:szCs w:val="26"/>
+        </w:rPr>
+      </w:pPr>
+      <w:r>
+        <w:rPr>
+          <w:rFonts w:ascii="Times New Roman" w:cs="Times New Roman" w:eastAsia="Times New Roman" w:hAnsi="Times New Roman"/>
+          <w:sz w:val="26"/>
+          <w:szCs w:val="26"/>
+          <w:rtl w:val="0"/>
+        </w:rPr>
+        <w:t xml:space="preserve">In this project, we will deliver a Fabric mod for Minecraft version 1.21.11 (Java 21) that adds a new dimension called The Abyss.</w:t>
+      </w:r>
+    </w:p>
+    <w:p>
+      <w:pPr>
+        <w:spacing w:after="120" w:line="240" w:lineRule="auto"/>
+        <w:ind w:left="0" w:firstLine="0"/>
+        <w:jc w:val="both"/>
         <w:rPr>
           <w:rFonts w:ascii="Times New Roman" w:cs="Times New Roman" w:eastAsia="Times New Roman" w:hAnsi="Times New Roman"/>
           <w:sz w:val="26"/>
@@ -1845,6 +1780,8 @@
     <w:p>
       <w:pPr>
         <w:spacing w:after="120" w:line="240" w:lineRule="auto"/>
+        <w:ind w:left="0" w:firstLine="0"/>
+        <w:jc w:val="both"/>
         <w:rPr>
           <w:rFonts w:ascii="Times New Roman" w:cs="Times New Roman" w:eastAsia="Times New Roman" w:hAnsi="Times New Roman"/>
           <w:sz w:val="26"/>
@@ -1869,6 +1806,7 @@
         </w:numPr>
         <w:spacing w:after="0" w:afterAutospacing="0" w:line="240" w:lineRule="auto"/>
         <w:ind w:left="720" w:hanging="360"/>
+        <w:jc w:val="both"/>
         <w:rPr>
           <w:rFonts w:ascii="Times New Roman" w:cs="Times New Roman" w:eastAsia="Times New Roman" w:hAnsi="Times New Roman"/>
           <w:sz w:val="26"/>
@@ -1894,6 +1832,7 @@
         </w:numPr>
         <w:spacing w:after="0" w:afterAutospacing="0" w:line="240" w:lineRule="auto"/>
         <w:ind w:left="720" w:hanging="360"/>
+        <w:jc w:val="both"/>
         <w:rPr>
           <w:rFonts w:ascii="Times New Roman" w:cs="Times New Roman" w:eastAsia="Times New Roman" w:hAnsi="Times New Roman"/>
           <w:sz w:val="26"/>
@@ -1919,6 +1858,7 @@
         </w:numPr>
         <w:spacing w:after="0" w:afterAutospacing="0" w:line="240" w:lineRule="auto"/>
         <w:ind w:left="720" w:hanging="360"/>
+        <w:jc w:val="both"/>
         <w:rPr>
           <w:rFonts w:ascii="Times New Roman" w:cs="Times New Roman" w:eastAsia="Times New Roman" w:hAnsi="Times New Roman"/>
           <w:sz w:val="26"/>
@@ -1944,26 +1884,29 @@
         </w:numPr>
         <w:spacing w:after="120" w:line="240" w:lineRule="auto"/>
         <w:ind w:left="720" w:hanging="360"/>
-        <w:rPr>
-          <w:rFonts w:ascii="Times New Roman" w:cs="Times New Roman" w:eastAsia="Times New Roman" w:hAnsi="Times New Roman"/>
-          <w:sz w:val="26"/>
-          <w:szCs w:val="26"/>
-          <w:u w:val="none"/>
-        </w:rPr>
-      </w:pPr>
-      <w:r>
-        <w:rPr>
-          <w:rFonts w:ascii="Times New Roman" w:cs="Times New Roman" w:eastAsia="Times New Roman" w:hAnsi="Times New Roman"/>
-          <w:sz w:val="26"/>
-          <w:szCs w:val="26"/>
-          <w:rtl w:val="0"/>
-        </w:rPr>
-        <w:t xml:space="preserve">Meet and fight new Abyss mobs, such as the Abyss zombie.</w:t>
+        <w:jc w:val="both"/>
+        <w:rPr>
+          <w:rFonts w:ascii="Times New Roman" w:cs="Times New Roman" w:eastAsia="Times New Roman" w:hAnsi="Times New Roman"/>
+          <w:sz w:val="26"/>
+          <w:szCs w:val="26"/>
+          <w:u w:val="none"/>
+        </w:rPr>
+      </w:pPr>
+      <w:r>
+        <w:rPr>
+          <w:rFonts w:ascii="Times New Roman" w:cs="Times New Roman" w:eastAsia="Times New Roman" w:hAnsi="Times New Roman"/>
+          <w:sz w:val="26"/>
+          <w:szCs w:val="26"/>
+          <w:rtl w:val="0"/>
+        </w:rPr>
+        <w:t xml:space="preserve">Meet and fight new Abyss mobs, such as the Abyss Zombie.</w:t>
       </w:r>
     </w:p>
     <w:p>
       <w:pPr>
         <w:spacing w:after="120" w:line="240" w:lineRule="auto"/>
+        <w:ind w:left="0" w:firstLine="0"/>
+        <w:jc w:val="both"/>
         <w:rPr>
           <w:rFonts w:ascii="Times New Roman" w:cs="Times New Roman" w:eastAsia="Times New Roman" w:hAnsi="Times New Roman"/>
           <w:sz w:val="26"/>
@@ -2017,7 +1960,7 @@
     <w:sdt>
       <w:sdtPr>
         <w:lock w:val="contentLocked"/>
-        <w:id w:val="695136199"/>
+        <w:id w:val="1842189371"/>
         <w:tag w:val="goog_rdk_0"/>
       </w:sdtPr>
       <w:sdtContent>
@@ -2083,7 +2026,7 @@
                   <w:shd w:fill="auto" w:val="clear"/>
                   <w:spacing w:after="0" w:before="0" w:line="240" w:lineRule="auto"/>
                   <w:ind w:left="0" w:right="0" w:firstLine="0"/>
-                  <w:jc w:val="left"/>
+                  <w:jc w:val="both"/>
                   <w:rPr>
                     <w:rFonts w:ascii="Times New Roman" w:cs="Times New Roman" w:eastAsia="Times New Roman" w:hAnsi="Times New Roman"/>
                     <w:sz w:val="26"/>
@@ -2128,7 +2071,7 @@
                   <w:shd w:fill="auto" w:val="clear"/>
                   <w:spacing w:after="0" w:before="0" w:line="240" w:lineRule="auto"/>
                   <w:ind w:left="0" w:right="0" w:firstLine="0"/>
-                  <w:jc w:val="left"/>
+                  <w:jc w:val="both"/>
                   <w:rPr>
                     <w:rFonts w:ascii="Times New Roman" w:cs="Times New Roman" w:eastAsia="Times New Roman" w:hAnsi="Times New Roman"/>
                     <w:sz w:val="26"/>
@@ -2173,7 +2116,7 @@
                   <w:shd w:fill="auto" w:val="clear"/>
                   <w:spacing w:after="0" w:before="0" w:line="240" w:lineRule="auto"/>
                   <w:ind w:left="0" w:right="0" w:firstLine="0"/>
-                  <w:jc w:val="left"/>
+                  <w:jc w:val="both"/>
                   <w:rPr>
                     <w:rFonts w:ascii="Times New Roman" w:cs="Times New Roman" w:eastAsia="Times New Roman" w:hAnsi="Times New Roman"/>
                     <w:sz w:val="26"/>
@@ -2218,7 +2161,7 @@
                   <w:shd w:fill="auto" w:val="clear"/>
                   <w:spacing w:after="0" w:before="0" w:line="240" w:lineRule="auto"/>
                   <w:ind w:left="0" w:right="0" w:firstLine="0"/>
-                  <w:jc w:val="left"/>
+                  <w:jc w:val="both"/>
                   <w:rPr>
                     <w:rFonts w:ascii="Times New Roman" w:cs="Times New Roman" w:eastAsia="Times New Roman" w:hAnsi="Times New Roman"/>
                     <w:sz w:val="26"/>
@@ -2269,7 +2212,7 @@
                   <w:shd w:fill="auto" w:val="clear"/>
                   <w:spacing w:after="0" w:before="0" w:line="240" w:lineRule="auto"/>
                   <w:ind w:left="0" w:right="0" w:firstLine="0"/>
-                  <w:jc w:val="left"/>
+                  <w:jc w:val="both"/>
                   <w:rPr>
                     <w:rFonts w:ascii="Times New Roman" w:cs="Times New Roman" w:eastAsia="Times New Roman" w:hAnsi="Times New Roman"/>
                     <w:sz w:val="26"/>
@@ -2314,7 +2257,7 @@
                   <w:shd w:fill="auto" w:val="clear"/>
                   <w:spacing w:after="0" w:before="0" w:line="240" w:lineRule="auto"/>
                   <w:ind w:left="0" w:right="0" w:firstLine="0"/>
-                  <w:jc w:val="left"/>
+                  <w:jc w:val="both"/>
                   <w:rPr>
                     <w:rFonts w:ascii="Times New Roman" w:cs="Times New Roman" w:eastAsia="Times New Roman" w:hAnsi="Times New Roman"/>
                     <w:sz w:val="26"/>
@@ -2359,7 +2302,7 @@
                   <w:shd w:fill="auto" w:val="clear"/>
                   <w:spacing w:after="0" w:before="0" w:line="240" w:lineRule="auto"/>
                   <w:ind w:left="0" w:right="0" w:firstLine="0"/>
-                  <w:jc w:val="left"/>
+                  <w:jc w:val="both"/>
                   <w:rPr>
                     <w:rFonts w:ascii="Times New Roman" w:cs="Times New Roman" w:eastAsia="Times New Roman" w:hAnsi="Times New Roman"/>
                     <w:sz w:val="26"/>
@@ -2404,7 +2347,7 @@
                   <w:shd w:fill="auto" w:val="clear"/>
                   <w:spacing w:after="0" w:before="0" w:line="240" w:lineRule="auto"/>
                   <w:ind w:left="0" w:right="0" w:firstLine="0"/>
-                  <w:jc w:val="left"/>
+                  <w:jc w:val="both"/>
                   <w:rPr>
                     <w:rFonts w:ascii="Times New Roman" w:cs="Times New Roman" w:eastAsia="Times New Roman" w:hAnsi="Times New Roman"/>
                     <w:sz w:val="26"/>
@@ -2455,7 +2398,7 @@
                   <w:shd w:fill="auto" w:val="clear"/>
                   <w:spacing w:after="0" w:before="0" w:line="240" w:lineRule="auto"/>
                   <w:ind w:left="0" w:right="0" w:firstLine="0"/>
-                  <w:jc w:val="left"/>
+                  <w:jc w:val="both"/>
                   <w:rPr>
                     <w:rFonts w:ascii="Times New Roman" w:cs="Times New Roman" w:eastAsia="Times New Roman" w:hAnsi="Times New Roman"/>
                     <w:sz w:val="26"/>
@@ -2500,7 +2443,7 @@
                   <w:shd w:fill="auto" w:val="clear"/>
                   <w:spacing w:after="0" w:before="0" w:line="240" w:lineRule="auto"/>
                   <w:ind w:left="0" w:right="0" w:firstLine="0"/>
-                  <w:jc w:val="left"/>
+                  <w:jc w:val="both"/>
                   <w:rPr>
                     <w:rFonts w:ascii="Times New Roman" w:cs="Times New Roman" w:eastAsia="Times New Roman" w:hAnsi="Times New Roman"/>
                     <w:sz w:val="26"/>
@@ -2545,7 +2488,7 @@
                   <w:shd w:fill="auto" w:val="clear"/>
                   <w:spacing w:after="0" w:before="0" w:line="240" w:lineRule="auto"/>
                   <w:ind w:left="0" w:right="0" w:firstLine="0"/>
-                  <w:jc w:val="left"/>
+                  <w:jc w:val="both"/>
                   <w:rPr>
                     <w:rFonts w:ascii="Times New Roman" w:cs="Times New Roman" w:eastAsia="Times New Roman" w:hAnsi="Times New Roman"/>
                     <w:sz w:val="26"/>
@@ -2559,7 +2502,21 @@
                     <w:szCs w:val="26"/>
                     <w:rtl w:val="0"/>
                   </w:rPr>
-                  <w:t xml:space="preserve">A person who installs and runs the mod on a world or server</w:t>
+                  <w:t xml:space="preserve">A person who installs and runs the mod on </w:t>
+                </w:r>
+                <w:r>
+                  <w:rPr>
+                    <w:rFonts w:ascii="Times New Roman" w:cs="Times New Roman" w:eastAsia="Times New Roman" w:hAnsi="Times New Roman"/>
+                    <w:sz w:val="26"/>
+                    <w:szCs w:val="26"/>
+                    <w:rtl w:val="0"/>
+                  </w:rPr>
+                  <w:t xml:space="preserve">a world/server</w:t>
+                </w:r>
+                <w:r>
+                  <w:rPr>
+                    <w:rtl w:val="0"/>
+                  </w:rPr>
                 </w:r>
               </w:p>
             </w:tc>
@@ -2590,7 +2547,7 @@
                   <w:shd w:fill="auto" w:val="clear"/>
                   <w:spacing w:after="0" w:before="0" w:line="240" w:lineRule="auto"/>
                   <w:ind w:left="0" w:right="0" w:firstLine="0"/>
-                  <w:jc w:val="left"/>
+                  <w:jc w:val="both"/>
                   <w:rPr>
                     <w:rFonts w:ascii="Times New Roman" w:cs="Times New Roman" w:eastAsia="Times New Roman" w:hAnsi="Times New Roman"/>
                     <w:sz w:val="26"/>
@@ -2663,7 +2620,7 @@
         </w:rPr>
         <w:drawing>
           <wp:inline distB="114300" distT="114300" distL="114300" distR="114300">
-            <wp:extent cx="5943600" cy="4165600"/>
+            <wp:extent cx="5943600" cy="4394200"/>
             <wp:effectExtent b="0" l="0" r="0" t="0"/>
             <wp:docPr id="1" name="image1.png"/>
             <a:graphic>
@@ -2674,7 +2631,7 @@
                     <pic:cNvPicPr preferRelativeResize="0"/>
                   </pic:nvPicPr>
                   <pic:blipFill>
-                    <a:blip r:embed="rId7"/>
+                    <a:blip r:embed="rId9"/>
                     <a:srcRect b="0" l="0" r="0" t="0"/>
                     <a:stretch>
                       <a:fillRect/>
@@ -2683,7 +2640,7 @@
                   <pic:spPr>
                     <a:xfrm>
                       <a:off x="0" y="0"/>
-                      <a:ext cx="5943600" cy="4165600"/>
+                      <a:ext cx="5943600" cy="4394200"/>
                     </a:xfrm>
                     <a:prstGeom prst="rect"/>
                     <a:ln/>
@@ -2975,8 +2932,6 @@
                 <w:rFonts w:ascii="Times New Roman" w:cs="Times New Roman" w:eastAsia="Times New Roman" w:hAnsi="Times New Roman"/>
                 <w:b w:val="0"/>
                 <w:bCs w:val="0"/>
-                <w:i w:val="1"/>
-                <w:iCs w:val="1"/>
                 <w:smallCaps w:val="0"/>
                 <w:strike w:val="0"/>
                 <w:sz w:val="26"/>
@@ -2991,8 +2946,6 @@
                 <w:rFonts w:ascii="Times New Roman" w:cs="Times New Roman" w:eastAsia="Times New Roman" w:hAnsi="Times New Roman"/>
                 <w:b w:val="0"/>
                 <w:bCs w:val="0"/>
-                <w:i w:val="1"/>
-                <w:iCs w:val="1"/>
                 <w:smallCaps w:val="0"/>
                 <w:strike w:val="0"/>
                 <w:sz w:val="26"/>
@@ -3029,8 +2982,6 @@
                 <w:rFonts w:ascii="Times New Roman" w:cs="Times New Roman" w:eastAsia="Times New Roman" w:hAnsi="Times New Roman"/>
                 <w:b w:val="0"/>
                 <w:bCs w:val="0"/>
-                <w:i w:val="1"/>
-                <w:iCs w:val="1"/>
                 <w:smallCaps w:val="0"/>
                 <w:strike w:val="0"/>
                 <w:sz w:val="26"/>
@@ -3045,8 +2996,6 @@
                 <w:rFonts w:ascii="Times New Roman" w:cs="Times New Roman" w:eastAsia="Times New Roman" w:hAnsi="Times New Roman"/>
                 <w:b w:val="0"/>
                 <w:bCs w:val="0"/>
-                <w:i w:val="1"/>
-                <w:iCs w:val="1"/>
                 <w:smallCaps w:val="0"/>
                 <w:strike w:val="0"/>
                 <w:sz w:val="26"/>
@@ -3083,8 +3032,6 @@
                 <w:rFonts w:ascii="Times New Roman" w:cs="Times New Roman" w:eastAsia="Times New Roman" w:hAnsi="Times New Roman"/>
                 <w:b w:val="0"/>
                 <w:bCs w:val="0"/>
-                <w:i w:val="1"/>
-                <w:iCs w:val="1"/>
                 <w:smallCaps w:val="0"/>
                 <w:strike w:val="0"/>
                 <w:sz w:val="26"/>
@@ -3099,8 +3046,6 @@
                 <w:rFonts w:ascii="Times New Roman" w:cs="Times New Roman" w:eastAsia="Times New Roman" w:hAnsi="Times New Roman"/>
                 <w:b w:val="0"/>
                 <w:bCs w:val="0"/>
-                <w:i w:val="1"/>
-                <w:iCs w:val="1"/>
                 <w:smallCaps w:val="0"/>
                 <w:strike w:val="0"/>
                 <w:sz w:val="26"/>
@@ -3137,8 +3082,6 @@
                 <w:rFonts w:ascii="Times New Roman" w:cs="Times New Roman" w:eastAsia="Times New Roman" w:hAnsi="Times New Roman"/>
                 <w:b w:val="0"/>
                 <w:bCs w:val="0"/>
-                <w:i w:val="1"/>
-                <w:iCs w:val="1"/>
                 <w:smallCaps w:val="0"/>
                 <w:strike w:val="0"/>
                 <w:sz w:val="26"/>
@@ -3153,8 +3096,6 @@
                 <w:rFonts w:ascii="Times New Roman" w:cs="Times New Roman" w:eastAsia="Times New Roman" w:hAnsi="Times New Roman"/>
                 <w:b w:val="0"/>
                 <w:bCs w:val="0"/>
-                <w:i w:val="1"/>
-                <w:iCs w:val="1"/>
                 <w:smallCaps w:val="0"/>
                 <w:strike w:val="0"/>
                 <w:sz w:val="26"/>
@@ -3197,8 +3138,6 @@
                 <w:rFonts w:ascii="Times New Roman" w:cs="Times New Roman" w:eastAsia="Times New Roman" w:hAnsi="Times New Roman"/>
                 <w:b w:val="0"/>
                 <w:bCs w:val="0"/>
-                <w:i w:val="1"/>
-                <w:iCs w:val="1"/>
                 <w:smallCaps w:val="0"/>
                 <w:strike w:val="0"/>
                 <w:sz w:val="26"/>
@@ -3213,8 +3152,6 @@
                 <w:rFonts w:ascii="Times New Roman" w:cs="Times New Roman" w:eastAsia="Times New Roman" w:hAnsi="Times New Roman"/>
                 <w:b w:val="0"/>
                 <w:bCs w:val="0"/>
-                <w:i w:val="1"/>
-                <w:iCs w:val="1"/>
                 <w:smallCaps w:val="0"/>
                 <w:strike w:val="0"/>
                 <w:sz w:val="26"/>
@@ -3251,8 +3188,6 @@
                 <w:rFonts w:ascii="Times New Roman" w:cs="Times New Roman" w:eastAsia="Times New Roman" w:hAnsi="Times New Roman"/>
                 <w:b w:val="0"/>
                 <w:bCs w:val="0"/>
-                <w:i w:val="1"/>
-                <w:iCs w:val="1"/>
                 <w:smallCaps w:val="0"/>
                 <w:strike w:val="0"/>
                 <w:sz w:val="26"/>
@@ -3265,8 +3200,6 @@
             <w:r>
               <w:rPr>
                 <w:rFonts w:ascii="Times New Roman" w:cs="Times New Roman" w:eastAsia="Times New Roman" w:hAnsi="Times New Roman"/>
-                <w:i w:val="1"/>
-                <w:iCs w:val="1"/>
                 <w:sz w:val="26"/>
                 <w:szCs w:val="26"/>
                 <w:rtl w:val="0"/>
@@ -3303,8 +3236,6 @@
                 <w:rFonts w:ascii="Times New Roman" w:cs="Times New Roman" w:eastAsia="Times New Roman" w:hAnsi="Times New Roman"/>
                 <w:b w:val="0"/>
                 <w:bCs w:val="0"/>
-                <w:i w:val="1"/>
-                <w:iCs w:val="1"/>
                 <w:smallCaps w:val="0"/>
                 <w:strike w:val="0"/>
                 <w:sz w:val="26"/>
@@ -3317,8 +3248,6 @@
             <w:r>
               <w:rPr>
                 <w:rFonts w:ascii="Times New Roman" w:cs="Times New Roman" w:eastAsia="Times New Roman" w:hAnsi="Times New Roman"/>
-                <w:i w:val="1"/>
-                <w:iCs w:val="1"/>
                 <w:sz w:val="26"/>
                 <w:szCs w:val="26"/>
                 <w:rtl w:val="0"/>
@@ -3355,8 +3284,6 @@
                 <w:rFonts w:ascii="Times New Roman" w:cs="Times New Roman" w:eastAsia="Times New Roman" w:hAnsi="Times New Roman"/>
                 <w:b w:val="0"/>
                 <w:bCs w:val="0"/>
-                <w:i w:val="1"/>
-                <w:iCs w:val="1"/>
                 <w:smallCaps w:val="0"/>
                 <w:strike w:val="0"/>
                 <w:sz w:val="26"/>
@@ -3369,8 +3296,6 @@
             <w:r>
               <w:rPr>
                 <w:rFonts w:ascii="Times New Roman" w:cs="Times New Roman" w:eastAsia="Times New Roman" w:hAnsi="Times New Roman"/>
-                <w:i w:val="1"/>
-                <w:iCs w:val="1"/>
                 <w:sz w:val="26"/>
                 <w:szCs w:val="26"/>
                 <w:rtl w:val="0"/>
@@ -3413,8 +3338,6 @@
                 <w:rFonts w:ascii="Times New Roman" w:cs="Times New Roman" w:eastAsia="Times New Roman" w:hAnsi="Times New Roman"/>
                 <w:b w:val="0"/>
                 <w:bCs w:val="0"/>
-                <w:i w:val="1"/>
-                <w:iCs w:val="1"/>
                 <w:smallCaps w:val="0"/>
                 <w:strike w:val="0"/>
                 <w:sz w:val="26"/>
@@ -3429,8 +3352,6 @@
                 <w:rFonts w:ascii="Times New Roman" w:cs="Times New Roman" w:eastAsia="Times New Roman" w:hAnsi="Times New Roman"/>
                 <w:b w:val="0"/>
                 <w:bCs w:val="0"/>
-                <w:i w:val="1"/>
-                <w:iCs w:val="1"/>
                 <w:smallCaps w:val="0"/>
                 <w:strike w:val="0"/>
                 <w:sz w:val="26"/>
@@ -3467,8 +3388,6 @@
                 <w:rFonts w:ascii="Times New Roman" w:cs="Times New Roman" w:eastAsia="Times New Roman" w:hAnsi="Times New Roman"/>
                 <w:b w:val="0"/>
                 <w:bCs w:val="0"/>
-                <w:i w:val="1"/>
-                <w:iCs w:val="1"/>
                 <w:smallCaps w:val="0"/>
                 <w:strike w:val="0"/>
                 <w:sz w:val="26"/>
@@ -3481,8 +3400,6 @@
             <w:r>
               <w:rPr>
                 <w:rFonts w:ascii="Times New Roman" w:cs="Times New Roman" w:eastAsia="Times New Roman" w:hAnsi="Times New Roman"/>
-                <w:i w:val="1"/>
-                <w:iCs w:val="1"/>
                 <w:sz w:val="26"/>
                 <w:szCs w:val="26"/>
                 <w:rtl w:val="0"/>
@@ -3519,8 +3436,6 @@
                 <w:rFonts w:ascii="Times New Roman" w:cs="Times New Roman" w:eastAsia="Times New Roman" w:hAnsi="Times New Roman"/>
                 <w:b w:val="0"/>
                 <w:bCs w:val="0"/>
-                <w:i w:val="1"/>
-                <w:iCs w:val="1"/>
                 <w:smallCaps w:val="0"/>
                 <w:strike w:val="0"/>
                 <w:sz w:val="26"/>
@@ -3533,8 +3448,6 @@
             <w:r>
               <w:rPr>
                 <w:rFonts w:ascii="Times New Roman" w:cs="Times New Roman" w:eastAsia="Times New Roman" w:hAnsi="Times New Roman"/>
-                <w:i w:val="1"/>
-                <w:iCs w:val="1"/>
                 <w:sz w:val="26"/>
                 <w:szCs w:val="26"/>
                 <w:rtl w:val="0"/>
@@ -3569,8 +3482,6 @@
               <w:jc w:val="both"/>
               <w:rPr>
                 <w:rFonts w:ascii="Times New Roman" w:cs="Times New Roman" w:eastAsia="Times New Roman" w:hAnsi="Times New Roman"/>
-                <w:i w:val="1"/>
-                <w:iCs w:val="1"/>
                 <w:sz w:val="26"/>
                 <w:szCs w:val="26"/>
               </w:rPr>
@@ -3578,8 +3489,6 @@
             <w:r>
               <w:rPr>
                 <w:rFonts w:ascii="Times New Roman" w:cs="Times New Roman" w:eastAsia="Times New Roman" w:hAnsi="Times New Roman"/>
-                <w:i w:val="1"/>
-                <w:iCs w:val="1"/>
                 <w:sz w:val="26"/>
                 <w:szCs w:val="26"/>
                 <w:rtl w:val="0"/>
@@ -3617,8 +3526,6 @@
                 <w:rFonts w:ascii="Times New Roman" w:cs="Times New Roman" w:eastAsia="Times New Roman" w:hAnsi="Times New Roman"/>
                 <w:b w:val="0"/>
                 <w:bCs w:val="0"/>
-                <w:i w:val="1"/>
-                <w:iCs w:val="1"/>
                 <w:smallCaps w:val="0"/>
                 <w:strike w:val="0"/>
                 <w:sz w:val="26"/>
@@ -3631,8 +3538,6 @@
             <w:r>
               <w:rPr>
                 <w:rFonts w:ascii="Times New Roman" w:cs="Times New Roman" w:eastAsia="Times New Roman" w:hAnsi="Times New Roman"/>
-                <w:i w:val="1"/>
-                <w:iCs w:val="1"/>
                 <w:sz w:val="26"/>
                 <w:szCs w:val="26"/>
                 <w:rtl w:val="0"/>
@@ -3667,8 +3572,6 @@
               <w:jc w:val="both"/>
               <w:rPr>
                 <w:rFonts w:ascii="Times New Roman" w:cs="Times New Roman" w:eastAsia="Times New Roman" w:hAnsi="Times New Roman"/>
-                <w:i w:val="1"/>
-                <w:iCs w:val="1"/>
                 <w:sz w:val="26"/>
                 <w:szCs w:val="26"/>
               </w:rPr>
@@ -3676,8 +3579,6 @@
             <w:r>
               <w:rPr>
                 <w:rFonts w:ascii="Times New Roman" w:cs="Times New Roman" w:eastAsia="Times New Roman" w:hAnsi="Times New Roman"/>
-                <w:i w:val="1"/>
-                <w:iCs w:val="1"/>
                 <w:sz w:val="26"/>
                 <w:szCs w:val="26"/>
                 <w:rtl w:val="0"/>
@@ -3709,8 +3610,6 @@
                 <w:rFonts w:ascii="Times New Roman" w:cs="Times New Roman" w:eastAsia="Times New Roman" w:hAnsi="Times New Roman"/>
                 <w:b w:val="0"/>
                 <w:bCs w:val="0"/>
-                <w:i w:val="1"/>
-                <w:iCs w:val="1"/>
                 <w:smallCaps w:val="0"/>
                 <w:strike w:val="0"/>
                 <w:sz w:val="26"/>
@@ -3723,8 +3622,6 @@
             <w:r>
               <w:rPr>
                 <w:rFonts w:ascii="Times New Roman" w:cs="Times New Roman" w:eastAsia="Times New Roman" w:hAnsi="Times New Roman"/>
-                <w:i w:val="1"/>
-                <w:iCs w:val="1"/>
                 <w:sz w:val="26"/>
                 <w:szCs w:val="26"/>
                 <w:rtl w:val="0"/>
@@ -3759,8 +3656,6 @@
               <w:jc w:val="both"/>
               <w:rPr>
                 <w:rFonts w:ascii="Times New Roman" w:cs="Times New Roman" w:eastAsia="Times New Roman" w:hAnsi="Times New Roman"/>
-                <w:i w:val="1"/>
-                <w:iCs w:val="1"/>
                 <w:sz w:val="26"/>
                 <w:szCs w:val="26"/>
               </w:rPr>
@@ -3768,8 +3663,6 @@
             <w:r>
               <w:rPr>
                 <w:rFonts w:ascii="Times New Roman" w:cs="Times New Roman" w:eastAsia="Times New Roman" w:hAnsi="Times New Roman"/>
-                <w:i w:val="1"/>
-                <w:iCs w:val="1"/>
                 <w:sz w:val="26"/>
                 <w:szCs w:val="26"/>
                 <w:rtl w:val="0"/>
@@ -3807,8 +3700,6 @@
                 <w:rFonts w:ascii="Times New Roman" w:cs="Times New Roman" w:eastAsia="Times New Roman" w:hAnsi="Times New Roman"/>
                 <w:b w:val="0"/>
                 <w:bCs w:val="0"/>
-                <w:i w:val="1"/>
-                <w:iCs w:val="1"/>
                 <w:smallCaps w:val="0"/>
                 <w:strike w:val="0"/>
                 <w:sz w:val="26"/>
@@ -3821,8 +3712,6 @@
             <w:r>
               <w:rPr>
                 <w:rFonts w:ascii="Times New Roman" w:cs="Times New Roman" w:eastAsia="Times New Roman" w:hAnsi="Times New Roman"/>
-                <w:i w:val="1"/>
-                <w:iCs w:val="1"/>
                 <w:sz w:val="26"/>
                 <w:szCs w:val="26"/>
                 <w:rtl w:val="0"/>
@@ -3857,8 +3746,6 @@
               <w:jc w:val="both"/>
               <w:rPr>
                 <w:rFonts w:ascii="Times New Roman" w:cs="Times New Roman" w:eastAsia="Times New Roman" w:hAnsi="Times New Roman"/>
-                <w:i w:val="1"/>
-                <w:iCs w:val="1"/>
                 <w:sz w:val="26"/>
                 <w:szCs w:val="26"/>
               </w:rPr>
@@ -3866,8 +3753,6 @@
             <w:r>
               <w:rPr>
                 <w:rFonts w:ascii="Times New Roman" w:cs="Times New Roman" w:eastAsia="Times New Roman" w:hAnsi="Times New Roman"/>
-                <w:i w:val="1"/>
-                <w:iCs w:val="1"/>
                 <w:sz w:val="26"/>
                 <w:szCs w:val="26"/>
                 <w:rtl w:val="0"/>
@@ -3899,8 +3784,6 @@
                 <w:rFonts w:ascii="Times New Roman" w:cs="Times New Roman" w:eastAsia="Times New Roman" w:hAnsi="Times New Roman"/>
                 <w:b w:val="0"/>
                 <w:bCs w:val="0"/>
-                <w:i w:val="1"/>
-                <w:iCs w:val="1"/>
                 <w:smallCaps w:val="0"/>
                 <w:strike w:val="0"/>
                 <w:sz w:val="26"/>
@@ -3913,8 +3796,6 @@
             <w:r>
               <w:rPr>
                 <w:rFonts w:ascii="Times New Roman" w:cs="Times New Roman" w:eastAsia="Times New Roman" w:hAnsi="Times New Roman"/>
-                <w:i w:val="1"/>
-                <w:iCs w:val="1"/>
                 <w:sz w:val="26"/>
                 <w:szCs w:val="26"/>
                 <w:rtl w:val="0"/>
@@ -3949,8 +3830,6 @@
               <w:jc w:val="both"/>
               <w:rPr>
                 <w:rFonts w:ascii="Times New Roman" w:cs="Times New Roman" w:eastAsia="Times New Roman" w:hAnsi="Times New Roman"/>
-                <w:i w:val="1"/>
-                <w:iCs w:val="1"/>
                 <w:sz w:val="26"/>
                 <w:szCs w:val="26"/>
               </w:rPr>
@@ -3958,8 +3837,6 @@
             <w:r>
               <w:rPr>
                 <w:rFonts w:ascii="Times New Roman" w:cs="Times New Roman" w:eastAsia="Times New Roman" w:hAnsi="Times New Roman"/>
-                <w:i w:val="1"/>
-                <w:iCs w:val="1"/>
                 <w:sz w:val="26"/>
                 <w:szCs w:val="26"/>
                 <w:rtl w:val="0"/>
@@ -3995,8 +3872,6 @@
               <w:jc w:val="both"/>
               <w:rPr>
                 <w:rFonts w:ascii="Times New Roman" w:cs="Times New Roman" w:eastAsia="Times New Roman" w:hAnsi="Times New Roman"/>
-                <w:i w:val="1"/>
-                <w:iCs w:val="1"/>
                 <w:sz w:val="26"/>
                 <w:szCs w:val="26"/>
               </w:rPr>
@@ -4004,8 +3879,6 @@
             <w:r>
               <w:rPr>
                 <w:rFonts w:ascii="Times New Roman" w:cs="Times New Roman" w:eastAsia="Times New Roman" w:hAnsi="Times New Roman"/>
-                <w:i w:val="1"/>
-                <w:iCs w:val="1"/>
                 <w:sz w:val="26"/>
                 <w:szCs w:val="26"/>
                 <w:rtl w:val="0"/>
@@ -4035,8 +3908,6 @@
               <w:jc w:val="both"/>
               <w:rPr>
                 <w:rFonts w:ascii="Times New Roman" w:cs="Times New Roman" w:eastAsia="Times New Roman" w:hAnsi="Times New Roman"/>
-                <w:i w:val="1"/>
-                <w:iCs w:val="1"/>
                 <w:sz w:val="26"/>
                 <w:szCs w:val="26"/>
               </w:rPr>
@@ -4044,8 +3915,6 @@
             <w:r>
               <w:rPr>
                 <w:rFonts w:ascii="Times New Roman" w:cs="Times New Roman" w:eastAsia="Times New Roman" w:hAnsi="Times New Roman"/>
-                <w:i w:val="1"/>
-                <w:iCs w:val="1"/>
                 <w:sz w:val="26"/>
                 <w:szCs w:val="26"/>
                 <w:rtl w:val="0"/>
@@ -4077,8 +3946,6 @@
                 <w:rFonts w:ascii="Times New Roman" w:cs="Times New Roman" w:eastAsia="Times New Roman" w:hAnsi="Times New Roman"/>
                 <w:b w:val="0"/>
                 <w:bCs w:val="0"/>
-                <w:i w:val="1"/>
-                <w:iCs w:val="1"/>
                 <w:smallCaps w:val="0"/>
                 <w:strike w:val="0"/>
                 <w:sz w:val="26"/>
@@ -4091,8 +3958,6 @@
             <w:r>
               <w:rPr>
                 <w:rFonts w:ascii="Times New Roman" w:cs="Times New Roman" w:eastAsia="Times New Roman" w:hAnsi="Times New Roman"/>
-                <w:i w:val="1"/>
-                <w:iCs w:val="1"/>
                 <w:sz w:val="26"/>
                 <w:szCs w:val="26"/>
                 <w:rtl w:val="0"/>
@@ -4127,8 +3992,6 @@
               <w:jc w:val="both"/>
               <w:rPr>
                 <w:rFonts w:ascii="Times New Roman" w:cs="Times New Roman" w:eastAsia="Times New Roman" w:hAnsi="Times New Roman"/>
-                <w:i w:val="1"/>
-                <w:iCs w:val="1"/>
                 <w:sz w:val="26"/>
                 <w:szCs w:val="26"/>
               </w:rPr>
@@ -4136,8 +3999,6 @@
             <w:r>
               <w:rPr>
                 <w:rFonts w:ascii="Times New Roman" w:cs="Times New Roman" w:eastAsia="Times New Roman" w:hAnsi="Times New Roman"/>
-                <w:i w:val="1"/>
-                <w:iCs w:val="1"/>
                 <w:sz w:val="26"/>
                 <w:szCs w:val="26"/>
                 <w:rtl w:val="0"/>
@@ -4173,8 +4034,6 @@
               <w:jc w:val="both"/>
               <w:rPr>
                 <w:rFonts w:ascii="Times New Roman" w:cs="Times New Roman" w:eastAsia="Times New Roman" w:hAnsi="Times New Roman"/>
-                <w:i w:val="1"/>
-                <w:iCs w:val="1"/>
                 <w:sz w:val="26"/>
                 <w:szCs w:val="26"/>
               </w:rPr>
@@ -4182,8 +4041,6 @@
             <w:r>
               <w:rPr>
                 <w:rFonts w:ascii="Times New Roman" w:cs="Times New Roman" w:eastAsia="Times New Roman" w:hAnsi="Times New Roman"/>
-                <w:i w:val="1"/>
-                <w:iCs w:val="1"/>
                 <w:sz w:val="26"/>
                 <w:szCs w:val="26"/>
                 <w:rtl w:val="0"/>
@@ -4200,8 +4057,6 @@
               <w:jc w:val="both"/>
               <w:rPr>
                 <w:rFonts w:ascii="Times New Roman" w:cs="Times New Roman" w:eastAsia="Times New Roman" w:hAnsi="Times New Roman"/>
-                <w:i w:val="1"/>
-                <w:iCs w:val="1"/>
                 <w:sz w:val="26"/>
                 <w:szCs w:val="26"/>
               </w:rPr>
@@ -4209,8 +4064,6 @@
             <w:r>
               <w:rPr>
                 <w:rFonts w:ascii="Times New Roman" w:cs="Times New Roman" w:eastAsia="Times New Roman" w:hAnsi="Times New Roman"/>
-                <w:i w:val="1"/>
-                <w:iCs w:val="1"/>
                 <w:sz w:val="26"/>
                 <w:szCs w:val="26"/>
                 <w:rtl w:val="0"/>
@@ -4242,8 +4095,6 @@
                 <w:rFonts w:ascii="Times New Roman" w:cs="Times New Roman" w:eastAsia="Times New Roman" w:hAnsi="Times New Roman"/>
                 <w:b w:val="0"/>
                 <w:bCs w:val="0"/>
-                <w:i w:val="1"/>
-                <w:iCs w:val="1"/>
                 <w:smallCaps w:val="0"/>
                 <w:strike w:val="0"/>
                 <w:sz w:val="26"/>
@@ -4256,8 +4107,6 @@
             <w:r>
               <w:rPr>
                 <w:rFonts w:ascii="Times New Roman" w:cs="Times New Roman" w:eastAsia="Times New Roman" w:hAnsi="Times New Roman"/>
-                <w:i w:val="1"/>
-                <w:iCs w:val="1"/>
                 <w:sz w:val="26"/>
                 <w:szCs w:val="26"/>
                 <w:rtl w:val="0"/>
@@ -4292,8 +4141,6 @@
               <w:jc w:val="both"/>
               <w:rPr>
                 <w:rFonts w:ascii="Times New Roman" w:cs="Times New Roman" w:eastAsia="Times New Roman" w:hAnsi="Times New Roman"/>
-                <w:i w:val="1"/>
-                <w:iCs w:val="1"/>
                 <w:sz w:val="26"/>
                 <w:szCs w:val="26"/>
               </w:rPr>
@@ -4301,8 +4148,6 @@
             <w:r>
               <w:rPr>
                 <w:rFonts w:ascii="Times New Roman" w:cs="Times New Roman" w:eastAsia="Times New Roman" w:hAnsi="Times New Roman"/>
-                <w:i w:val="1"/>
-                <w:iCs w:val="1"/>
                 <w:sz w:val="26"/>
                 <w:szCs w:val="26"/>
                 <w:rtl w:val="0"/>
@@ -4466,6 +4311,15 @@
           <w:vertAlign w:val="baseline"/>
         </w:rPr>
       </w:pPr>
+      <w:sdt>
+        <w:sdtPr>
+          <w:id w:val="87434"/>
+          <w:tag w:val="goog_rdk_1"/>
+        </w:sdtPr>
+        <w:sdtContent>
+          <w:commentRangeStart w:id="0"/>
+        </w:sdtContent>
+      </w:sdt>
       <w:r>
         <w:rPr>
           <w:rFonts w:ascii="Times New Roman" w:cs="Times New Roman" w:eastAsia="Times New Roman" w:hAnsi="Times New Roman"/>
@@ -4483,6 +4337,10 @@
           <w:rtl w:val="0"/>
         </w:rPr>
         <w:t xml:space="preserve">Classes</w:t>
+      </w:r>
+      <w:commentRangeEnd w:id="0"/>
+      <w:r>
+        <w:commentReference w:id="0"/>
       </w:r>
       <w:r>
         <w:rPr>
@@ -4610,31 +4468,6 @@
         </w:rPr>
         <w:t xml:space="preserve">Abstraction: other code uses methods such as equip or attack without knowing how the effects or damage are calculated.</w:t>
       </w:r>
-    </w:p>
-    <w:p>
-      <w:pPr>
-        <w:keepNext w:val="0"/>
-        <w:keepLines w:val="0"/>
-        <w:pageBreakBefore w:val="0"/>
-        <w:widowControl w:val="1"/>
-        <w:pBdr>
-          <w:top w:space="0" w:sz="0" w:val="nil"/>
-          <w:left w:space="0" w:sz="0" w:val="nil"/>
-          <w:bottom w:space="0" w:sz="0" w:val="nil"/>
-          <w:right w:space="0" w:sz="0" w:val="nil"/>
-          <w:between w:space="0" w:sz="0" w:val="nil"/>
-        </w:pBdr>
-        <w:shd w:fill="auto" w:val="clear"/>
-        <w:spacing w:after="0" w:before="0" w:line="240" w:lineRule="auto"/>
-        <w:ind w:right="0"/>
-        <w:jc w:val="both"/>
-        <w:rPr>
-          <w:rFonts w:ascii="Times New Roman" w:cs="Times New Roman" w:eastAsia="Times New Roman" w:hAnsi="Times New Roman"/>
-          <w:color w:val="ff0000"/>
-          <w:sz w:val="26"/>
-          <w:szCs w:val="26"/>
-        </w:rPr>
-      </w:pPr>
       <w:r>
         <w:rPr>
           <w:rtl w:val="0"/>
@@ -4712,7 +4545,7 @@
         <w:shd w:fill="auto" w:val="clear"/>
         <w:spacing w:after="0" w:before="0" w:line="259" w:lineRule="auto"/>
         <w:ind w:left="1440" w:right="0" w:hanging="360"/>
-        <w:jc w:val="left"/>
+        <w:jc w:val="both"/>
         <w:rPr>
           <w:b w:val="0"/>
           <w:bCs w:val="0"/>
@@ -16053,7 +15886,7 @@
         </w:rPr>
         <w:t xml:space="preserve">Programming with Mosh. (2019, July 15). Java full course for beginners. </w:t>
       </w:r>
-      <w:hyperlink r:id="rId8">
+      <w:hyperlink r:id="rId10">
         <w:r>
           <w:rPr>
             <w:rFonts w:ascii="Times New Roman" w:cs="Times New Roman" w:eastAsia="Times New Roman" w:hAnsi="Times New Roman"/>
@@ -16119,7 +15952,7 @@
         <w:t xml:space="preserve">New Java introduction for minecraft modding (2023). (n.d.).</w:t>
         <w:br w:type="textWrapping"/>
       </w:r>
-      <w:hyperlink r:id="rId9">
+      <w:hyperlink r:id="rId11">
         <w:r>
           <w:rPr>
             <w:rFonts w:ascii="Times New Roman" w:cs="Times New Roman" w:eastAsia="Times New Roman" w:hAnsi="Times New Roman"/>
@@ -16179,7 +16012,7 @@
         </w:rPr>
         <w:t xml:space="preserve">ChaosMC. (2026, March 8). How to make minecraft mods in 2026! </w:t>
       </w:r>
-      <w:hyperlink r:id="rId10">
+      <w:hyperlink r:id="rId12">
         <w:r>
           <w:rPr>
             <w:rFonts w:ascii="Times New Roman" w:cs="Times New Roman" w:eastAsia="Times New Roman" w:hAnsi="Times New Roman"/>
@@ -16235,7 +16068,7 @@
         </w:rPr>
         <w:t xml:space="preserve">ChaosMC. (2026, June 24). All the Java you need for Minecraft Modding. </w:t>
       </w:r>
-      <w:hyperlink r:id="rId11">
+      <w:hyperlink r:id="rId13">
         <w:r>
           <w:rPr>
             <w:rFonts w:ascii="Times New Roman" w:cs="Times New Roman" w:eastAsia="Times New Roman" w:hAnsi="Times New Roman"/>
@@ -16291,7 +16124,7 @@
         </w:rPr>
         <w:t xml:space="preserve">Quackleb. (2025, May 25). 5 Minecraft Datapack Tips you NEED to know! </w:t>
       </w:r>
-      <w:hyperlink r:id="rId12">
+      <w:hyperlink r:id="rId14">
         <w:r>
           <w:rPr>
             <w:rFonts w:ascii="Times New Roman" w:cs="Times New Roman" w:eastAsia="Times New Roman" w:hAnsi="Times New Roman"/>
@@ -16348,7 +16181,7 @@
         <w:t xml:space="preserve">Colebot. (2025, May 17). Beginner to Advanced Dimensions &amp; Terrain  Gen - Minecraft  Datapack Tutorial.</w:t>
         <w:br w:type="textWrapping"/>
       </w:r>
-      <w:hyperlink r:id="rId13">
+      <w:hyperlink r:id="rId15">
         <w:r>
           <w:rPr>
             <w:rFonts w:ascii="Times New Roman" w:cs="Times New Roman" w:eastAsia="Times New Roman" w:hAnsi="Times New Roman"/>
@@ -16405,7 +16238,7 @@
         <w:t xml:space="preserve">Minecraft Wiki. (2026, Sep 15). Tutorial:Adding a new dimension.</w:t>
         <w:br w:type="textWrapping"/>
       </w:r>
-      <w:hyperlink r:id="rId14">
+      <w:hyperlink r:id="rId16">
         <w:r>
           <w:rPr>
             <w:rFonts w:ascii="Times New Roman" w:cs="Times New Roman" w:eastAsia="Times New Roman" w:hAnsi="Times New Roman"/>
@@ -16461,7 +16294,7 @@
         <w:t xml:space="preserve">Fabric Wiki. (2026, Sep 03). Fabric Modding Tutorials.</w:t>
         <w:br w:type="textWrapping"/>
       </w:r>
-      <w:hyperlink r:id="rId15">
+      <w:hyperlink r:id="rId17">
         <w:r>
           <w:rPr>
             <w:rFonts w:ascii="Times New Roman" w:cs="Times New Roman" w:eastAsia="Times New Roman" w:hAnsi="Times New Roman"/>
@@ -16778,8 +16611,8 @@
       </w:r>
     </w:p>
     <w:sectPr>
-      <w:headerReference r:id="rId16" w:type="default"/>
-      <w:footerReference r:id="rId17" w:type="default"/>
+      <w:headerReference r:id="rId18" w:type="default"/>
+      <w:footerReference r:id="rId19" w:type="default"/>
       <w:pgSz w:h="15840" w:w="12240" w:orient="portrait"/>
       <w:pgMar w:bottom="2340" w:top="1890" w:left="1440" w:right="1440" w:header="720" w:footer="720"/>
       <w:pgNumType w:start="1"/>
@@ -16787,6 +16620,72 @@
     </w:sectPr>
   </w:body>
 </w:document>
+</file>
+
+<file path=word/comments.xml><?xml version="1.0" encoding="utf-8"?>
+<w:comments xmlns:mc="http://schemas.openxmlformats.org/markup-compatibility/2006" xmlns:o="urn:schemas-microsoft-com:office:office" xmlns:r="http://schemas.openxmlformats.org/officeDocument/2006/relationships" xmlns:m="http://schemas.openxmlformats.org/officeDocument/2006/math" xmlns:v="urn:schemas-microsoft-com:vml" xmlns:wp="http://schemas.openxmlformats.org/drawingml/2006/wordprocessingDrawing" xmlns:w10="urn:schemas-microsoft-com:office:word" xmlns:w="http://schemas.openxmlformats.org/wordprocessingml/2006/main" xmlns:wne="http://schemas.microsoft.com/office/word/2006/wordml" xmlns:sl="http://schemas.openxmlformats.org/schemaLibrary/2006/main" xmlns:a="http://schemas.openxmlformats.org/drawingml/2006/main" xmlns:pic="http://schemas.openxmlformats.org/drawingml/2006/picture" xmlns:c="http://schemas.openxmlformats.org/drawingml/2006/chart" xmlns:lc="http://schemas.openxmlformats.org/drawingml/2006/lockedCanvas" xmlns:dgm="http://schemas.openxmlformats.org/drawingml/2006/diagram" xmlns:wps="http://schemas.microsoft.com/office/word/2010/wordprocessingShape" xmlns:wpg="http://schemas.microsoft.com/office/word/2010/wordprocessingGroup" xmlns:w14="http://schemas.microsoft.com/office/word/2010/wordml" xmlns:w15="http://schemas.microsoft.com/office/word/2012/wordml" xmlns:w16="http://schemas.microsoft.com/office/word/2018/wordml" xmlns:w16cex="http://schemas.microsoft.com/office/word/2018/wordml/cex" xmlns:w16cid="http://schemas.microsoft.com/office/word/2016/wordml/cid" xmlns="http://schemas.microsoft.com/office/tasks/2019/documenttasks" xmlns:cr="http://schemas.microsoft.com/office/comments/2020/reactions">
+  <w:comment w:author="Hazarral H" w:id="0" w:date="2026-10-17T14:40:06Z">
+    <w:p>
+      <w:pPr>
+        <w:keepNext w:val="0"/>
+        <w:keepLines w:val="0"/>
+        <w:pageBreakBefore w:val="0"/>
+        <w:widowControl w:val="0"/>
+        <w:pBdr>
+          <w:top w:space="0" w:sz="0" w:val="nil"/>
+          <w:left w:space="0" w:sz="0" w:val="nil"/>
+          <w:bottom w:space="0" w:sz="0" w:val="nil"/>
+          <w:right w:space="0" w:sz="0" w:val="nil"/>
+          <w:between w:space="0" w:sz="0" w:val="nil"/>
+        </w:pBdr>
+        <w:shd w:fill="auto" w:val="clear"/>
+        <w:spacing w:after="0" w:before="0" w:line="240" w:lineRule="auto"/>
+        <w:ind w:left="0" w:right="0" w:firstLine="0"/>
+        <w:jc w:val="left"/>
+        <w:rPr>
+          <w:rFonts w:ascii="Arial" w:cs="Arial" w:eastAsia="Arial" w:hAnsi="Arial"/>
+          <w:b w:val="0"/>
+          <w:bCs w:val="0"/>
+          <w:i w:val="0"/>
+          <w:iCs w:val="0"/>
+          <w:smallCaps w:val="0"/>
+          <w:strike w:val="0"/>
+          <w:color w:val="000000"/>
+          <w:sz w:val="22"/>
+          <w:szCs w:val="22"/>
+          <w:u w:val="none"/>
+          <w:shd w:fill="auto" w:val="clear"/>
+          <w:vertAlign w:val="baseline"/>
+        </w:rPr>
+      </w:pPr>
+      <w:r>
+        <w:rPr>
+          <w:rFonts w:ascii="Arial" w:cs="Arial" w:eastAsia="Arial" w:hAnsi="Arial"/>
+          <w:b w:val="0"/>
+          <w:bCs w:val="0"/>
+          <w:i w:val="0"/>
+          <w:iCs w:val="0"/>
+          <w:smallCaps w:val="0"/>
+          <w:strike w:val="0"/>
+          <w:color w:val="000000"/>
+          <w:sz w:val="22"/>
+          <w:szCs w:val="22"/>
+          <w:u w:val="none"/>
+          <w:shd w:fill="auto" w:val="clear"/>
+          <w:vertAlign w:val="baseline"/>
+          <w:rtl w:val="0"/>
+        </w:rPr>
+        <w:t xml:space="preserve">should specify the nature of the mod. Modding is mostly reusing existing code, we should be clear that this is the base game's functionality and fabric API gives a way to work with it</w:t>
+      </w:r>
+    </w:p>
+  </w:comment>
+</w:comments>
+</file>
+
+<file path=word/commentsExtended.xml><?xml version="1.0" encoding="utf-8"?>
+<w15:commentsEx xmlns:mc="http://schemas.openxmlformats.org/markup-compatibility/2006" xmlns:o="urn:schemas-microsoft-com:office:office" xmlns:r="http://schemas.openxmlformats.org/officeDocument/2006/relationships" xmlns:m="http://schemas.openxmlformats.org/officeDocument/2006/math" xmlns:v="urn:schemas-microsoft-com:vml" xmlns:wp="http://schemas.openxmlformats.org/drawingml/2006/wordprocessingDrawing" xmlns:w10="urn:schemas-microsoft-com:office:word" xmlns:w="http://schemas.openxmlformats.org/wordprocessingml/2006/main" xmlns:wne="http://schemas.microsoft.com/office/word/2006/wordml" xmlns:sl="http://schemas.openxmlformats.org/schemaLibrary/2006/main" xmlns:a="http://schemas.openxmlformats.org/drawingml/2006/main" xmlns:pic="http://schemas.openxmlformats.org/drawingml/2006/picture" xmlns:c="http://schemas.openxmlformats.org/drawingml/2006/chart" xmlns:lc="http://schemas.openxmlformats.org/drawingml/2006/lockedCanvas" xmlns:dgm="http://schemas.openxmlformats.org/drawingml/2006/diagram" xmlns:wps="http://schemas.microsoft.com/office/word/2010/wordprocessingShape" xmlns:wpg="http://schemas.microsoft.com/office/word/2010/wordprocessingGroup" xmlns:w14="http://schemas.microsoft.com/office/word/2010/wordml" xmlns:w15="http://schemas.microsoft.com/office/word/2012/wordml" xmlns:w16="http://schemas.microsoft.com/office/word/2018/wordml" xmlns:w16cex="http://schemas.microsoft.com/office/word/2018/wordml/cex" xmlns:w16cid="http://schemas.microsoft.com/office/word/2016/wordml/cid" xmlns="http://schemas.microsoft.com/office/tasks/2019/documenttasks" xmlns:cr="http://schemas.microsoft.com/office/comments/2020/reactions">
+  <w15:commentEx w15:paraId="00000192" w15:done="0"/>
+</w15:commentsEx>
 </file>
 
 <file path=word/footer1.xml><?xml version="1.0" encoding="utf-8"?>
@@ -17195,13 +17094,6 @@
         <w:rtl w:val="0"/>
       </w:rPr>
       <w:t xml:space="preserve">Computer Science Program</w:t>
-      <w:tab/>
-      <w:tab/>
-      <w:tab/>
-      <w:tab/>
-      <w:tab/>
-      <w:tab/>
-      <w:tab/>
       <w:tab/>
       <w:tab/>
     </w:r>
@@ -19509,7 +19401,7 @@
 
 <file path=customXML/item1.xml><?xml version="1.0" encoding="utf-8"?>
 <go:gDocsCustomXmlDataStorage xmlns:go="http://customooxmlschemas.google.com/" xmlns:r="http://schemas.openxmlformats.org/officeDocument/2006/relationships" uri="GoogleDocsCustomDataVersion2">
-  <go:docsCustomData xmlns:go="http://customooxmlschemas.google.com/" roundtripDataSignature="AMtx7mik0XMtFHaX/Nd36bbYbhJkhZlTDw==">CgMxLjAaHgoBMBIZChcICVITChF0YWJsZS5yN2F6YW02amI1djgAciExNWEwSkhEX2VPbURPQVJ0TjNCNThvNXl1emdHZi10Qm4=</go:docsCustomData>
+  <go:docsCustomData xmlns:go="http://customooxmlschemas.google.com/" roundtripDataSignature="AMtx7mgyn0TK2ZbqkIgC5sy6LQ0ou43C2A==">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</go:docsCustomData>
 </go:gDocsCustomXmlDataStorage>
 </file>
 

</xml_diff>